<commit_message>
Say what the build produces, not what it is not
"Not a container image, so there is no registry to create and nothing to push"
answers a question only someone who saw the Docker version would ask. Replaced
with what the two zips actually hold.

Same for "you do not need Docker", which is now the useful half of that fact:
the build produces the same package on macOS, Windows or Linux.
</commit_message>
<xml_diff>
--- a/docs/northwind-hr-on-aws.docx
+++ b/docs/northwind-hr-on-aws.docx
@@ -12057,21 +12057,21 @@
         <w:rPr>
           <w:rFonts w:ascii="Courier New" w:hAnsi="Courier New" w:cs="Courier New"/>
         </w:rPr>
-        <w:t xml:space="preserve">            &lt;p&gt;Lambda runs a zip plus a shared layer, not a container image, so there is no</w:t>
-      </w:r>
-    </w:p>
-    <w:p>
-      <w:pPr>
-        <w:pStyle w:val="PlainText"/>
-        <w:rPr>
-          <w:rFonts w:ascii="Courier New" w:hAnsi="Courier New" w:cs="Courier New"/>
-        </w:rPr>
-      </w:pPr>
-      <w:r>
-        <w:rPr>
-          <w:rFonts w:ascii="Courier New" w:hAnsi="Courier New" w:cs="Courier New"/>
-        </w:rPr>
-        <w:t xml:space="preserve">            registry to create and nothing to push.&lt;/p&gt;</w:t>
+        <w:t xml:space="preserve">            &lt;p&gt;Two zips. One holds the libraries and all four functions share it. The other</w:t>
+      </w:r>
+    </w:p>
+    <w:p>
+      <w:pPr>
+        <w:pStyle w:val="PlainText"/>
+        <w:rPr>
+          <w:rFonts w:ascii="Courier New" w:hAnsi="Courier New" w:cs="Courier New"/>
+        </w:rPr>
+      </w:pPr>
+      <w:r>
+        <w:rPr>
+          <w:rFonts w:ascii="Courier New" w:hAnsi="Courier New" w:cs="Courier New"/>
+        </w:rPr>
+        <w:t xml:space="preserve">            holds the application code.&lt;/p&gt;</w:t>
       </w:r>
     </w:p>
     <w:p>
@@ -12099,13 +12099,13 @@
         <w:rPr>
           <w:rFonts w:ascii="Courier New" w:hAnsi="Courier New" w:cs="Courier New"/>
         </w:rPr>
-        <w:t>bash scripts/bui</w:t>
-      </w:r>
-      <w:r>
-        <w:rPr>
-          <w:rFonts w:ascii="Courier New" w:hAnsi="Courier New" w:cs="Courier New"/>
-        </w:rPr>
-        <w:t>ld-function.sh    &lt;span class="c"&gt;# build/function.zip  ~26 KB   our code&lt;/span&gt;&lt;/code&gt;&lt;/pre&gt;</w:t>
+        <w:t>bash scripts/build-function.</w:t>
+      </w:r>
+      <w:r>
+        <w:rPr>
+          <w:rFonts w:ascii="Courier New" w:hAnsi="Courier New" w:cs="Courier New"/>
+        </w:rPr>
+        <w:t>sh    &lt;span class="c"&gt;# build/function.zip  ~26 KB   our code&lt;/span&gt;&lt;/code&gt;&lt;/pre&gt;</w:t>
       </w:r>
     </w:p>
     <w:p>
@@ -12134,7 +12134,7 @@
         <w:rPr>
           <w:rFonts w:ascii="Courier New" w:hAnsi="Courier New" w:cs="Courier New"/>
         </w:rPr>
-        <w:t xml:space="preserve">            so you do not need Docker to build a Lambda package on Windows or macOS.&lt;/p&gt;</w:t>
+        <w:t xml:space="preserve">            so it produces the same package whether you run it on macOS, Windows or Linux.&lt;/p&gt;</w:t>
       </w:r>
     </w:p>
     <w:p>
@@ -12204,13 +12204,13 @@
         <w:rPr>
           <w:rFonts w:ascii="Courier New" w:hAnsi="Courier New" w:cs="Courier New"/>
         </w:rPr>
-        <w:t xml:space="preserve">          &lt;p class="expect"&gt;101 resources in 7 minutes 34 seconds on the run thes</w:t>
-      </w:r>
-      <w:r>
-        <w:rPr>
-          <w:rFonts w:ascii="Courier New" w:hAnsi="Courier New" w:cs="Courier New"/>
-        </w:rPr>
-        <w:t>e figures come from.&lt;/p&gt;</w:t>
+        <w:t xml:space="preserve">          &lt;p class="expect"&gt;101 resources in 7 minutes 34 seconds on the run these figu</w:t>
+      </w:r>
+      <w:r>
+        <w:rPr>
+          <w:rFonts w:ascii="Courier New" w:hAnsi="Courier New" w:cs="Courier New"/>
+        </w:rPr>
+        <w:t>res come from.&lt;/p&gt;</w:t>
       </w:r>
     </w:p>
     <w:p>
@@ -12350,13 +12350,13 @@
         <w:rPr>
           <w:rFonts w:ascii="Courier New" w:hAnsi="Courier New" w:cs="Courier New"/>
         </w:rPr>
-        <w:t xml:space="preserve">          &lt;p&gt;Poli</w:t>
-      </w:r>
-      <w:r>
-        <w:rPr>
-          <w:rFonts w:ascii="Courier New" w:hAnsi="Courier New" w:cs="Courier New"/>
-        </w:rPr>
-        <w:t>cy files first, the manifest last. The manifest upload starts ingestion.&lt;/p&gt;</w:t>
+        <w:t xml:space="preserve">          &lt;p&gt;Policy fil</w:t>
+      </w:r>
+      <w:r>
+        <w:rPr>
+          <w:rFonts w:ascii="Courier New" w:hAnsi="Courier New" w:cs="Courier New"/>
+        </w:rPr>
+        <w:t>es first, the manifest last. The manifest upload starts ingestion.&lt;/p&gt;</w:t>
       </w:r>
     </w:p>
     <w:p>
@@ -12426,13 +12426,13 @@
         <w:rPr>
           <w:rFonts w:ascii="Courier New" w:hAnsi="Courier New" w:cs="Courier New"/>
         </w:rPr>
-        <w:t xml:space="preserve">          &lt;p class="expect"&gt;Expect &lt;code&gt;50 documents, 328 chunks indexed&lt;/code&gt;. OpenSearch Serverless makes new documents searchable within about a </w:t>
-      </w:r>
-      <w:r>
-        <w:rPr>
-          <w:rFonts w:ascii="Courier New" w:hAnsi="Courier New" w:cs="Courier New"/>
-        </w:rPr>
-        <w:t>minute.&lt;/p&gt;</w:t>
+        <w:t xml:space="preserve">          &lt;p class="expect"&gt;Expect &lt;code&gt;50 documents, 328 chunks indexed&lt;/code&gt;. OpenSearch Serverless makes new documents searchable within about a minute</w:t>
+      </w:r>
+      <w:r>
+        <w:rPr>
+          <w:rFonts w:ascii="Courier New" w:hAnsi="Courier New" w:cs="Courier New"/>
+        </w:rPr>
+        <w:t>.&lt;/p&gt;</w:t>
       </w:r>
     </w:p>
     <w:p>
@@ -12628,13 +12628,13 @@
         <w:rPr>
           <w:rFonts w:ascii="Courier New" w:hAnsi="Courier New" w:cs="Courier New"/>
         </w:rPr>
-        <w:t xml:space="preserve">  </w:t>
-      </w:r>
-      <w:r>
-        <w:rPr>
-          <w:rFonts w:ascii="Courier New" w:hAnsi="Courier New" w:cs="Courier New"/>
-        </w:rPr>
-        <w:t xml:space="preserve">        &lt;h3&gt;Give the demo users a password&lt;/h3&gt;</w:t>
+        <w:t xml:space="preserve">        </w:t>
+      </w:r>
+      <w:r>
+        <w:rPr>
+          <w:rFonts w:ascii="Courier New" w:hAnsi="Courier New" w:cs="Courier New"/>
+        </w:rPr>
+        <w:t xml:space="preserve">  &lt;h3&gt;Give the demo users a password&lt;/h3&gt;</w:t>
       </w:r>
     </w:p>
     <w:p>
@@ -12761,13 +12761,13 @@
         <w:rPr>
           <w:rFonts w:ascii="Courier New" w:hAnsi="Courier New" w:cs="Courier New"/>
         </w:rPr>
-        <w:t xml:space="preserve">          &lt;h3&gt;</w:t>
-      </w:r>
-      <w:r>
-        <w:rPr>
-          <w:rFonts w:ascii="Courier New" w:hAnsi="Courier New" w:cs="Courier New"/>
-        </w:rPr>
-        <w:t>Open the app&lt;/h3&gt;</w:t>
+        <w:t xml:space="preserve">          &lt;h3&gt;Open t</w:t>
+      </w:r>
+      <w:r>
+        <w:rPr>
+          <w:rFonts w:ascii="Courier New" w:hAnsi="Courier New" w:cs="Courier New"/>
+        </w:rPr>
+        <w:t>he app&lt;/h3&gt;</w:t>
       </w:r>
     </w:p>
     <w:p>
@@ -12929,13 +12929,13 @@
         <w:rPr>
           <w:rFonts w:ascii="Courier New" w:hAnsi="Courier New" w:cs="Courier New"/>
         </w:rPr>
-        <w:t xml:space="preserve">        &lt;p&gt;Terraform just made about a hundred things. These are the scr</w:t>
-      </w:r>
-      <w:r>
-        <w:rPr>
-          <w:rFonts w:ascii="Courier New" w:hAnsi="Courier New" w:cs="Courier New"/>
-        </w:rPr>
-        <w:t>eens worth opening to see what they are, and every one of them is a question somebody will ask you at work. Every resource name starts with &lt;code&gt;northwind-hr&lt;/code&gt;, and every resource carries the tag &lt;code&gt;Project = northwind-hr&lt;/code&gt;.&lt;/p&gt;</w:t>
+        <w:t xml:space="preserve">        &lt;p&gt;Terraform just made about a hundred things. These are the screens w</w:t>
+      </w:r>
+      <w:r>
+        <w:rPr>
+          <w:rFonts w:ascii="Courier New" w:hAnsi="Courier New" w:cs="Courier New"/>
+        </w:rPr>
+        <w:t>orth opening to see what they are, and every one of them is a question somebody will ask you at work. Every resource name starts with &lt;code&gt;northwind-hr&lt;/code&gt;, and every resource carries the tag &lt;code&gt;Project = northwind-hr&lt;/code&gt;.&lt;/p&gt;</w:t>
       </w:r>
     </w:p>
     <w:p>
@@ -13033,13 +13033,13 @@
         <w:rPr>
           <w:rFonts w:ascii="Courier New" w:hAnsi="Courier New" w:cs="Courier New"/>
         </w:rPr>
-        <w:t xml:space="preserve">            &lt;li&gt;Bucket → &lt;stro</w:t>
-      </w:r>
-      <w:r>
-        <w:rPr>
-          <w:rFonts w:ascii="Courier New" w:hAnsi="Courier New" w:cs="Courier New"/>
-        </w:rPr>
-        <w:t>ng&gt;Properties&lt;/strong&gt; → Event notifications: the &lt;code&gt;manifest.json&lt;/code&gt; trigger&lt;/li&gt;</w:t>
+        <w:t xml:space="preserve">            &lt;li&gt;Bucket → &lt;strong&gt;Pro</w:t>
+      </w:r>
+      <w:r>
+        <w:rPr>
+          <w:rFonts w:ascii="Courier New" w:hAnsi="Courier New" w:cs="Courier New"/>
+        </w:rPr>
+        <w:t>perties&lt;/strong&gt; → Event notifications: the &lt;code&gt;manifest.json&lt;/code&gt; trigger&lt;/li&gt;</w:t>
       </w:r>
     </w:p>
     <w:p>
@@ -13151,13 +13151,13 @@
         <w:rPr>
           <w:rFonts w:ascii="Courier New" w:hAnsi="Courier New" w:cs="Courier New"/>
         </w:rPr>
-        <w:t xml:space="preserve">            &lt;li&gt;&lt;strong&gt;Configuration → Environment variables&lt;/strong&gt;: no passwords, only secret</w:t>
-      </w:r>
-      <w:r>
-        <w:rPr>
-          <w:rFonts w:ascii="Courier New" w:hAnsi="Courier New" w:cs="Courier New"/>
-        </w:rPr>
-        <w:t xml:space="preserve"> ARNs&lt;/li&gt;</w:t>
+        <w:t xml:space="preserve">            &lt;li&gt;&lt;strong&gt;Configuration → Environment variables&lt;/strong&gt;: no passwords, only secret ARNs&lt;</w:t>
+      </w:r>
+      <w:r>
+        <w:rPr>
+          <w:rFonts w:ascii="Courier New" w:hAnsi="Courier New" w:cs="Courier New"/>
+        </w:rPr>
+        <w:t>/li&gt;</w:t>
       </w:r>
     </w:p>
     <w:p>
@@ -13298,13 +13298,13 @@
         <w:rPr>
           <w:rFonts w:ascii="Courier New" w:hAnsi="Courier New" w:cs="Courier New"/>
         </w:rPr>
-        <w:t xml:space="preserve">   </w:t>
-      </w:r>
-      <w:r>
-        <w:rPr>
-          <w:rFonts w:ascii="Courier New" w:hAnsi="Courier New" w:cs="Courier New"/>
-        </w:rPr>
-        <w:t xml:space="preserve">         &lt;li&gt;Capacity: note the OCU usage, which drives the cost&lt;/li&gt;</w:t>
+        <w:t xml:space="preserve">         </w:t>
+      </w:r>
+      <w:r>
+        <w:rPr>
+          <w:rFonts w:ascii="Courier New" w:hAnsi="Courier New" w:cs="Courier New"/>
+        </w:rPr>
+        <w:t xml:space="preserve">   &lt;li&gt;Capacity: note the OCU usage, which drives the cost&lt;/li&gt;</w:t>
       </w:r>
     </w:p>
     <w:p>
@@ -13402,13 +13402,13 @@
         <w:rPr>
           <w:rFonts w:ascii="Courier New" w:hAnsi="Courier New" w:cs="Courier New"/>
         </w:rPr>
-        <w:t xml:space="preserve">            &lt;li&gt;&lt;strong&gt;Model catalog&lt;/strong&gt;: Nova Pro and Nova Lite enabled. Cross-region inference profiles (&lt;code</w:t>
-      </w:r>
-      <w:r>
-        <w:rPr>
-          <w:rFonts w:ascii="Courier New" w:hAnsi="Courier New" w:cs="Courier New"/>
-        </w:rPr>
-        <w:t>&gt;us.&lt;/code&gt;, &lt;code&gt;global.&lt;/code&gt;) are what you use for models with no on-demand capacity under their plain ID&lt;/li&gt;</w:t>
+        <w:t xml:space="preserve">            &lt;li&gt;&lt;strong&gt;Model catalog&lt;/strong&gt;: Nova Pro and Nova Lite enabled. Cross-region inference profiles (&lt;code&gt;us.&lt;/</w:t>
+      </w:r>
+      <w:r>
+        <w:rPr>
+          <w:rFonts w:ascii="Courier New" w:hAnsi="Courier New" w:cs="Courier New"/>
+        </w:rPr>
+        <w:t>code&gt;, &lt;code&gt;global.&lt;/code&gt;) are what you use for models with no on-demand capacity under their plain ID&lt;/li&gt;</w:t>
       </w:r>
     </w:p>
     <w:p>
@@ -13506,13 +13506,13 @@
         <w:rPr>
           <w:rFonts w:ascii="Courier New" w:hAnsi="Courier New" w:cs="Courier New"/>
         </w:rPr>
-        <w:t xml:space="preserve">            &lt;li&gt;&lt;strong&gt;Query editor&lt;/strong&gt; → connect with the admin Secrets Manager ARN, database &lt;code&gt;hr&lt;/code&gt;, then run &lt;code&gt;SELECT question, tools_used, latency_m</w:t>
-      </w:r>
-      <w:r>
-        <w:rPr>
-          <w:rFonts w:ascii="Courier New" w:hAnsi="Courier New" w:cs="Courier New"/>
-        </w:rPr>
-        <w:t>s FROM request_log ORDER BY id DESC LIMIT 20;&lt;/code&gt;&lt;/li&gt;</w:t>
+        <w:t xml:space="preserve">            &lt;li&gt;&lt;strong&gt;Query editor&lt;/strong&gt; → connect with the admin Secrets Manager ARN, database &lt;code&gt;hr&lt;/code&gt;, then run &lt;code&gt;SELECT question, tools_used, latency_ms FROM</w:t>
+      </w:r>
+      <w:r>
+        <w:rPr>
+          <w:rFonts w:ascii="Courier New" w:hAnsi="Courier New" w:cs="Courier New"/>
+        </w:rPr>
+        <w:t xml:space="preserve"> request_log ORDER BY id DESC LIMIT 20;&lt;/code&gt;&lt;/li&gt;</w:t>
       </w:r>
     </w:p>
     <w:p>
@@ -13638,13 +13638,13 @@
         <w:rPr>
           <w:rFonts w:ascii="Courier New" w:hAnsi="Courier New" w:cs="Courier New"/>
         </w:rPr>
-        <w:t xml:space="preserve">            &lt;li&gt;&lt;strong&gt;Social and external providers&lt;/strong</w:t>
-      </w:r>
-      <w:r>
-        <w:rPr>
-          <w:rFonts w:ascii="Courier New" w:hAnsi="Courier New" w:cs="Courier New"/>
-        </w:rPr>
-        <w:t>&gt;: where a company adds Okta or Entra ID&lt;/li&gt;</w:t>
+        <w:t xml:space="preserve">            &lt;li&gt;&lt;strong&gt;Social and external providers&lt;/strong&gt;: whe</w:t>
+      </w:r>
+      <w:r>
+        <w:rPr>
+          <w:rFonts w:ascii="Courier New" w:hAnsi="Courier New" w:cs="Courier New"/>
+        </w:rPr>
+        <w:t>re a company adds Okta or Entra ID&lt;/li&gt;</w:t>
       </w:r>
     </w:p>
     <w:p>
@@ -13799,13 +13799,7 @@
         <w:rPr>
           <w:rFonts w:ascii="Courier New" w:hAnsi="Courier New" w:cs="Courier New"/>
         </w:rPr>
-        <w:t xml:space="preserve">        &lt;div class="p</w:t>
-      </w:r>
-      <w:r>
-        <w:rPr>
-          <w:rFonts w:ascii="Courier New" w:hAnsi="Courier New" w:cs="Courier New"/>
-        </w:rPr>
-        <w:t>anel"&gt;</w:t>
+        <w:t xml:space="preserve">        &lt;div class="panel"&gt;</w:t>
       </w:r>
     </w:p>
     <w:p>
@@ -13959,13 +13953,13 @@
         <w:rPr>
           <w:rFonts w:ascii="Courier New" w:hAnsi="Courier New" w:cs="Courier New"/>
         </w:rPr>
-        <w:t xml:space="preserve">            &lt;li&gt;&lt;s</w:t>
-      </w:r>
-      <w:r>
-        <w:rPr>
-          <w:rFonts w:ascii="Courier New" w:hAnsi="Courier New" w:cs="Courier New"/>
-        </w:rPr>
-        <w:t>trong&gt;Alarms&lt;/strong&gt;: chat errors, ingest errors, API 5xx, slow answers&lt;/li&gt;</w:t>
+        <w:t xml:space="preserve">            &lt;li&gt;&lt;strong&gt;</w:t>
+      </w:r>
+      <w:r>
+        <w:rPr>
+          <w:rFonts w:ascii="Courier New" w:hAnsi="Courier New" w:cs="Courier New"/>
+        </w:rPr>
+        <w:t>Alarms&lt;/strong&gt;: chat errors, ingest errors, API 5xx, slow answers&lt;/li&gt;</w:t>
       </w:r>
     </w:p>
     <w:p>
@@ -14077,13 +14071,13 @@
         <w:rPr>
           <w:rFonts w:ascii="Courier New" w:hAnsi="Courier New" w:cs="Courier New"/>
         </w:rPr>
-        <w:t xml:space="preserve">            &lt;li&gt;VPC → &lt;strong&gt;Endpoints&lt;/strong&gt;: bedrock-runtime, secretsmanager, OpenSearch Serv</w:t>
-      </w:r>
-      <w:r>
-        <w:rPr>
-          <w:rFonts w:ascii="Courier New" w:hAnsi="Courier New" w:cs="Courier New"/>
-        </w:rPr>
-        <w:t>erless data, S3 gateway. No NAT gateway anywhere&lt;/li&gt;</w:t>
+        <w:t xml:space="preserve">            &lt;li&gt;VPC → &lt;strong&gt;Endpoints&lt;/strong&gt;: bedrock-runtime, secretsmanager, OpenSearch Serverless</w:t>
+      </w:r>
+      <w:r>
+        <w:rPr>
+          <w:rFonts w:ascii="Courier New" w:hAnsi="Courier New" w:cs="Courier New"/>
+        </w:rPr>
+        <w:t xml:space="preserve"> data, S3 gateway. No NAT gateway anywhere&lt;/li&gt;</w:t>
       </w:r>
     </w:p>
     <w:p>
@@ -14245,13 +14239,13 @@
         <w:rPr>
           <w:rFonts w:ascii="Courier New" w:hAnsi="Courier New" w:cs="Courier New"/>
         </w:rPr>
-        <w:t xml:space="preserve">        &lt;p&gt;Use the demo accounts table above. For each person, ask one question they should get answe</w:t>
-      </w:r>
-      <w:r>
-        <w:rPr>
-          <w:rFonts w:ascii="Courier New" w:hAnsi="Courier New" w:cs="Courier New"/>
-        </w:rPr>
-        <w:t>red and one they should be refused.&lt;/p&gt;</w:t>
+        <w:t xml:space="preserve">        &lt;p&gt;Use the demo accounts table above. For each person, ask one question they should get answered an</w:t>
+      </w:r>
+      <w:r>
+        <w:rPr>
+          <w:rFonts w:ascii="Courier New" w:hAnsi="Courier New" w:cs="Courier New"/>
+        </w:rPr>
+        <w:t>d one they should be refused.&lt;/p&gt;</w:t>
       </w:r>
     </w:p>
     <w:p>
@@ -14372,13 +14366,13 @@
           <w:rFonts w:ascii="Courier New" w:hAnsi="Courier New" w:cs="Courier New"/>
         </w:rPr>
         <w:lastRenderedPageBreak/>
-        <w:t xml:space="preserve">        &lt;p&gt;The log gives one line per ques</w:t>
-      </w:r>
-      <w:r>
-        <w:rPr>
-          <w:rFonts w:ascii="Courier New" w:hAnsi="Courier New" w:cs="Courier New"/>
-        </w:rPr>
-        <w:t>tion, and a failure names the fact that was missing</w:t>
+        <w:t xml:space="preserve">        &lt;p&gt;The log gives one line per question, </w:t>
+      </w:r>
+      <w:r>
+        <w:rPr>
+          <w:rFonts w:ascii="Courier New" w:hAnsi="Courier New" w:cs="Courier New"/>
+        </w:rPr>
+        <w:t>and a failure names the fact that was missing</w:t>
       </w:r>
     </w:p>
     <w:p>
@@ -14476,13 +14470,13 @@
         <w:rPr>
           <w:rFonts w:ascii="Courier New" w:hAnsi="Courier New" w:cs="Courier New"/>
         </w:rPr>
-        <w:t xml:space="preserve">        &lt;p&gt;Temperatur</w:t>
-      </w:r>
-      <w:r>
-        <w:rPr>
-          <w:rFonts w:ascii="Courier New" w:hAnsi="Courier New" w:cs="Courier New"/>
-        </w:rPr>
-        <w:t>e is set to 0 so two runs can be compared. A test that gives a different</w:t>
+        <w:t xml:space="preserve">        &lt;p&gt;Temperature is s</w:t>
+      </w:r>
+      <w:r>
+        <w:rPr>
+          <w:rFonts w:ascii="Courier New" w:hAnsi="Courier New" w:cs="Courier New"/>
+        </w:rPr>
+        <w:t>et to 0 so two runs can be compared. A test that gives a different</w:t>
       </w:r>
     </w:p>
     <w:p>
@@ -14574,13 +14568,13 @@
         <w:rPr>
           <w:rFonts w:ascii="Courier New" w:hAnsi="Courier New" w:cs="Courier New"/>
         </w:rPr>
-        <w:t xml:space="preserve">  --cli-binary-format raw-in-base64-out --payloa</w:t>
-      </w:r>
-      <w:r>
-        <w:rPr>
-          <w:rFonts w:ascii="Courier New" w:hAnsi="Courier New" w:cs="Courier New"/>
-        </w:rPr>
-        <w:t>d '{"similarity_report": true}' report.json</w:t>
+        <w:t xml:space="preserve">  --cli-binary-format raw-in-base64-out --payload '{"s</w:t>
+      </w:r>
+      <w:r>
+        <w:rPr>
+          <w:rFonts w:ascii="Courier New" w:hAnsi="Courier New" w:cs="Courier New"/>
+        </w:rPr>
+        <w:t>imilarity_report": true}' report.json</w:t>
       </w:r>
     </w:p>
     <w:p>
@@ -14692,13 +14686,13 @@
         <w:rPr>
           <w:rFonts w:ascii="Courier New" w:hAnsi="Courier New" w:cs="Courier New"/>
         </w:rPr>
-        <w:t xml:space="preserve">        &lt;p&gt;Set &lt;code&gt;min_best_similari</w:t>
-      </w:r>
-      <w:r>
-        <w:rPr>
-          <w:rFonts w:ascii="Courier New" w:hAnsi="Courier New" w:cs="Courier New"/>
-        </w:rPr>
-        <w:t>ty&lt;/code&gt; in &lt;code&gt;terraform.tfvars&lt;/code&gt; to a value</w:t>
+        <w:t xml:space="preserve">        &lt;p&gt;Set &lt;code&gt;min_best_similarity&lt;/co</w:t>
+      </w:r>
+      <w:r>
+        <w:rPr>
+          <w:rFonts w:ascii="Courier New" w:hAnsi="Courier New" w:cs="Courier New"/>
+        </w:rPr>
+        <w:t>de&gt; in &lt;code&gt;terraform.tfvars&lt;/code&gt; to a value</w:t>
       </w:r>
     </w:p>
     <w:p>
@@ -14790,27 +14784,27 @@
         <w:rPr>
           <w:rFonts w:ascii="Courier New" w:hAnsi="Courier New" w:cs="Courier New"/>
         </w:rPr>
-        <w:t xml:space="preserve">        &lt;h3&gt;One corpus check worth keeping&lt;/h3</w:t>
-      </w:r>
-      <w:r>
-        <w:rPr>
-          <w:rFonts w:ascii="Courier New" w:hAnsi="Courier New" w:cs="Courier New"/>
-        </w:rPr>
-        <w:t>&gt;</w:t>
-      </w:r>
-    </w:p>
-    <w:p>
-      <w:pPr>
-        <w:pStyle w:val="PlainText"/>
-        <w:rPr>
-          <w:rFonts w:ascii="Courier New" w:hAnsi="Courier New" w:cs="Courier New"/>
-        </w:rPr>
-      </w:pPr>
-      <w:r>
-        <w:rPr>
-          <w:rFonts w:ascii="Courier New" w:hAnsi="Courier New" w:cs="Courier New"/>
-        </w:rPr>
-        <w:t xml:space="preserve">        &lt;p&gt;Two current documents with the same title is not always wrong, but it always needs</w:t>
+        <w:t xml:space="preserve">        &lt;h3&gt;One corpus check worth keeping&lt;/h3&gt;</w:t>
+      </w:r>
+    </w:p>
+    <w:p>
+      <w:pPr>
+        <w:pStyle w:val="PlainText"/>
+        <w:rPr>
+          <w:rFonts w:ascii="Courier New" w:hAnsi="Courier New" w:cs="Courier New"/>
+        </w:rPr>
+      </w:pPr>
+      <w:r>
+        <w:rPr>
+          <w:rFonts w:ascii="Courier New" w:hAnsi="Courier New" w:cs="Courier New"/>
+        </w:rPr>
+        <w:t xml:space="preserve">    </w:t>
+      </w:r>
+      <w:r>
+        <w:rPr>
+          <w:rFonts w:ascii="Courier New" w:hAnsi="Courier New" w:cs="Courier New"/>
+        </w:rPr>
+        <w:t xml:space="preserve">    &lt;p&gt;Two current documents with the same title is not always wrong, but it always needs</w:t>
       </w:r>
     </w:p>
     <w:p>
@@ -14909,13 +14903,13 @@
         <w:rPr>
           <w:rFonts w:ascii="Courier New" w:hAnsi="Courier New" w:cs="Courier New"/>
         </w:rPr>
-        <w:t xml:space="preserve">        &lt;p&gt;Run it here and you get one pair, the ex</w:t>
-      </w:r>
-      <w:r>
-        <w:rPr>
-          <w:rFonts w:ascii="Courier New" w:hAnsi="Courier New" w:cs="Courier New"/>
-        </w:rPr>
-        <w:t>pense policy, where the two documents cover</w:t>
+        <w:t xml:space="preserve">        &lt;p&gt;Run it here and you get one pair, the expense </w:t>
+      </w:r>
+      <w:r>
+        <w:rPr>
+          <w:rFonts w:ascii="Courier New" w:hAnsi="Courier New" w:cs="Courier New"/>
+        </w:rPr>
+        <w:t>policy, where the two documents cover</w:t>
       </w:r>
     </w:p>
     <w:p>
@@ -15063,13 +15057,7 @@
         <w:rPr>
           <w:rFonts w:ascii="Courier New" w:hAnsi="Courier New" w:cs="Courier New"/>
         </w:rPr>
-        <w:t xml:space="preserve">        the account. None of that is the user's problem. Every model here speaks th</w:t>
-      </w:r>
-      <w:r>
-        <w:rPr>
-          <w:rFonts w:ascii="Courier New" w:hAnsi="Courier New" w:cs="Courier New"/>
-        </w:rPr>
-        <w:t>e same</w:t>
+        <w:t xml:space="preserve">        the account. None of that is the user's problem. Every model here speaks the same</w:t>
       </w:r>
     </w:p>
     <w:p>
@@ -15195,13 +15183,13 @@
         <w:rPr>
           <w:rFonts w:ascii="Courier New" w:hAnsi="Courier New" w:cs="Courier New"/>
         </w:rPr>
-        <w:t xml:space="preserve">            &lt;tr&gt;&lt;td&gt;&lt;code&gt;chat_model_id&lt;/code&gt;&lt;/td&gt;&lt;td&gt;&lt;code&gt;amazon.nova-pro-v1:0&lt;/code&gt;&lt;/td&gt;&lt;td&gt;Needs no access request. Point it at a Claude inference profile </w:t>
-      </w:r>
-      <w:r>
-        <w:rPr>
-          <w:rFonts w:ascii="Courier New" w:hAnsi="Courier New" w:cs="Courier New"/>
-        </w:rPr>
-        <w:t>once the use case form is approved&lt;/td&gt;&lt;/tr&gt;</w:t>
+        <w:t xml:space="preserve">            &lt;tr&gt;&lt;td&gt;&lt;code&gt;chat_model_id&lt;/code&gt;&lt;/td&gt;&lt;td&gt;&lt;code&gt;amazon.nova-pro-v1:0&lt;/code&gt;&lt;/td&gt;&lt;td&gt;Needs no access request. Point it at a Claude inference profile once t</w:t>
+      </w:r>
+      <w:r>
+        <w:rPr>
+          <w:rFonts w:ascii="Courier New" w:hAnsi="Courier New" w:cs="Courier New"/>
+        </w:rPr>
+        <w:t>he use case form is approved&lt;/td&gt;&lt;/tr&gt;</w:t>
       </w:r>
     </w:p>
     <w:p>
@@ -15299,27 +15287,27 @@
         <w:rPr>
           <w:rFonts w:ascii="Courier New" w:hAnsi="Courier New" w:cs="Courier New"/>
         </w:rPr>
-        <w:t xml:space="preserve">        &lt;p&gt;API Gateway gives up at 30 seconds and the chat function at 29, so that is th</w:t>
-      </w:r>
-      <w:r>
-        <w:rPr>
-          <w:rFonts w:ascii="Courier New" w:hAnsi="Courier New" w:cs="Courier New"/>
-        </w:rPr>
-        <w:t>e</w:t>
-      </w:r>
-    </w:p>
-    <w:p>
-      <w:pPr>
-        <w:pStyle w:val="PlainText"/>
-        <w:rPr>
-          <w:rFonts w:ascii="Courier New" w:hAnsi="Courier New" w:cs="Courier New"/>
-        </w:rPr>
-      </w:pPr>
-      <w:r>
-        <w:rPr>
-          <w:rFonts w:ascii="Courier New" w:hAnsi="Courier New" w:cs="Courier New"/>
-        </w:rPr>
-        <w:t xml:space="preserve">        whole budget including every tool call. Left on its defaults the AWS SDK retried a</w:t>
+        <w:t xml:space="preserve">        &lt;p&gt;API Gateway gives up at 30 seconds and the chat function at 29, so that is the</w:t>
+      </w:r>
+    </w:p>
+    <w:p>
+      <w:pPr>
+        <w:pStyle w:val="PlainText"/>
+        <w:rPr>
+          <w:rFonts w:ascii="Courier New" w:hAnsi="Courier New" w:cs="Courier New"/>
+        </w:rPr>
+      </w:pPr>
+      <w:r>
+        <w:rPr>
+          <w:rFonts w:ascii="Courier New" w:hAnsi="Courier New" w:cs="Courier New"/>
+        </w:rPr>
+        <w:t xml:space="preserve">    </w:t>
+      </w:r>
+      <w:r>
+        <w:rPr>
+          <w:rFonts w:ascii="Courier New" w:hAnsi="Courier New" w:cs="Courier New"/>
+        </w:rPr>
+        <w:t xml:space="preserve">    whole budget including every tool call. Left on its defaults the AWS SDK retried a</w:t>
       </w:r>
     </w:p>
     <w:p>
@@ -15404,13 +15392,13 @@
         <w:rPr>
           <w:rFonts w:ascii="Courier New" w:hAnsi="Courier New" w:cs="Courier New"/>
         </w:rPr>
-        <w:t xml:space="preserve">        in. Same test</w:t>
-      </w:r>
-      <w:r>
-        <w:rPr>
-          <w:rFonts w:ascii="Courier New" w:hAnsi="Courier New" w:cs="Courier New"/>
-        </w:rPr>
-        <w:t xml:space="preserve"> afterwards: &lt;strong&gt;6 seconds and a correct answer&lt;/strong&gt;, with a</w:t>
+        <w:t xml:space="preserve">        in. Same test after</w:t>
+      </w:r>
+      <w:r>
+        <w:rPr>
+          <w:rFonts w:ascii="Courier New" w:hAnsi="Courier New" w:cs="Courier New"/>
+        </w:rPr>
+        <w:t>wards: &lt;strong&gt;6 seconds and a correct answer&lt;/strong&gt;, with a</w:t>
       </w:r>
     </w:p>
     <w:p>
@@ -15572,13 +15560,13 @@
         <w:rPr>
           <w:rFonts w:ascii="Courier New" w:hAnsi="Courier New" w:cs="Courier New"/>
         </w:rPr>
-        <w:t xml:space="preserve">   </w:t>
-      </w:r>
-      <w:r>
-        <w:rPr>
-          <w:rFonts w:ascii="Courier New" w:hAnsi="Courier New" w:cs="Courier New"/>
-        </w:rPr>
-        <w:t xml:space="preserve">     &lt;p&gt;One per function, plus the API. Retention is 14 days, set in Terraform.&lt;/p&gt;</w:t>
+        <w:t xml:space="preserve">        &lt;</w:t>
+      </w:r>
+      <w:r>
+        <w:rPr>
+          <w:rFonts w:ascii="Courier New" w:hAnsi="Courier New" w:cs="Courier New"/>
+        </w:rPr>
+        <w:t>p&gt;One per function, plus the API. Retention is 14 days, set in Terraform.&lt;/p&gt;</w:t>
       </w:r>
     </w:p>
     <w:p>
@@ -15656,13 +15644,13 @@
         <w:rPr>
           <w:rFonts w:ascii="Courier New" w:hAnsi="Courier New" w:cs="Courier New"/>
         </w:rPr>
-        <w:t xml:space="preserve">        learn is &lt;code&gt;REPORT&lt;/code&gt; at the end of each invocation: it carries the du</w:t>
-      </w:r>
-      <w:r>
-        <w:rPr>
-          <w:rFonts w:ascii="Courier New" w:hAnsi="Courier New" w:cs="Courier New"/>
-        </w:rPr>
-        <w:t>ration,</w:t>
+        <w:t xml:space="preserve">        learn is &lt;code&gt;REPORT&lt;/code&gt; at the end of each invocation: it carries the duration</w:t>
+      </w:r>
+      <w:r>
+        <w:rPr>
+          <w:rFonts w:ascii="Courier New" w:hAnsi="Courier New" w:cs="Courier New"/>
+        </w:rPr>
+        <w:t>,</w:t>
       </w:r>
     </w:p>
     <w:p>
@@ -15760,13 +15748,13 @@
         <w:rPr>
           <w:rFonts w:ascii="Courier New" w:hAnsi="Courier New" w:cs="Courier New"/>
         </w:rPr>
-        <w:t xml:space="preserve">        &lt;pre&gt;&lt;code&gt;aws logs tail /aws/apiga</w:t>
-      </w:r>
-      <w:r>
-        <w:rPr>
-          <w:rFonts w:ascii="Courier New" w:hAnsi="Courier New" w:cs="Courier New"/>
-        </w:rPr>
-        <w:t>teway/northwind-hr-api --since 30m --format short&lt;/code&gt;&lt;/pre&gt;</w:t>
+        <w:t xml:space="preserve">        &lt;pre&gt;&lt;code&gt;aws logs tail /aws/apigateway/</w:t>
+      </w:r>
+      <w:r>
+        <w:rPr>
+          <w:rFonts w:ascii="Courier New" w:hAnsi="Courier New" w:cs="Courier New"/>
+        </w:rPr>
+        <w:t>northwind-hr-api --since 30m --format short&lt;/code&gt;&lt;/pre&gt;</w:t>
       </w:r>
     </w:p>
     <w:p>
@@ -15872,7 +15860,13 @@
         <w:rPr>
           <w:rFonts w:ascii="Courier New" w:hAnsi="Courier New" w:cs="Courier New"/>
         </w:rPr>
-        <w:t xml:space="preserve">          &lt;p&gt;The reason to declare them at all: &lt;strong&gt;if you do not, Lambda creates the log</w:t>
+        <w:t xml:space="preserve">     </w:t>
+      </w:r>
+      <w:r>
+        <w:rPr>
+          <w:rFonts w:ascii="Courier New" w:hAnsi="Courier New" w:cs="Courier New"/>
+        </w:rPr>
+        <w:t xml:space="preserve">     &lt;p&gt;The reason to declare them at all: &lt;strong&gt;if you do not, Lambda creates the log</w:t>
       </w:r>
     </w:p>
     <w:p>
@@ -15979,13 +15973,13 @@
         <w:rPr>
           <w:rFonts w:ascii="Courier New" w:hAnsi="Courier New" w:cs="Courier New"/>
         </w:rPr>
-        <w:t xml:space="preserve">        &lt;pre&gt;&lt;code&gt;aws cloudwatch list-metri</w:t>
-      </w:r>
-      <w:r>
-        <w:rPr>
-          <w:rFonts w:ascii="Courier New" w:hAnsi="Courier New" w:cs="Courier New"/>
-        </w:rPr>
-        <w:t>cs --namespace AWS/Bedrock \</w:t>
+        <w:t xml:space="preserve">        &lt;pre&gt;&lt;code&gt;aws cloudwatch list-metrics --n</w:t>
+      </w:r>
+      <w:r>
+        <w:rPr>
+          <w:rFonts w:ascii="Courier New" w:hAnsi="Courier New" w:cs="Courier New"/>
+        </w:rPr>
+        <w:t>amespace AWS/Bedrock \</w:t>
       </w:r>
     </w:p>
     <w:p>
@@ -16097,13 +16091,13 @@
         <w:rPr>
           <w:rFonts w:ascii="Courier New" w:hAnsi="Courier New" w:cs="Courier New"/>
         </w:rPr>
-        <w:t xml:space="preserve">      &lt;div class="</w:t>
-      </w:r>
-      <w:r>
-        <w:rPr>
-          <w:rFonts w:ascii="Courier New" w:hAnsi="Courier New" w:cs="Courier New"/>
-        </w:rPr>
-        <w:t>table-wrap"&gt;</w:t>
+        <w:t xml:space="preserve">      &lt;div class="table-</w:t>
+      </w:r>
+      <w:r>
+        <w:rPr>
+          <w:rFonts w:ascii="Courier New" w:hAnsi="Courier New" w:cs="Courier New"/>
+        </w:rPr>
+        <w:t>wrap"&gt;</w:t>
       </w:r>
     </w:p>
     <w:p>
@@ -16173,13 +16167,13 @@
         <w:rPr>
           <w:rFonts w:ascii="Courier New" w:hAnsi="Courier New" w:cs="Courier New"/>
         </w:rPr>
-        <w:t xml:space="preserve">            &lt;tr&gt;&lt;td&gt;Nova Lite (fallback)&lt;/td&gt;&lt;td class="num"&gt;9&lt;/td&gt;&lt;td class="num"&gt;5,388&lt;/td&gt;&lt;td class="num"&gt;395&lt;/td&gt;&lt;td class="num"&gt;502 ms&lt;/</w:t>
-      </w:r>
-      <w:r>
-        <w:rPr>
-          <w:rFonts w:ascii="Courier New" w:hAnsi="Courier New" w:cs="Courier New"/>
-        </w:rPr>
-        <w:t>td&gt;&lt;/tr&gt;</w:t>
+        <w:t xml:space="preserve">            &lt;tr&gt;&lt;td&gt;Nova Lite (fallback)&lt;/td&gt;&lt;td class="num"&gt;9&lt;/td&gt;&lt;td class="num"&gt;5,388&lt;/td&gt;&lt;td class="num"&gt;395&lt;/td&gt;&lt;td class="num"&gt;502 ms&lt;/td&gt;&lt;/t</w:t>
+      </w:r>
+      <w:r>
+        <w:rPr>
+          <w:rFonts w:ascii="Courier New" w:hAnsi="Courier New" w:cs="Courier New"/>
+        </w:rPr>
+        <w:t>r&gt;</w:t>
       </w:r>
     </w:p>
     <w:p>
@@ -16291,13 +16285,13 @@
         <w:rPr>
           <w:rFonts w:ascii="Courier New" w:hAnsi="Courier New" w:cs="Courier New"/>
         </w:rPr>
-        <w:t xml:space="preserve">        failed attempts are still there, record</w:t>
-      </w:r>
-      <w:r>
-        <w:rPr>
-          <w:rFonts w:ascii="Courier New" w:hAnsi="Courier New" w:cs="Courier New"/>
-        </w:rPr>
-        <w:t>ed as &lt;code&gt;InvocationClientErrors&lt;/code&gt; with no</w:t>
+        <w:t xml:space="preserve">        failed attempts are still there, recorded as </w:t>
+      </w:r>
+      <w:r>
+        <w:rPr>
+          <w:rFonts w:ascii="Courier New" w:hAnsi="Courier New" w:cs="Courier New"/>
+        </w:rPr>
+        <w:t>&lt;code&gt;InvocationClientErrors&lt;/code&gt; with no</w:t>
       </w:r>
     </w:p>
     <w:p>
@@ -16404,13 +16398,13 @@
         <w:rPr>
           <w:rFonts w:ascii="Courier New" w:hAnsi="Courier New" w:cs="Courier New"/>
         </w:rPr>
-        <w:t xml:space="preserve">       </w:t>
-      </w:r>
-      <w:r>
-        <w:rPr>
-          <w:rFonts w:ascii="Courier New" w:hAnsi="Courier New" w:cs="Courier New"/>
-        </w:rPr>
-        <w:t xml:space="preserve"> $0.0009. &lt;strong&gt;The whole lab cost about 14 cents in model usage.&lt;/strong&gt; That is</w:t>
+        <w:t xml:space="preserve">        $0.00</w:t>
+      </w:r>
+      <w:r>
+        <w:rPr>
+          <w:rFonts w:ascii="Courier New" w:hAnsi="Courier New" w:cs="Courier New"/>
+        </w:rPr>
+        <w:t>09. &lt;strong&gt;The whole lab cost about 14 cents in model usage.&lt;/strong&gt; That is</w:t>
       </w:r>
     </w:p>
     <w:p>
@@ -16508,13 +16502,13 @@
         <w:rPr>
           <w:rFonts w:ascii="Courier New" w:hAnsi="Courier New" w:cs="Courier New"/>
         </w:rPr>
-        <w:t xml:space="preserve">          chunks instead of 4 dou</w:t>
-      </w:r>
-      <w:r>
-        <w:rPr>
-          <w:rFonts w:ascii="Courier New" w:hAnsi="Courier New" w:cs="Courier New"/>
-        </w:rPr>
-        <w:t>bles the cost and often does not improve the answer.&lt;/li&gt;</w:t>
+        <w:t xml:space="preserve">          chunks instead of 4 doubles t</w:t>
+      </w:r>
+      <w:r>
+        <w:rPr>
+          <w:rFonts w:ascii="Courier New" w:hAnsi="Courier New" w:cs="Courier New"/>
+        </w:rPr>
+        <w:t>he cost and often does not improve the answer.&lt;/li&gt;</w:t>
       </w:r>
     </w:p>
     <w:p>
@@ -16620,13 +16614,13 @@
         <w:rPr>
           <w:rFonts w:ascii="Courier New" w:hAnsi="Courier New" w:cs="Courier New"/>
         </w:rPr>
-        <w:t xml:space="preserve">        &lt;h3&gt;What CloudWatch c</w:t>
-      </w:r>
-      <w:r>
-        <w:rPr>
-          <w:rFonts w:ascii="Courier New" w:hAnsi="Courier New" w:cs="Courier New"/>
-        </w:rPr>
-        <w:t>annot tell you&lt;/h3&gt;</w:t>
+        <w:t xml:space="preserve">        &lt;h3&gt;What CloudWatch cannot </w:t>
+      </w:r>
+      <w:r>
+        <w:rPr>
+          <w:rFonts w:ascii="Courier New" w:hAnsi="Courier New" w:cs="Courier New"/>
+        </w:rPr>
+        <w:t>tell you&lt;/h3&gt;</w:t>
       </w:r>
     </w:p>
     <w:p>
@@ -16724,13 +16718,13 @@
         <w:rPr>
           <w:rFonts w:ascii="Courier New" w:hAnsi="Courier New" w:cs="Courier New"/>
         </w:rPr>
-        <w:t xml:space="preserve">        &lt;p&gt;&lt;strong&gt;Your platform </w:t>
-      </w:r>
-      <w:r>
-        <w:rPr>
-          <w:rFonts w:ascii="Courier New" w:hAnsi="Courier New" w:cs="Courier New"/>
-        </w:rPr>
-        <w:t>gives you infrastructure metrics. Product metrics you have</w:t>
+        <w:t xml:space="preserve">        &lt;p&gt;&lt;strong&gt;Your platform gives </w:t>
+      </w:r>
+      <w:r>
+        <w:rPr>
+          <w:rFonts w:ascii="Courier New" w:hAnsi="Courier New" w:cs="Courier New"/>
+        </w:rPr>
+        <w:t>you infrastructure metrics. Product metrics you have</w:t>
       </w:r>
     </w:p>
     <w:p>
@@ -16879,13 +16873,13 @@
         <w:rPr>
           <w:rFonts w:ascii="Courier New" w:hAnsi="Courier New" w:cs="Courier New"/>
         </w:rPr>
-        <w:t xml:space="preserve">            &lt;tr&gt;&lt;td&gt;&lt;code&gt;conversations&lt;/cod</w:t>
-      </w:r>
-      <w:r>
-        <w:rPr>
-          <w:rFonts w:ascii="Courier New" w:hAnsi="Courier New" w:cs="Courier New"/>
-        </w:rPr>
-        <w:t>e&gt;&lt;/td&gt;&lt;td&gt;One row per chat&lt;/td&gt;&lt;td&gt;Own rows only&lt;/td&gt;&lt;/tr&gt;</w:t>
+        <w:t xml:space="preserve">            &lt;tr&gt;&lt;td&gt;&lt;code&gt;conversations&lt;/code&gt;&lt;/td</w:t>
+      </w:r>
+      <w:r>
+        <w:rPr>
+          <w:rFonts w:ascii="Courier New" w:hAnsi="Courier New" w:cs="Courier New"/>
+        </w:rPr>
+        <w:t>&gt;&lt;td&gt;One row per chat&lt;/td&gt;&lt;td&gt;Own rows only&lt;/td&gt;&lt;/tr&gt;</w:t>
       </w:r>
     </w:p>
     <w:p>
@@ -16955,27 +16949,27 @@
         <w:rPr>
           <w:rFonts w:ascii="Courier New" w:hAnsi="Courier New" w:cs="Courier New"/>
         </w:rPr>
-        <w:t xml:space="preserve">        &lt;/ta</w:t>
-      </w:r>
-      <w:r>
-        <w:rPr>
-          <w:rFonts w:ascii="Courier New" w:hAnsi="Courier New" w:cs="Courier New"/>
-        </w:rPr>
-        <w:t>ble&gt;</w:t>
-      </w:r>
-    </w:p>
-    <w:p>
-      <w:pPr>
-        <w:pStyle w:val="PlainText"/>
-        <w:rPr>
-          <w:rFonts w:ascii="Courier New" w:hAnsi="Courier New" w:cs="Courier New"/>
-        </w:rPr>
-      </w:pPr>
-      <w:r>
-        <w:rPr>
-          <w:rFonts w:ascii="Courier New" w:hAnsi="Courier New" w:cs="Courier New"/>
-        </w:rPr>
-        <w:t xml:space="preserve">      &lt;/div&gt;</w:t>
+        <w:t xml:space="preserve">        &lt;/table&gt;</w:t>
+      </w:r>
+    </w:p>
+    <w:p>
+      <w:pPr>
+        <w:pStyle w:val="PlainText"/>
+        <w:rPr>
+          <w:rFonts w:ascii="Courier New" w:hAnsi="Courier New" w:cs="Courier New"/>
+        </w:rPr>
+      </w:pPr>
+      <w:r>
+        <w:rPr>
+          <w:rFonts w:ascii="Courier New" w:hAnsi="Courier New" w:cs="Courier New"/>
+        </w:rPr>
+        <w:t xml:space="preserve"> </w:t>
+      </w:r>
+      <w:r>
+        <w:rPr>
+          <w:rFonts w:ascii="Courier New" w:hAnsi="Courier New" w:cs="Courier New"/>
+        </w:rPr>
+        <w:t xml:space="preserve">     &lt;/div&gt;</w:t>
       </w:r>
     </w:p>
     <w:p>
@@ -17073,13 +17067,13 @@
         <w:rPr>
           <w:rFonts w:ascii="Courier New" w:hAnsi="Courier New" w:cs="Courier New"/>
         </w:rPr>
-        <w:t xml:space="preserve">        never has. A component that writes an audit trail sho</w:t>
-      </w:r>
-      <w:r>
-        <w:rPr>
-          <w:rFonts w:ascii="Courier New" w:hAnsi="Courier New" w:cs="Courier New"/>
-        </w:rPr>
-        <w:t>uld not be able to change it,</w:t>
+        <w:t xml:space="preserve">        never has. A component that writes an audit trail should no</w:t>
+      </w:r>
+      <w:r>
+        <w:rPr>
+          <w:rFonts w:ascii="Courier New" w:hAnsi="Courier New" w:cs="Courier New"/>
+        </w:rPr>
+        <w:t>t be able to change it,</w:t>
       </w:r>
     </w:p>
     <w:p>
@@ -17171,13 +17165,13 @@
         <w:rPr>
           <w:rFonts w:ascii="Courier New" w:hAnsi="Courier New" w:cs="Courier New"/>
         </w:rPr>
-        <w:t xml:space="preserve">        &lt;p&gt;The evaluation set is not something you run when you remember. It is a gate. I</w:t>
-      </w:r>
-      <w:r>
-        <w:rPr>
-          <w:rFonts w:ascii="Courier New" w:hAnsi="Courier New" w:cs="Courier New"/>
-        </w:rPr>
-        <w:t>n a real</w:t>
+        <w:t xml:space="preserve">        &lt;p&gt;The evaluation set is not something you run when you remember. It is a gate. In a re</w:t>
+      </w:r>
+      <w:r>
+        <w:rPr>
+          <w:rFonts w:ascii="Courier New" w:hAnsi="Courier New" w:cs="Courier New"/>
+        </w:rPr>
+        <w:t>al</w:t>
       </w:r>
     </w:p>
     <w:p>
@@ -17317,13 +17311,13 @@
         <w:rPr>
           <w:rFonts w:ascii="Courier New" w:hAnsi="Courier New" w:cs="Courier New"/>
         </w:rPr>
-        <w:t xml:space="preserve">        &lt;p&gt;Two </w:t>
-      </w:r>
-      <w:r>
-        <w:rPr>
-          <w:rFonts w:ascii="Courier New" w:hAnsi="Courier New" w:cs="Courier New"/>
-        </w:rPr>
-        <w:t>gates, not one. A score that stays the same while two cases swap places is a</w:t>
+        <w:t xml:space="preserve">        &lt;p&gt;Two gates,</w:t>
+      </w:r>
+      <w:r>
+        <w:rPr>
+          <w:rFonts w:ascii="Courier New" w:hAnsi="Courier New" w:cs="Courier New"/>
+        </w:rPr>
+        <w:t xml:space="preserve"> not one. A score that stays the same while two cases swap places is a</w:t>
       </w:r>
     </w:p>
     <w:p>
@@ -17408,13 +17402,13 @@
         <w:rPr>
           <w:rFonts w:ascii="Courier New" w:hAnsi="Courier New" w:cs="Courier New"/>
         </w:rPr>
-        <w:t xml:space="preserve">        percent of the last run. That last one catches </w:t>
-      </w:r>
-      <w:r>
-        <w:rPr>
-          <w:rFonts w:ascii="Courier New" w:hAnsi="Courier New" w:cs="Courier New"/>
-        </w:rPr>
-        <w:t>the failure nothing else does, where</w:t>
+        <w:t xml:space="preserve">        percent of the last run. That last one catches the fa</w:t>
+      </w:r>
+      <w:r>
+        <w:rPr>
+          <w:rFonts w:ascii="Courier New" w:hAnsi="Courier New" w:cs="Courier New"/>
+        </w:rPr>
+        <w:t>ilure nothing else does, where</w:t>
       </w:r>
     </w:p>
     <w:p>
@@ -17556,13 +17550,13 @@
         <w:rPr>
           <w:rFonts w:ascii="Courier New" w:hAnsi="Courier New" w:cs="Courier New"/>
         </w:rPr>
-        <w:t>&lt;!-</w:t>
-      </w:r>
-      <w:r>
-        <w:rPr>
-          <w:rFonts w:ascii="Courier New" w:hAnsi="Courier New" w:cs="Courier New"/>
-        </w:rPr>
-        <w:t>- ============================================================ --&gt;</w:t>
+        <w:t>&lt;!-- ====</w:t>
+      </w:r>
+      <w:r>
+        <w:rPr>
+          <w:rFonts w:ascii="Courier New" w:hAnsi="Courier New" w:cs="Courier New"/>
+        </w:rPr>
+        <w:t>======================================================== --&gt;</w:t>
       </w:r>
     </w:p>
     <w:p>
@@ -17646,13 +17640,13 @@
         <w:rPr>
           <w:rFonts w:ascii="Courier New" w:hAnsi="Courier New" w:cs="Courier New"/>
         </w:rPr>
-        <w:t xml:space="preserve">          </w:t>
-      </w:r>
-      <w:r>
-        <w:rPr>
-          <w:rFonts w:ascii="Courier New" w:hAnsi="Courier New" w:cs="Courier New"/>
-        </w:rPr>
-        <w:t>&lt;li&gt;&lt;strong&gt;The model:&lt;/strong&gt; change &lt;code&gt;chat_model_id&lt;/code&gt; in &lt;code&gt;terraform.tfvars&lt;/code&gt; and apply. No code change, because every model is reached through the same Converse API.&lt;/li&gt;</w:t>
+        <w:t xml:space="preserve">          &lt;li&gt;&lt;s</w:t>
+      </w:r>
+      <w:r>
+        <w:rPr>
+          <w:rFonts w:ascii="Courier New" w:hAnsi="Courier New" w:cs="Courier New"/>
+        </w:rPr>
+        <w:t>trong&gt;The model:&lt;/strong&gt; change &lt;code&gt;chat_model_id&lt;/code&gt; in &lt;code&gt;terraform.tfvars&lt;/code&gt; and apply. No code change, because every model is reached through the same Converse API.&lt;/li&gt;</w:t>
       </w:r>
     </w:p>
     <w:p>
@@ -17694,13 +17688,13 @@
         <w:rPr>
           <w:rFonts w:ascii="Courier New" w:hAnsi="Courier New" w:cs="Courier New"/>
         </w:rPr>
-        <w:t xml:space="preserve">          &lt;li&gt;&lt;strong&gt;The React app:&lt;/</w:t>
-      </w:r>
-      <w:r>
-        <w:rPr>
-          <w:rFonts w:ascii="Courier New" w:hAnsi="Courier New" w:cs="Courier New"/>
-        </w:rPr>
-        <w:t>strong&gt; &lt;code&gt;npm run build&lt;/code&gt;, &lt;code&gt;aws s3 sync&lt;/code&gt;, CloudFront invalidation (step 7).&lt;/li&gt;</w:t>
+        <w:t xml:space="preserve">          &lt;li&gt;&lt;strong&gt;The React app:&lt;/strong</w:t>
+      </w:r>
+      <w:r>
+        <w:rPr>
+          <w:rFonts w:ascii="Courier New" w:hAnsi="Courier New" w:cs="Courier New"/>
+        </w:rPr>
+        <w:t>&gt; &lt;code&gt;npm run build&lt;/code&gt;, &lt;code&gt;aws s3 sync&lt;/code&gt;, CloudFront invalidation (step 7).&lt;/li&gt;</w:t>
       </w:r>
     </w:p>
     <w:p>
@@ -17835,7 +17829,13 @@
           <w:rFonts w:ascii="Courier New" w:hAnsi="Courier New" w:cs="Courier New"/>
         </w:rPr>
         <w:lastRenderedPageBreak/>
-        <w:t xml:space="preserve">        &lt;p&gt;Approximate us-east-1 list prices at the time of writing, for a class demo with little traffic. Check the AWS Pricing Calculator before you deploy.&lt;/p&gt;</w:t>
+        <w:t xml:space="preserve">      </w:t>
+      </w:r>
+      <w:r>
+        <w:rPr>
+          <w:rFonts w:ascii="Courier New" w:hAnsi="Courier New" w:cs="Courier New"/>
+        </w:rPr>
+        <w:t xml:space="preserve">  &lt;p&gt;Approximate us-east-1 list prices at the time of writing, for a class demo with little traffic. Check the AWS Pricing Calculator before you deploy.&lt;/p&gt;</w:t>
       </w:r>
     </w:p>
     <w:p>
@@ -17919,13 +17919,13 @@
         <w:rPr>
           <w:rFonts w:ascii="Courier New" w:hAnsi="Courier New" w:cs="Courier New"/>
         </w:rPr>
-        <w:t xml:space="preserve">            &lt;tr&gt;&lt;td&gt;OpenSearch Serverless&lt;/td&gt;&lt;td&gt;Minimum capacity while the collection exists: 0.5 indexing + 0.5 search OCU (OpenSearch Compute Units, the unit i</w:t>
-      </w:r>
-      <w:r>
-        <w:rPr>
-          <w:rFonts w:ascii="Courier New" w:hAnsi="Courier New" w:cs="Courier New"/>
-        </w:rPr>
-        <w:t>t bills in) with standby replicas off, at about $0.24 per OCU-hour&lt;/td&gt;&lt;td class="num"&gt;≈ $175&lt;/td&gt;&lt;/tr&gt;</w:t>
+        <w:t xml:space="preserve">            &lt;tr&gt;&lt;td&gt;OpenSearch Serverless&lt;/td&gt;&lt;td&gt;Minimum capacity while the collection exists: 0.5 indexing + 0.5 search OCU (OpenSearch Compute Units, the unit it bill</w:t>
+      </w:r>
+      <w:r>
+        <w:rPr>
+          <w:rFonts w:ascii="Courier New" w:hAnsi="Courier New" w:cs="Courier New"/>
+        </w:rPr>
+        <w:t>s in) with standby replicas off, at about $0.24 per OCU-hour&lt;/td&gt;&lt;td class="num"&gt;≈ $175&lt;/td&gt;&lt;/tr&gt;</w:t>
       </w:r>
     </w:p>
     <w:p>
@@ -17967,13 +17967,13 @@
         <w:rPr>
           <w:rFonts w:ascii="Courier New" w:hAnsi="Courier New" w:cs="Courier New"/>
         </w:rPr>
-        <w:t xml:space="preserve">            &lt;tr&gt;&lt;td&gt;Aurora Serverless v2&lt;/td&gt;&lt;td&gt;Storage while paused; about $0.12 per ACU-hour per ins</w:t>
-      </w:r>
-      <w:r>
-        <w:rPr>
-          <w:rFonts w:ascii="Courier New" w:hAnsi="Courier New" w:cs="Courier New"/>
-        </w:rPr>
-        <w:t>tance while active&lt;/td&gt;&lt;td class="num"&gt;$1–$20&lt;/td&gt;&lt;/tr&gt;</w:t>
+        <w:t xml:space="preserve">            &lt;tr&gt;&lt;td&gt;Aurora Serverless v2&lt;/td&gt;&lt;td&gt;Storage while paused; about $0.12 per ACU-hour per instance </w:t>
+      </w:r>
+      <w:r>
+        <w:rPr>
+          <w:rFonts w:ascii="Courier New" w:hAnsi="Courier New" w:cs="Courier New"/>
+        </w:rPr>
+        <w:t>while active&lt;/td&gt;&lt;td class="num"&gt;$1–$20&lt;/td&gt;&lt;/tr&gt;</w:t>
       </w:r>
     </w:p>
     <w:p>
@@ -18029,13 +18029,13 @@
         <w:rPr>
           <w:rFonts w:ascii="Courier New" w:hAnsi="Courier New" w:cs="Courier New"/>
         </w:rPr>
-        <w:t xml:space="preserve">            &lt;tr&gt;&lt;td&gt;&lt;strong&gt;Total&lt;/strong&gt;&lt;/td&gt;</w:t>
-      </w:r>
-      <w:r>
-        <w:rPr>
-          <w:rFonts w:ascii="Courier New" w:hAnsi="Courier New" w:cs="Courier New"/>
-        </w:rPr>
-        <w:t>&lt;td&gt;About $7–8 a day, most of it OpenSearch Serverless&lt;/td&gt;&lt;td class="num"&gt;&lt;strong&gt;≈ $220–245&lt;/strong&gt;&lt;/td&gt;&lt;/tr&gt;</w:t>
+        <w:t xml:space="preserve">            &lt;tr&gt;&lt;td&gt;&lt;strong&gt;Total&lt;/strong&gt;&lt;/td&gt;&lt;td&gt;Ab</w:t>
+      </w:r>
+      <w:r>
+        <w:rPr>
+          <w:rFonts w:ascii="Courier New" w:hAnsi="Courier New" w:cs="Courier New"/>
+        </w:rPr>
+        <w:t>out $7–8 a day, most of it OpenSearch Serverless&lt;/td&gt;&lt;td class="num"&gt;&lt;strong&gt;≈ $220–245&lt;/strong&gt;&lt;/td&gt;&lt;/tr&gt;</w:t>
       </w:r>
     </w:p>
     <w:p>
@@ -18119,13 +18119,13 @@
         <w:rPr>
           <w:rFonts w:ascii="Courier New" w:hAnsi="Courier New" w:cs="Courier New"/>
         </w:rPr>
-        <w:t xml:space="preserve">        &lt;p&gt;This architecture meets it only if you &lt;strong&gt;destroy it between sessions&lt;/strong&gt;: about 10 running days a month. Terraform makes that practical: apply takes 30 minutes, destroy about 20. To run it longer for less, replace OpenSearch Serverl</w:t>
-      </w:r>
-      <w:r>
-        <w:rPr>
-          <w:rFonts w:ascii="Courier New" w:hAnsi="Courier New" w:cs="Courier New"/>
-        </w:rPr>
-        <w:t>ess with an OpenSearch Service domain on a small instance, or with pgvector in the Aurora database you already have. Both change &lt;code&gt;search_index.py&lt;/code&gt; and &lt;code&gt;opensearch.tf&lt;/code&gt; only.&lt;/p&gt;</w:t>
+        <w:t xml:space="preserve">        &lt;p&gt;This architecture meets it only if you &lt;strong&gt;destroy it between sessions&lt;/strong&gt;: about 10 running days a month. Terraform makes that practical: apply takes 30 minutes, destroy about 20. To run it longer for less, replace OpenSearch Serverless wi</w:t>
+      </w:r>
+      <w:r>
+        <w:rPr>
+          <w:rFonts w:ascii="Courier New" w:hAnsi="Courier New" w:cs="Courier New"/>
+        </w:rPr>
+        <w:t>th an OpenSearch Service domain on a small instance, or with pgvector in the Aurora database you already have. Both change &lt;code&gt;search_index.py&lt;/code&gt; and &lt;code&gt;opensearch.tf&lt;/code&gt; only.&lt;/p&gt;</w:t>
       </w:r>
     </w:p>
     <w:p>
@@ -18245,13 +18245,13 @@
         <w:rPr>
           <w:rFonts w:ascii="Courier New" w:hAnsi="Courier New" w:cs="Courier New"/>
         </w:rPr>
-        <w:t xml:space="preserve">        &lt;p&gt;About &lt;strong&gt;20 minutes&lt;/strong&gt;, against 8 </w:t>
-      </w:r>
-      <w:r>
-        <w:rPr>
-          <w:rFonts w:ascii="Courier New" w:hAnsi="Courier New" w:cs="Courier New"/>
-        </w:rPr>
-        <w:t>to create. Start it and go and do</w:t>
+        <w:t xml:space="preserve">        &lt;p&gt;About &lt;strong&gt;20 minutes&lt;/strong&gt;, against 8 to cre</w:t>
+      </w:r>
+      <w:r>
+        <w:rPr>
+          <w:rFonts w:ascii="Courier New" w:hAnsi="Courier New" w:cs="Courier New"/>
+        </w:rPr>
+        <w:t>ate. Start it and go and do</w:t>
       </w:r>
     </w:p>
     <w:p>
@@ -18364,13 +18364,13 @@
         <w:rPr>
           <w:rFonts w:ascii="Courier New" w:hAnsi="Courier New" w:cs="Courier New"/>
         </w:rPr>
-        <w:t xml:space="preserve">          &lt;code&gt;aws opensearchserverless</w:t>
-      </w:r>
-      <w:r>
-        <w:rPr>
-          <w:rFonts w:ascii="Courier New" w:hAnsi="Courier New" w:cs="Courier New"/>
-        </w:rPr>
-        <w:t xml:space="preserve"> list-collections&lt;/code&gt; and</w:t>
+        <w:t xml:space="preserve">          &lt;code&gt;aws opensearchserverless list-</w:t>
+      </w:r>
+      <w:r>
+        <w:rPr>
+          <w:rFonts w:ascii="Courier New" w:hAnsi="Courier New" w:cs="Courier New"/>
+        </w:rPr>
+        <w:t>collections&lt;/code&gt; and</w:t>
       </w:r>
     </w:p>
     <w:p>
@@ -18524,13 +18524,13 @@
         <w:rPr>
           <w:rFonts w:ascii="Courier New" w:hAnsi="Courier New" w:cs="Courier New"/>
         </w:rPr>
-        <w:t xml:space="preserve">       </w:t>
-      </w:r>
-      <w:r>
-        <w:rPr>
-          <w:rFonts w:ascii="Courier New" w:hAnsi="Courier New" w:cs="Courier New"/>
-        </w:rPr>
-        <w:t xml:space="preserve"> &lt;p&gt;This project makes one choice at every step. Here are the choices that existed,</w:t>
+        <w:t xml:space="preserve">        &lt;p&gt;Th</w:t>
+      </w:r>
+      <w:r>
+        <w:rPr>
+          <w:rFonts w:ascii="Courier New" w:hAnsi="Courier New" w:cs="Courier New"/>
+        </w:rPr>
+        <w:t>is project makes one choice at every step. Here are the choices that existed,</w:t>
       </w:r>
     </w:p>
     <w:p>
@@ -18650,13 +18650,13 @@
         <w:rPr>
           <w:rFonts w:ascii="Courier New" w:hAnsi="Courier New" w:cs="Courier New"/>
         </w:rPr>
-        <w:t xml:space="preserve">        how do you find out</w:t>
-      </w:r>
-      <w:r>
-        <w:rPr>
-          <w:rFonts w:ascii="Courier New" w:hAnsi="Courier New" w:cs="Courier New"/>
-        </w:rPr>
-        <w:t xml:space="preserve"> one changed, and what happens when one is withdrawn. If any of it</w:t>
+        <w:t xml:space="preserve">        how do you find out one c</w:t>
+      </w:r>
+      <w:r>
+        <w:rPr>
+          <w:rFonts w:ascii="Courier New" w:hAnsi="Courier New" w:cs="Courier New"/>
+        </w:rPr>
+        <w:t>hanged, and what happens when one is withdrawn. If any of it</w:t>
       </w:r>
     </w:p>
     <w:p>
@@ -18740,13 +18740,13 @@
         <w:rPr>
           <w:rFonts w:ascii="Courier New" w:hAnsi="Courier New" w:cs="Courier New"/>
         </w:rPr>
-        <w:t xml:space="preserve">        documents that f</w:t>
-      </w:r>
-      <w:r>
-        <w:rPr>
-          <w:rFonts w:ascii="Courier New" w:hAnsi="Courier New" w:cs="Courier New"/>
-        </w:rPr>
-        <w:t>lips.&lt;/p&gt;</w:t>
+        <w:t xml:space="preserve">        documents that flips.&lt;</w:t>
+      </w:r>
+      <w:r>
+        <w:rPr>
+          <w:rFonts w:ascii="Courier New" w:hAnsi="Courier New" w:cs="Courier New"/>
+        </w:rPr>
+        <w:t>/p&gt;</w:t>
       </w:r>
     </w:p>
     <w:p>
@@ -18895,7 +18895,13 @@
         <w:rPr>
           <w:rFonts w:ascii="Courier New" w:hAnsi="Courier New" w:cs="Courier New"/>
         </w:rPr>
-        <w:t xml:space="preserve">            &lt;tr&gt;&lt;td&gt;DOCX&lt;/td&gt;&lt;td&gt;Tables and headers are easy to lose. Tracked changes may still be in there&lt;/td&gt;&lt;/tr&gt;</w:t>
+        <w:t xml:space="preserve">      </w:t>
+      </w:r>
+      <w:r>
+        <w:rPr>
+          <w:rFonts w:ascii="Courier New" w:hAnsi="Courier New" w:cs="Courier New"/>
+        </w:rPr>
+        <w:t xml:space="preserve">      &lt;tr&gt;&lt;td&gt;DOCX&lt;/td&gt;&lt;td&gt;Tables and headers are easy to lose. Tracked changes may still be in there&lt;/td&gt;&lt;/tr&gt;</w:t>
       </w:r>
     </w:p>
     <w:p>
@@ -18993,27 +18999,27 @@
         <w:rPr>
           <w:rFonts w:ascii="Courier New" w:hAnsi="Courier New" w:cs="Courier New"/>
         </w:rPr>
-        <w:t xml:space="preserve">      &lt;div class="table-wra</w:t>
-      </w:r>
-      <w:r>
-        <w:rPr>
-          <w:rFonts w:ascii="Courier New" w:hAnsi="Courier New" w:cs="Courier New"/>
-        </w:rPr>
-        <w:t>p"&gt;</w:t>
-      </w:r>
-    </w:p>
-    <w:p>
-      <w:pPr>
-        <w:pStyle w:val="PlainText"/>
-        <w:rPr>
-          <w:rFonts w:ascii="Courier New" w:hAnsi="Courier New" w:cs="Courier New"/>
-        </w:rPr>
-      </w:pPr>
-      <w:r>
-        <w:rPr>
-          <w:rFonts w:ascii="Courier New" w:hAnsi="Courier New" w:cs="Courier New"/>
-        </w:rPr>
-        <w:t xml:space="preserve">        &lt;table&gt;</w:t>
+        <w:t xml:space="preserve">      &lt;div class="table-wrap"&gt;</w:t>
+      </w:r>
+    </w:p>
+    <w:p>
+      <w:pPr>
+        <w:pStyle w:val="PlainText"/>
+        <w:rPr>
+          <w:rFonts w:ascii="Courier New" w:hAnsi="Courier New" w:cs="Courier New"/>
+        </w:rPr>
+      </w:pPr>
+      <w:r>
+        <w:rPr>
+          <w:rFonts w:ascii="Courier New" w:hAnsi="Courier New" w:cs="Courier New"/>
+        </w:rPr>
+        <w:t xml:space="preserve">  </w:t>
+      </w:r>
+      <w:r>
+        <w:rPr>
+          <w:rFonts w:ascii="Courier New" w:hAnsi="Courier New" w:cs="Courier New"/>
+        </w:rPr>
+        <w:t xml:space="preserve">      &lt;table&gt;</w:t>
       </w:r>
     </w:p>
     <w:p>
@@ -19083,13 +19089,13 @@
         <w:rPr>
           <w:rFonts w:ascii="Courier New" w:hAnsi="Courier New" w:cs="Courier New"/>
         </w:rPr>
-        <w:t xml:space="preserve">            &lt;tr&gt;&lt;t</w:t>
-      </w:r>
-      <w:r>
-        <w:rPr>
-          <w:rFonts w:ascii="Courier New" w:hAnsi="Courier New" w:cs="Courier New"/>
-        </w:rPr>
-        <w:t>d&gt;&lt;strong&gt;LlamaParse&lt;/strong&gt; and similar&lt;/td&gt;&lt;td&gt;Better on complex PDFs and tables, at a per-page cost&lt;/td&gt;&lt;/tr&gt;</w:t>
+        <w:t xml:space="preserve">            &lt;tr&gt;&lt;td&gt;&lt;str</w:t>
+      </w:r>
+      <w:r>
+        <w:rPr>
+          <w:rFonts w:ascii="Courier New" w:hAnsi="Courier New" w:cs="Courier New"/>
+        </w:rPr>
+        <w:t>ong&gt;LlamaParse&lt;/strong&gt; and similar&lt;/td&gt;&lt;td&gt;Better on complex PDFs and tables, at a per-page cost&lt;/td&gt;&lt;/tr&gt;</w:t>
       </w:r>
     </w:p>
     <w:p>
@@ -19131,13 +19137,13 @@
         <w:rPr>
           <w:rFonts w:ascii="Courier New" w:hAnsi="Courier New" w:cs="Courier New"/>
         </w:rPr>
-        <w:t xml:space="preserve">            &lt;tr&gt;&lt;td&gt;&lt;strong&gt;Docling, Apache Tika&lt;/strong&gt;&lt;/td&gt;&lt;</w:t>
-      </w:r>
-      <w:r>
-        <w:rPr>
-          <w:rFonts w:ascii="Courier New" w:hAnsi="Courier New" w:cs="Courier New"/>
-        </w:rPr>
-        <w:t>td&gt;Broad format coverage, often in a JVM stack&lt;/td&gt;&lt;/tr&gt;</w:t>
+        <w:t xml:space="preserve">            &lt;tr&gt;&lt;td&gt;&lt;strong&gt;Docling, Apache Tika&lt;/strong&gt;&lt;/td&gt;&lt;td&gt;Bro</w:t>
+      </w:r>
+      <w:r>
+        <w:rPr>
+          <w:rFonts w:ascii="Courier New" w:hAnsi="Courier New" w:cs="Courier New"/>
+        </w:rPr>
+        <w:t>ad format coverage, often in a JVM stack&lt;/td&gt;&lt;/tr&gt;</w:t>
       </w:r>
     </w:p>
     <w:p>
@@ -19264,13 +19270,13 @@
         <w:rPr>
           <w:rFonts w:ascii="Courier New" w:hAnsi="Courier New" w:cs="Courier New"/>
         </w:rPr>
-        <w:t xml:space="preserve">        It ma</w:t>
-      </w:r>
-      <w:r>
-        <w:rPr>
-          <w:rFonts w:ascii="Courier New" w:hAnsi="Courier New" w:cs="Courier New"/>
-        </w:rPr>
-        <w:t>tters more than the choice of embedding model.&lt;/p&gt;</w:t>
+        <w:t xml:space="preserve">        It matters </w:t>
+      </w:r>
+      <w:r>
+        <w:rPr>
+          <w:rFonts w:ascii="Courier New" w:hAnsi="Courier New" w:cs="Courier New"/>
+        </w:rPr>
+        <w:t>more than the choice of embedding model.&lt;/p&gt;</w:t>
       </w:r>
     </w:p>
     <w:p>
@@ -19362,13 +19368,13 @@
         <w:rPr>
           <w:rFonts w:ascii="Courier New" w:hAnsi="Courier New" w:cs="Courier New"/>
         </w:rPr>
-        <w:t xml:space="preserve">        &lt;p&gt;This project uses LangChain's &lt;code&gt;RecursiveCharacterTextSplitter&lt;/cod</w:t>
-      </w:r>
-      <w:r>
-        <w:rPr>
-          <w:rFonts w:ascii="Courier New" w:hAnsi="Courier New" w:cs="Courier New"/>
-        </w:rPr>
-        <w:t>e&gt; at 700</w:t>
+        <w:t xml:space="preserve">        &lt;p&gt;This project uses LangChain's &lt;code&gt;RecursiveCharacterTextSplitter&lt;/code&gt; at </w:t>
+      </w:r>
+      <w:r>
+        <w:rPr>
+          <w:rFonts w:ascii="Courier New" w:hAnsi="Courier New" w:cs="Courier New"/>
+        </w:rPr>
+        <w:t>700</w:t>
       </w:r>
     </w:p>
     <w:p>
@@ -19466,13 +19472,13 @@
         <w:rPr>
           <w:rFonts w:ascii="Courier New" w:hAnsi="Courier New" w:cs="Courier New"/>
         </w:rPr>
-        <w:t xml:space="preserve">        reference</w:t>
-      </w:r>
-      <w:r>
-        <w:rPr>
-          <w:rFonts w:ascii="Courier New" w:hAnsi="Courier New" w:cs="Courier New"/>
-        </w:rPr>
-        <w:t xml:space="preserve"> to your documents is a guess.&lt;/p&gt;</w:t>
+        <w:t xml:space="preserve">        reference to yo</w:t>
+      </w:r>
+      <w:r>
+        <w:rPr>
+          <w:rFonts w:ascii="Courier New" w:hAnsi="Courier New" w:cs="Courier New"/>
+        </w:rPr>
+        <w:t>ur documents is a guess.&lt;/p&gt;</w:t>
       </w:r>
     </w:p>
     <w:p>
@@ -19606,13 +19612,13 @@
         <w:rPr>
           <w:rFonts w:ascii="Courier New" w:hAnsi="Courier New" w:cs="Courier New"/>
         </w:rPr>
-        <w:t xml:space="preserve">            &lt;tr&gt;&lt;td&gt;OpenAI text-embedding-3&lt;/td&gt;&lt;</w:t>
-      </w:r>
-      <w:r>
-        <w:rPr>
-          <w:rFonts w:ascii="Courier New" w:hAnsi="Courier New" w:cs="Courier New"/>
-        </w:rPr>
-        <w:t>td&gt;1536 or 3072&lt;/td&gt;&lt;td&gt;Very widely used outside AWS&lt;/td&gt;&lt;/tr&gt;</w:t>
+        <w:t xml:space="preserve">            &lt;tr&gt;&lt;td&gt;OpenAI text-embedding-3&lt;/td&gt;&lt;td&gt;153</w:t>
+      </w:r>
+      <w:r>
+        <w:rPr>
+          <w:rFonts w:ascii="Courier New" w:hAnsi="Courier New" w:cs="Courier New"/>
+        </w:rPr>
+        <w:t>6 or 3072&lt;/td&gt;&lt;td&gt;Very widely used outside AWS&lt;/td&gt;&lt;/tr&gt;</w:t>
       </w:r>
     </w:p>
     <w:p>
@@ -19724,13 +19730,13 @@
         <w:rPr>
           <w:rFonts w:ascii="Courier New" w:hAnsi="Courier New" w:cs="Courier New"/>
         </w:rPr>
-        <w:t xml:space="preserve">        a migration with</w:t>
-      </w:r>
-      <w:r>
-        <w:rPr>
-          <w:rFonts w:ascii="Courier New" w:hAnsi="Courier New" w:cs="Courier New"/>
-        </w:rPr>
-        <w:t xml:space="preserve"> a cost and a window, not a config tweak.&lt;/p&gt;</w:t>
+        <w:t xml:space="preserve">        a migration with a cos</w:t>
+      </w:r>
+      <w:r>
+        <w:rPr>
+          <w:rFonts w:ascii="Courier New" w:hAnsi="Courier New" w:cs="Courier New"/>
+        </w:rPr>
+        <w:t>t and a window, not a config tweak.&lt;/p&gt;</w:t>
       </w:r>
     </w:p>
     <w:p>
@@ -19879,13 +19885,13 @@
         <w:rPr>
           <w:rFonts w:ascii="Courier New" w:hAnsi="Courier New" w:cs="Courier New"/>
         </w:rPr>
-        <w:t xml:space="preserve">            &lt;tr&gt;&lt;td&gt;pgvector in Postg</w:t>
-      </w:r>
-      <w:r>
-        <w:rPr>
-          <w:rFonts w:ascii="Courier New" w:hAnsi="Courier New" w:cs="Courier New"/>
-        </w:rPr>
-        <w:t>reSQL&lt;/td&gt;&lt;td&gt;You already have Postgres and do not want another system. The POC&lt;/td&gt;&lt;/tr&gt;</w:t>
+        <w:t xml:space="preserve">            &lt;tr&gt;&lt;td&gt;pgvector in PostgreSQL&lt;</w:t>
+      </w:r>
+      <w:r>
+        <w:rPr>
+          <w:rFonts w:ascii="Courier New" w:hAnsi="Courier New" w:cs="Courier New"/>
+        </w:rPr>
+        <w:t>/td&gt;&lt;td&gt;You already have Postgres and do not want another system. The POC&lt;/td&gt;&lt;/tr&gt;</w:t>
       </w:r>
     </w:p>
     <w:p>
@@ -19997,13 +20003,13 @@
         <w:rPr>
           <w:rFonts w:ascii="Courier New" w:hAnsi="Courier New" w:cs="Courier New"/>
         </w:rPr>
-        <w:t xml:space="preserve">        &lt;p&gt;The question that matters most is whether it filters &lt;em&gt;inside&lt;/em&gt;</w:t>
-      </w:r>
-      <w:r>
-        <w:rPr>
-          <w:rFonts w:ascii="Courier New" w:hAnsi="Courier New" w:cs="Courier New"/>
-        </w:rPr>
-        <w:t xml:space="preserve"> the search.</w:t>
+        <w:t xml:space="preserve">        &lt;p&gt;The question that matters most is whether it filters &lt;em&gt;inside&lt;/em&gt; the s</w:t>
+      </w:r>
+      <w:r>
+        <w:rPr>
+          <w:rFonts w:ascii="Courier New" w:hAnsi="Courier New" w:cs="Courier New"/>
+        </w:rPr>
+        <w:t>earch.</w:t>
       </w:r>
     </w:p>
     <w:p>
@@ -20123,13 +20129,13 @@
         <w:rPr>
           <w:rFonts w:ascii="Courier New" w:hAnsi="Courier New" w:cs="Courier New"/>
         </w:rPr>
-        <w:t xml:space="preserve">        &lt;p&gt;Roughly seventy models have on-demand pricing o</w:t>
-      </w:r>
-      <w:r>
-        <w:rPr>
-          <w:rFonts w:ascii="Courier New" w:hAnsi="Courier New" w:cs="Courier New"/>
-        </w:rPr>
-        <w:t>n Bedrock in us-east-1: the Nova</w:t>
+        <w:t xml:space="preserve">        &lt;p&gt;Roughly seventy models have on-demand pricing on Bedr</w:t>
+      </w:r>
+      <w:r>
+        <w:rPr>
+          <w:rFonts w:ascii="Courier New" w:hAnsi="Courier New" w:cs="Courier New"/>
+        </w:rPr>
+        <w:t>ock in us-east-1: the Nova</w:t>
       </w:r>
     </w:p>
     <w:p>
@@ -20255,7 +20261,13 @@
         <w:rPr>
           <w:rFonts w:ascii="Courier New" w:hAnsi="Courier New" w:cs="Courier New"/>
         </w:rPr>
-        <w:t xml:space="preserve">            &lt;tr&gt;&lt;td&gt;Does it support tool use?&lt;/td&gt;&lt;td&gt;This whole design depends on it&lt;/td&gt;&lt;/tr&gt;</w:t>
+        <w:t xml:space="preserve">     </w:t>
+      </w:r>
+      <w:r>
+        <w:rPr>
+          <w:rFonts w:ascii="Courier New" w:hAnsi="Courier New" w:cs="Courier New"/>
+        </w:rPr>
+        <w:t xml:space="preserve">       &lt;tr&gt;&lt;td&gt;Does it support tool use?&lt;/td&gt;&lt;td&gt;This whole design depends on it&lt;/td&gt;&lt;/tr&gt;</w:t>
       </w:r>
     </w:p>
     <w:p>
@@ -20298,13 +20310,13 @@
         <w:rPr>
           <w:rFonts w:ascii="Courier New" w:hAnsi="Courier New" w:cs="Courier New"/>
         </w:rPr>
-        <w:t xml:space="preserve">            &lt;tr&gt;&lt;td&gt;Must the data stay in one geography?&lt;/td&gt;&lt;td&gt;Use a regional inference profile (&lt;code&gt;us.</w:t>
-      </w:r>
-      <w:r>
-        <w:rPr>
-          <w:rFonts w:ascii="Courier New" w:hAnsi="Courier New" w:cs="Courier New"/>
-        </w:rPr>
-        <w:t>&lt;/code&gt;, &lt;code&gt;eu.&lt;/code&gt;) rather than &lt;code&gt;global.&lt;/code&gt;&lt;/td&gt;&lt;/tr&gt;</w:t>
+        <w:t xml:space="preserve">            &lt;tr&gt;&lt;td&gt;Must the data stay in one geography?&lt;/td&gt;&lt;td&gt;Use a regional inference profile (&lt;code&gt;us.&lt;/code</w:t>
+      </w:r>
+      <w:r>
+        <w:rPr>
+          <w:rFonts w:ascii="Courier New" w:hAnsi="Courier New" w:cs="Courier New"/>
+        </w:rPr>
+        <w:t>&gt;, &lt;code&gt;eu.&lt;/code&gt;) rather than &lt;code&gt;global.&lt;/code&gt;&lt;/td&gt;&lt;/tr&gt;</w:t>
       </w:r>
     </w:p>
     <w:p>
@@ -20438,27 +20450,27 @@
         <w:rPr>
           <w:rFonts w:ascii="Courier New" w:hAnsi="Courier New" w:cs="Courier New"/>
         </w:rPr>
-        <w:t xml:space="preserve">        &lt;h3&gt;Putting it in Slack or Teams&lt;/</w:t>
-      </w:r>
-      <w:r>
-        <w:rPr>
-          <w:rFonts w:ascii="Courier New" w:hAnsi="Courier New" w:cs="Courier New"/>
-        </w:rPr>
-        <w:t>h3&gt;</w:t>
-      </w:r>
-    </w:p>
-    <w:p>
-      <w:pPr>
-        <w:pStyle w:val="PlainText"/>
-        <w:rPr>
-          <w:rFonts w:ascii="Courier New" w:hAnsi="Courier New" w:cs="Courier New"/>
-        </w:rPr>
-      </w:pPr>
-      <w:r>
-        <w:rPr>
-          <w:rFonts w:ascii="Courier New" w:hAnsi="Courier New" w:cs="Courier New"/>
-        </w:rPr>
-        <w:t xml:space="preserve">        &lt;p&gt;This comes up immediately, and it is worth being clear about what kind of work it</w:t>
+        <w:t xml:space="preserve">        &lt;h3&gt;Putting it in Slack or Teams&lt;/h3&gt;</w:t>
+      </w:r>
+    </w:p>
+    <w:p>
+      <w:pPr>
+        <w:pStyle w:val="PlainText"/>
+        <w:rPr>
+          <w:rFonts w:ascii="Courier New" w:hAnsi="Courier New" w:cs="Courier New"/>
+        </w:rPr>
+      </w:pPr>
+      <w:r>
+        <w:rPr>
+          <w:rFonts w:ascii="Courier New" w:hAnsi="Courier New" w:cs="Courier New"/>
+        </w:rPr>
+        <w:t xml:space="preserve">  </w:t>
+      </w:r>
+      <w:r>
+        <w:rPr>
+          <w:rFonts w:ascii="Courier New" w:hAnsi="Courier New" w:cs="Courier New"/>
+        </w:rPr>
+        <w:t xml:space="preserve">      &lt;p&gt;This comes up immediately, and it is worth being clear about what kind of work it</w:t>
       </w:r>
     </w:p>
     <w:p>
@@ -20542,13 +20554,13 @@
         <w:rPr>
           <w:rFonts w:ascii="Courier New" w:hAnsi="Courier New" w:cs="Courier New"/>
         </w:rPr>
-        <w:t xml:space="preserve">        map the sender to an </w:t>
-      </w:r>
-      <w:r>
-        <w:rPr>
-          <w:rFonts w:ascii="Courier New" w:hAnsi="Courier New" w:cs="Courier New"/>
-        </w:rPr>
-        <w:t>employee, call &lt;code&gt;POST /api/chat&lt;/code&gt;, and format the reply.</w:t>
+        <w:t xml:space="preserve">        map the sender to an employ</w:t>
+      </w:r>
+      <w:r>
+        <w:rPr>
+          <w:rFonts w:ascii="Courier New" w:hAnsi="Courier New" w:cs="Courier New"/>
+        </w:rPr>
+        <w:t>ee, call &lt;code&gt;POST /api/chat&lt;/code&gt;, and format the reply.</w:t>
       </w:r>
     </w:p>
     <w:p>
@@ -20646,7 +20658,13 @@
         <w:rPr>
           <w:rFonts w:ascii="Courier New" w:hAnsi="Courier New" w:cs="Courier New"/>
         </w:rPr>
-        <w:t xml:space="preserve">      &lt;/div&gt;</w:t>
+        <w:t xml:space="preserve">      </w:t>
+      </w:r>
+      <w:r>
+        <w:rPr>
+          <w:rFonts w:ascii="Courier New" w:hAnsi="Courier New" w:cs="Courier New"/>
+        </w:rPr>
+        <w:t>&lt;/div&gt;</w:t>
       </w:r>
     </w:p>
     <w:p>
@@ -20817,13 +20835,13 @@
         <w:rPr>
           <w:rFonts w:ascii="Courier New" w:hAnsi="Courier New" w:cs="Courier New"/>
         </w:rPr>
-        <w:t xml:space="preserve">            &lt;tr&gt;&lt;td&gt;Terraform: &lt;code&gt;build/layer.zip is missing&lt;/code&gt;&lt;/td&gt;&lt;td&gt;The dependency layer was never built&lt;/td&gt;&lt;td&gt;&lt;code&gt;bash scripts/build-lay</w:t>
-      </w:r>
-      <w:r>
-        <w:rPr>
-          <w:rFonts w:ascii="Courier New" w:hAnsi="Courier New" w:cs="Courier New"/>
-        </w:rPr>
-        <w:t>er.sh&lt;/code&gt;, then apply again&lt;/td&gt;&lt;/tr&gt;</w:t>
+        <w:t xml:space="preserve">            &lt;tr&gt;&lt;td&gt;Terraform: &lt;code&gt;build/layer.zip is missing&lt;/code&gt;&lt;/td&gt;&lt;td&gt;The dependency layer was never built&lt;/td&gt;&lt;td&gt;&lt;code&gt;bash scripts/build-layer.sh&lt;</w:t>
+      </w:r>
+      <w:r>
+        <w:rPr>
+          <w:rFonts w:ascii="Courier New" w:hAnsi="Courier New" w:cs="Courier New"/>
+        </w:rPr>
+        <w:t>/code&gt;, then apply again&lt;/td&gt;&lt;/tr&gt;</w:t>
       </w:r>
     </w:p>
     <w:p>
@@ -20851,13 +20869,13 @@
         <w:rPr>
           <w:rFonts w:ascii="Courier New" w:hAnsi="Courier New" w:cs="Courier New"/>
         </w:rPr>
-        <w:t xml:space="preserve">            &lt;tr&gt;&lt;td&gt;&lt;code&gt;AccessDeniedException&lt;/code&gt; in chat logs, naming a model&lt;/td&gt;&lt;td&gt;That model is not enabled in this account and region&lt;/td&gt;&lt;td&gt;Bedrock console, Model catalog, request access. Anthropic </w:t>
-      </w:r>
-      <w:r>
-        <w:rPr>
-          <w:rFonts w:ascii="Courier New" w:hAnsi="Courier New" w:cs="Courier New"/>
-        </w:rPr>
-        <w:t>models also need the use case form, which is why the default here is Nova&lt;/td&gt;&lt;/tr&gt;</w:t>
+        <w:t xml:space="preserve">            &lt;tr&gt;&lt;td&gt;&lt;code&gt;AccessDeniedException&lt;/code&gt; in chat logs, naming a model&lt;/td&gt;&lt;td&gt;That model is not enabled in this account and region&lt;/td&gt;&lt;td&gt;Bedrock console, Model catalog, request access. Anthropic models</w:t>
+      </w:r>
+      <w:r>
+        <w:rPr>
+          <w:rFonts w:ascii="Courier New" w:hAnsi="Courier New" w:cs="Courier New"/>
+        </w:rPr>
+        <w:t xml:space="preserve"> also need the use case form, which is why the default here is Nova&lt;/td&gt;&lt;/tr&gt;</w:t>
       </w:r>
     </w:p>
     <w:p>
@@ -20885,13 +20903,13 @@
         <w:rPr>
           <w:rFonts w:ascii="Courier New" w:hAnsi="Courier New" w:cs="Courier New"/>
         </w:rPr>
-        <w:t xml:space="preserve">            &lt;tr&gt;&lt;td&gt;&lt;code&gt;InvalidParameterException&lt;/code&gt; on &lt;code&gt;logGroupName&lt;/code&gt;&lt;/td&gt;&lt;td&gt;Git Bash on Windows rewrote the </w:t>
-      </w:r>
-      <w:r>
-        <w:rPr>
-          <w:rFonts w:ascii="Courier New" w:hAnsi="Courier New" w:cs="Courier New"/>
-        </w:rPr>
-        <w:t>&lt;code&gt;/aws/lambda/...&lt;/code&gt; path&lt;/td&gt;&lt;td&gt;&lt;code&gt;export MSYS_NO_PATHCONV=1&lt;/code&gt;&lt;/td&gt;&lt;/tr&gt;</w:t>
+        <w:t xml:space="preserve">            &lt;tr&gt;&lt;td&gt;&lt;code&gt;InvalidParameterException&lt;/code&gt; on &lt;code&gt;logGroupName&lt;/code&gt;&lt;/td&gt;&lt;td&gt;Git Bash on Windows rewrote the &lt;code&gt;</w:t>
+      </w:r>
+      <w:r>
+        <w:rPr>
+          <w:rFonts w:ascii="Courier New" w:hAnsi="Courier New" w:cs="Courier New"/>
+        </w:rPr>
+        <w:t>/aws/lambda/...&lt;/code&gt; path&lt;/td&gt;&lt;td&gt;&lt;code&gt;export MSYS_NO_PATHCONV=1&lt;/code&gt;&lt;/td&gt;&lt;/tr&gt;</w:t>
       </w:r>
     </w:p>
     <w:p>
@@ -20919,13 +20937,13 @@
         <w:rPr>
           <w:rFonts w:ascii="Courier New" w:hAnsi="Courier New" w:cs="Courier New"/>
         </w:rPr>
-        <w:t xml:space="preserve">            &lt;tr&gt;&lt;td&gt;401 from &lt;code&gt;/api/me&lt;/code&gt;&lt;/td&gt;&lt;td&gt;Token expired, or built with another app client ID&lt;/td&gt;&lt;td&gt;Sign out and in; rebuild the React app with the curr</w:t>
-      </w:r>
-      <w:r>
-        <w:rPr>
-          <w:rFonts w:ascii="Courier New" w:hAnsi="Courier New" w:cs="Courier New"/>
-        </w:rPr>
-        <w:t>ent &lt;code&gt;frontend_env&lt;/code&gt;&lt;/td&gt;&lt;/tr&gt;</w:t>
+        <w:t xml:space="preserve">            &lt;tr&gt;&lt;td&gt;401 from &lt;code&gt;/api/me&lt;/code&gt;&lt;/td&gt;&lt;td&gt;Token expired, or built with another app client ID&lt;/td&gt;&lt;td&gt;Sign out and in; rebuild the React app with the current &lt;c</w:t>
+      </w:r>
+      <w:r>
+        <w:rPr>
+          <w:rFonts w:ascii="Courier New" w:hAnsi="Courier New" w:cs="Courier New"/>
+        </w:rPr>
+        <w:t>ode&gt;frontend_env&lt;/code&gt;&lt;/td&gt;&lt;/tr&gt;</w:t>
       </w:r>
     </w:p>
     <w:p>
@@ -20967,13 +20985,13 @@
         <w:rPr>
           <w:rFonts w:ascii="Courier New" w:hAnsi="Courier New" w:cs="Courier New"/>
         </w:rPr>
-        <w:t xml:space="preserve">            &lt;tr&gt;&lt;td&gt;Answers say "No matching policy text" right after ingestion&lt;/td&gt;&lt;td&gt;Op</w:t>
-      </w:r>
-      <w:r>
-        <w:rPr>
-          <w:rFonts w:ascii="Courier New" w:hAnsi="Courier New" w:cs="Courier New"/>
-        </w:rPr>
-        <w:t>enSearch Serverless hasn't refreshed yet&lt;/td&gt;&lt;td&gt;Wait a minute&lt;/td&gt;&lt;/tr&gt;</w:t>
+        <w:t xml:space="preserve">            &lt;tr&gt;&lt;td&gt;Answers say "No matching policy text" right after ingestion&lt;/td&gt;&lt;td&gt;OpenSear</w:t>
+      </w:r>
+      <w:r>
+        <w:rPr>
+          <w:rFonts w:ascii="Courier New" w:hAnsi="Courier New" w:cs="Courier New"/>
+        </w:rPr>
+        <w:t>ch Serverless hasn't refreshed yet&lt;/td&gt;&lt;td&gt;Wait a minute&lt;/td&gt;&lt;/tr&gt;</w:t>
       </w:r>
     </w:p>
     <w:p>
@@ -21001,13 +21019,13 @@
         <w:rPr>
           <w:rFonts w:ascii="Courier New" w:hAnsi="Courier New" w:cs="Courier New"/>
         </w:rPr>
-        <w:t xml:space="preserve">            &lt;tr&gt;&lt;td&gt;The same question passes one run and fails the next&lt;/td&gt;&lt;td&gt;The threshold sits inside the noise of approximate vector search&lt;/td&gt;&lt;td&gt;Move</w:t>
-      </w:r>
-      <w:r>
-        <w:rPr>
-          <w:rFonts w:ascii="Courier New" w:hAnsi="Courier New" w:cs="Courier New"/>
-        </w:rPr>
-        <w:t xml:space="preserve"> it further from the lowest real score, and set temperature to 0 before comparing runs at all&lt;/td&gt;&lt;/tr&gt;</w:t>
+        <w:t xml:space="preserve">            &lt;tr&gt;&lt;td&gt;The same question passes one run and fails the next&lt;/td&gt;&lt;td&gt;The threshold sits inside the noise of approximate vector search&lt;/td&gt;&lt;td&gt;Move it fu</w:t>
+      </w:r>
+      <w:r>
+        <w:rPr>
+          <w:rFonts w:ascii="Courier New" w:hAnsi="Courier New" w:cs="Courier New"/>
+        </w:rPr>
+        <w:t>rther from the lowest real score, and set temperature to 0 before comparing runs at all&lt;/td&gt;&lt;/tr&gt;</w:t>
       </w:r>
     </w:p>
     <w:p>
@@ -21050,13 +21068,13 @@
         <w:rPr>
           <w:rFonts w:ascii="Courier New" w:hAnsi="Courier New" w:cs="Courier New"/>
         </w:rPr>
-        <w:t xml:space="preserve">            &lt;tr&gt;&lt;td&gt;Terraform: domain already exists&lt;/td&gt;&lt;td&gt;&lt;code&gt;co</w:t>
-      </w:r>
-      <w:r>
-        <w:rPr>
-          <w:rFonts w:ascii="Courier New" w:hAnsi="Courier New" w:cs="Courier New"/>
-        </w:rPr>
-        <w:t>gnito_domain_prefix&lt;/code&gt; taken&lt;/td&gt;&lt;td&gt;Choose another prefix&lt;/td&gt;&lt;/tr&gt;</w:t>
+        <w:t xml:space="preserve">            &lt;tr&gt;&lt;td&gt;Terraform: domain already exists&lt;/td&gt;&lt;td&gt;&lt;code&gt;cognito_</w:t>
+      </w:r>
+      <w:r>
+        <w:rPr>
+          <w:rFonts w:ascii="Courier New" w:hAnsi="Courier New" w:cs="Courier New"/>
+        </w:rPr>
+        <w:t>domain_prefix&lt;/code&gt; taken&lt;/td&gt;&lt;td&gt;Choose another prefix&lt;/td&gt;&lt;/tr&gt;</w:t>
       </w:r>
     </w:p>
     <w:p>
@@ -21182,13 +21200,13 @@
         <w:rPr>
           <w:rFonts w:ascii="Courier New" w:hAnsi="Courier New" w:cs="Courier New"/>
         </w:rPr>
-        <w:t xml:space="preserve">        &lt;p&gt;Optional, and not part of the four hours. A console screen does show you choices a Terraform file hides, so this is worth doing once, on your own time, for the services you wan</w:t>
-      </w:r>
-      <w:r>
-        <w:rPr>
-          <w:rFonts w:ascii="Courier New" w:hAnsi="Courier New" w:cs="Courier New"/>
-        </w:rPr>
-        <w:t>t to understand properly.&lt;/p&gt;</w:t>
+        <w:t xml:space="preserve">        &lt;p&gt;Optional, and not part of the four hours. A console screen does show you choices a Terraform file hides, so this is worth doing once, on your own time, for the services you want to u</w:t>
+      </w:r>
+      <w:r>
+        <w:rPr>
+          <w:rFonts w:ascii="Courier New" w:hAnsi="Courier New" w:cs="Courier New"/>
+        </w:rPr>
+        <w:t>nderstand properly.&lt;/p&gt;</w:t>
       </w:r>
     </w:p>
     <w:p>
@@ -21314,13 +21332,13 @@
         <w:rPr>
           <w:rFonts w:ascii="Courier New" w:hAnsi="Courier New" w:cs="Courier New"/>
         </w:rPr>
-        <w:t xml:space="preserve">            &lt;tr&gt;</w:t>
-      </w:r>
-      <w:r>
-        <w:rPr>
-          <w:rFonts w:ascii="Courier New" w:hAnsi="Courier New" w:cs="Courier New"/>
-        </w:rPr>
-        <w:t>&lt;td&gt;3&lt;/td&gt;&lt;td&gt;Turn on the models in Bedrock&lt;/td&gt;&lt;td&gt;Access can take a form submission, so start it before you need it&lt;/td&gt;&lt;/tr&gt;</w:t>
+        <w:t xml:space="preserve">            &lt;tr&gt;&lt;td&gt;3&lt;</w:t>
+      </w:r>
+      <w:r>
+        <w:rPr>
+          <w:rFonts w:ascii="Courier New" w:hAnsi="Courier New" w:cs="Courier New"/>
+        </w:rPr>
+        <w:t>/td&gt;&lt;td&gt;Turn on the models in Bedrock&lt;/td&gt;&lt;td&gt;Access can take a form submission, so start it before you need it&lt;/td&gt;&lt;/tr&gt;</w:t>
       </w:r>
     </w:p>
     <w:p>
@@ -21362,13 +21380,13 @@
         <w:rPr>
           <w:rFonts w:ascii="Courier New" w:hAnsi="Courier New" w:cs="Courier New"/>
         </w:rPr>
-        <w:t xml:space="preserve">            &lt;tr&gt;&lt;td&gt;7, 8&lt;/td&gt;&lt;td&gt;Aurora, and the application secret&lt;/td&gt;&lt;t</w:t>
-      </w:r>
-      <w:r>
-        <w:rPr>
-          <w:rFonts w:ascii="Courier New" w:hAnsi="Courier New" w:cs="Courier New"/>
-        </w:rPr>
-        <w:t>d&gt;Two database users: admin for setup, &lt;code&gt;hr_app&lt;/code&gt; for the app&lt;/td&gt;&lt;/tr&gt;</w:t>
+        <w:t xml:space="preserve">            &lt;tr&gt;&lt;td&gt;7, 8&lt;/td&gt;&lt;td&gt;Aurora, and the application secret&lt;/td&gt;&lt;td&gt;Two </w:t>
+      </w:r>
+      <w:r>
+        <w:rPr>
+          <w:rFonts w:ascii="Courier New" w:hAnsi="Courier New" w:cs="Courier New"/>
+        </w:rPr>
+        <w:t>database users: admin for setup, &lt;code&gt;hr_app&lt;/code&gt; for the app&lt;/td&gt;&lt;/tr&gt;</w:t>
       </w:r>
     </w:p>
     <w:p>
@@ -21410,13 +21428,13 @@
         <w:rPr>
           <w:rFonts w:ascii="Courier New" w:hAnsi="Courier New" w:cs="Courier New"/>
         </w:rPr>
-        <w:t xml:space="preserve">            &lt;tr&gt;&lt;td&gt;12, 13&lt;/td&gt;&lt;td&gt;IAM roles, then the four functions&lt;/td&gt;&lt;td&gt;One role per function, so the chat function cannot write the index&lt;/t</w:t>
-      </w:r>
-      <w:r>
-        <w:rPr>
-          <w:rFonts w:ascii="Courier New" w:hAnsi="Courier New" w:cs="Courier New"/>
-        </w:rPr>
-        <w:t>d&gt;&lt;/tr&gt;</w:t>
+        <w:t xml:space="preserve">            &lt;tr&gt;&lt;td&gt;12, 13&lt;/td&gt;&lt;td&gt;IAM roles, then the four functions&lt;/td&gt;&lt;td&gt;One role per function, so the chat function cannot write the index&lt;/td&gt;&lt;/tr</w:t>
+      </w:r>
+      <w:r>
+        <w:rPr>
+          <w:rFonts w:ascii="Courier New" w:hAnsi="Courier New" w:cs="Courier New"/>
+        </w:rPr>
+        <w:t>&gt;</w:t>
       </w:r>
     </w:p>
     <w:p>
@@ -21515,13 +21533,13 @@
         <w:rPr>
           <w:rFonts w:ascii="Courier New" w:hAnsi="Courier New" w:cs="Courier New"/>
         </w:rPr>
-        <w:t xml:space="preserve">      &lt;div cl</w:t>
-      </w:r>
-      <w:r>
-        <w:rPr>
-          <w:rFonts w:ascii="Courier New" w:hAnsi="Courier New" w:cs="Courier New"/>
-        </w:rPr>
-        <w:t>ass="callout"&gt;</w:t>
+        <w:t xml:space="preserve">      &lt;div class="c</w:t>
+      </w:r>
+      <w:r>
+        <w:rPr>
+          <w:rFonts w:ascii="Courier New" w:hAnsi="Courier New" w:cs="Courier New"/>
+        </w:rPr>
+        <w:t>allout"&gt;</w:t>
       </w:r>
     </w:p>
     <w:p>
@@ -22076,7 +22094,7 @@
     <w:link w:val="PlainTextChar"/>
     <w:uiPriority w:val="99"/>
     <w:unhideWhenUsed/>
-    <w:rsid w:val="005D217E"/>
+    <w:rsid w:val="00807D54"/>
     <w:pPr>
       <w:spacing w:after="0" w:line="240" w:lineRule="auto"/>
     </w:pPr>
@@ -22091,7 +22109,7 @@
     <w:basedOn w:val="DefaultParagraphFont"/>
     <w:link w:val="PlainText"/>
     <w:uiPriority w:val="99"/>
-    <w:rsid w:val="005D217E"/>
+    <w:rsid w:val="00807D54"/>
     <w:rPr>
       <w:rFonts w:ascii="Consolas" w:hAnsi="Consolas"/>
       <w:sz w:val="21"/>

</xml_diff>

<commit_message>
Split sentences over 30 words
Found by a checker rather than by reading: several documents had drifted past
the length limit after edits, mostly in README and the notes, which had not been
re-measured since they were written.
</commit_message>
<xml_diff>
--- a/docs/northwind-hr-on-aws.docx
+++ b/docs/northwind-hr-on-aws.docx
@@ -14442,7 +14442,7 @@
         <w:rPr>
           <w:rFonts w:ascii="Courier New" w:hAnsi="Courier New" w:cs="Courier New"/>
         </w:rPr>
-        <w:t xml:space="preserve">        &lt;p&gt;&lt;strong&gt;The named fact is the useful part.&lt;/strong&gt; It tells you whether to look at</w:t>
+        <w:t xml:space="preserve">        &lt;p&gt;&lt;strong&gt;Read the named fact.&lt;/strong&gt; It tells you whether to look at</w:t>
       </w:r>
     </w:p>
     <w:p>
@@ -14470,13 +14470,13 @@
         <w:rPr>
           <w:rFonts w:ascii="Courier New" w:hAnsi="Courier New" w:cs="Courier New"/>
         </w:rPr>
-        <w:t xml:space="preserve">        &lt;p&gt;Temperature is s</w:t>
-      </w:r>
-      <w:r>
-        <w:rPr>
-          <w:rFonts w:ascii="Courier New" w:hAnsi="Courier New" w:cs="Courier New"/>
-        </w:rPr>
-        <w:t>et to 0 so two runs can be compared. A test that gives a different</w:t>
+        <w:t xml:space="preserve">        &lt;p&gt;Temperature is set to 0 so two</w:t>
+      </w:r>
+      <w:r>
+        <w:rPr>
+          <w:rFonts w:ascii="Courier New" w:hAnsi="Courier New" w:cs="Courier New"/>
+        </w:rPr>
+        <w:t xml:space="preserve"> runs can be compared. A test that gives a different</w:t>
       </w:r>
     </w:p>
     <w:p>
@@ -14568,13 +14568,13 @@
         <w:rPr>
           <w:rFonts w:ascii="Courier New" w:hAnsi="Courier New" w:cs="Courier New"/>
         </w:rPr>
-        <w:t xml:space="preserve">  --cli-binary-format raw-in-base64-out --payload '{"s</w:t>
-      </w:r>
-      <w:r>
-        <w:rPr>
-          <w:rFonts w:ascii="Courier New" w:hAnsi="Courier New" w:cs="Courier New"/>
-        </w:rPr>
-        <w:t>imilarity_report": true}' report.json</w:t>
+        <w:t xml:space="preserve">  --cli-binary-format raw-in-base64-out --payload '{"similarity_repo</w:t>
+      </w:r>
+      <w:r>
+        <w:rPr>
+          <w:rFonts w:ascii="Courier New" w:hAnsi="Courier New" w:cs="Courier New"/>
+        </w:rPr>
+        <w:t>rt": true}' report.json</w:t>
       </w:r>
     </w:p>
     <w:p>
@@ -14686,13 +14686,13 @@
         <w:rPr>
           <w:rFonts w:ascii="Courier New" w:hAnsi="Courier New" w:cs="Courier New"/>
         </w:rPr>
-        <w:t xml:space="preserve">        &lt;p&gt;Set &lt;code&gt;min_best_similarity&lt;/co</w:t>
-      </w:r>
-      <w:r>
-        <w:rPr>
-          <w:rFonts w:ascii="Courier New" w:hAnsi="Courier New" w:cs="Courier New"/>
-        </w:rPr>
-        <w:t>de&gt; in &lt;code&gt;terraform.tfvars&lt;/code&gt; to a value</w:t>
+        <w:t xml:space="preserve">        &lt;p&gt;Set &lt;code&gt;min_best_similarity&lt;/code&gt; in &lt;code&gt;t</w:t>
+      </w:r>
+      <w:r>
+        <w:rPr>
+          <w:rFonts w:ascii="Courier New" w:hAnsi="Courier New" w:cs="Courier New"/>
+        </w:rPr>
+        <w:t>erraform.tfvars&lt;/code&gt; to a value</w:t>
       </w:r>
     </w:p>
     <w:p>
@@ -14798,13 +14798,13 @@
         <w:rPr>
           <w:rFonts w:ascii="Courier New" w:hAnsi="Courier New" w:cs="Courier New"/>
         </w:rPr>
-        <w:t xml:space="preserve">    </w:t>
-      </w:r>
-      <w:r>
-        <w:rPr>
-          <w:rFonts w:ascii="Courier New" w:hAnsi="Courier New" w:cs="Courier New"/>
-        </w:rPr>
-        <w:t xml:space="preserve">    &lt;p&gt;Two current documents with the same title is not always wrong, but it always needs</w:t>
+        <w:t xml:space="preserve">        &lt;p&gt;Two cur</w:t>
+      </w:r>
+      <w:r>
+        <w:rPr>
+          <w:rFonts w:ascii="Courier New" w:hAnsi="Courier New" w:cs="Courier New"/>
+        </w:rPr>
+        <w:t>rent documents with the same title is not always wrong, but it always needs</w:t>
       </w:r>
     </w:p>
     <w:p>
@@ -14903,13 +14903,13 @@
         <w:rPr>
           <w:rFonts w:ascii="Courier New" w:hAnsi="Courier New" w:cs="Courier New"/>
         </w:rPr>
-        <w:t xml:space="preserve">        &lt;p&gt;Run it here and you get one pair, the expense </w:t>
-      </w:r>
-      <w:r>
-        <w:rPr>
-          <w:rFonts w:ascii="Courier New" w:hAnsi="Courier New" w:cs="Courier New"/>
-        </w:rPr>
-        <w:t>policy, where the two documents cover</w:t>
+        <w:t xml:space="preserve">        &lt;p&gt;Run it here and you get one pair, the expense policy, where </w:t>
+      </w:r>
+      <w:r>
+        <w:rPr>
+          <w:rFonts w:ascii="Courier New" w:hAnsi="Courier New" w:cs="Courier New"/>
+        </w:rPr>
+        <w:t>the two documents cover</w:t>
       </w:r>
     </w:p>
     <w:p>
@@ -15071,7 +15071,13 @@
         <w:rPr>
           <w:rFonts w:ascii="Courier New" w:hAnsi="Courier New" w:cs="Courier New"/>
         </w:rPr>
-        <w:t xml:space="preserve">        Converse shape, so the same half finished conversation can continue on a different</w:t>
+        <w:t xml:space="preserve">        Conve</w:t>
+      </w:r>
+      <w:r>
+        <w:rPr>
+          <w:rFonts w:ascii="Courier New" w:hAnsi="Courier New" w:cs="Courier New"/>
+        </w:rPr>
+        <w:t>rse shape, so the same half finished conversation can continue on a different</w:t>
       </w:r>
     </w:p>
     <w:p>
@@ -15183,13 +15189,13 @@
         <w:rPr>
           <w:rFonts w:ascii="Courier New" w:hAnsi="Courier New" w:cs="Courier New"/>
         </w:rPr>
-        <w:t xml:space="preserve">            &lt;tr&gt;&lt;td&gt;&lt;code&gt;chat_model_id&lt;/code&gt;&lt;/td&gt;&lt;td&gt;&lt;code&gt;amazon.nova-pro-v1:0&lt;/code&gt;&lt;/td&gt;&lt;td&gt;Needs no access request. Point it at a Claude inference profile once t</w:t>
-      </w:r>
-      <w:r>
-        <w:rPr>
-          <w:rFonts w:ascii="Courier New" w:hAnsi="Courier New" w:cs="Courier New"/>
-        </w:rPr>
-        <w:t>he use case form is approved&lt;/td&gt;&lt;/tr&gt;</w:t>
+        <w:t xml:space="preserve">            &lt;tr&gt;&lt;td&gt;&lt;code&gt;chat_model_id&lt;/code&gt;&lt;/td&gt;&lt;td&gt;&lt;code&gt;amazon.nova-pro-v1:0&lt;/code&gt;&lt;/td&gt;&lt;td&gt;Needs no access request. Point it at a Claude inference profile once the use case fo</w:t>
+      </w:r>
+      <w:r>
+        <w:rPr>
+          <w:rFonts w:ascii="Courier New" w:hAnsi="Courier New" w:cs="Courier New"/>
+        </w:rPr>
+        <w:t>rm is approved&lt;/td&gt;&lt;/tr&gt;</w:t>
       </w:r>
     </w:p>
     <w:p>
@@ -15301,13 +15307,13 @@
         <w:rPr>
           <w:rFonts w:ascii="Courier New" w:hAnsi="Courier New" w:cs="Courier New"/>
         </w:rPr>
-        <w:t xml:space="preserve">    </w:t>
-      </w:r>
-      <w:r>
-        <w:rPr>
-          <w:rFonts w:ascii="Courier New" w:hAnsi="Courier New" w:cs="Courier New"/>
-        </w:rPr>
-        <w:t xml:space="preserve">    whole budget including every tool call. Left on its defaults the AWS SDK retried a</w:t>
+        <w:t xml:space="preserve">        whole budg</w:t>
+      </w:r>
+      <w:r>
+        <w:rPr>
+          <w:rFonts w:ascii="Courier New" w:hAnsi="Courier New" w:cs="Courier New"/>
+        </w:rPr>
+        <w:t>et including every tool call. Left on its defaults the AWS SDK retried a</w:t>
       </w:r>
     </w:p>
     <w:p>
@@ -15392,13 +15398,13 @@
         <w:rPr>
           <w:rFonts w:ascii="Courier New" w:hAnsi="Courier New" w:cs="Courier New"/>
         </w:rPr>
-        <w:t xml:space="preserve">        in. Same test after</w:t>
-      </w:r>
-      <w:r>
-        <w:rPr>
-          <w:rFonts w:ascii="Courier New" w:hAnsi="Courier New" w:cs="Courier New"/>
-        </w:rPr>
-        <w:t>wards: &lt;strong&gt;6 seconds and a correct answer&lt;/strong&gt;, with a</w:t>
+        <w:t xml:space="preserve">        in. Same test afterwards: &lt;strong</w:t>
+      </w:r>
+      <w:r>
+        <w:rPr>
+          <w:rFonts w:ascii="Courier New" w:hAnsi="Courier New" w:cs="Courier New"/>
+        </w:rPr>
+        <w:t>&gt;6 seconds and a correct answer&lt;/strong&gt;, with a</w:t>
       </w:r>
     </w:p>
     <w:p>
@@ -15560,13 +15566,13 @@
         <w:rPr>
           <w:rFonts w:ascii="Courier New" w:hAnsi="Courier New" w:cs="Courier New"/>
         </w:rPr>
-        <w:t xml:space="preserve">        &lt;</w:t>
-      </w:r>
-      <w:r>
-        <w:rPr>
-          <w:rFonts w:ascii="Courier New" w:hAnsi="Courier New" w:cs="Courier New"/>
-        </w:rPr>
-        <w:t>p&gt;One per function, plus the API. Retention is 14 days, set in Terraform.&lt;/p&gt;</w:t>
+        <w:t xml:space="preserve">        &lt;p&gt;One per func</w:t>
+      </w:r>
+      <w:r>
+        <w:rPr>
+          <w:rFonts w:ascii="Courier New" w:hAnsi="Courier New" w:cs="Courier New"/>
+        </w:rPr>
+        <w:t>tion, plus the API. Retention is 14 days, set in Terraform.&lt;/p&gt;</w:t>
       </w:r>
     </w:p>
     <w:p>
@@ -15644,27 +15650,27 @@
         <w:rPr>
           <w:rFonts w:ascii="Courier New" w:hAnsi="Courier New" w:cs="Courier New"/>
         </w:rPr>
-        <w:t xml:space="preserve">        learn is &lt;code&gt;REPORT&lt;/code&gt; at the end of each invocation: it carries the duration</w:t>
-      </w:r>
-      <w:r>
-        <w:rPr>
-          <w:rFonts w:ascii="Courier New" w:hAnsi="Courier New" w:cs="Courier New"/>
-        </w:rPr>
-        <w:t>,</w:t>
-      </w:r>
-    </w:p>
-    <w:p>
-      <w:pPr>
-        <w:pStyle w:val="PlainText"/>
-        <w:rPr>
-          <w:rFonts w:ascii="Courier New" w:hAnsi="Courier New" w:cs="Courier New"/>
-        </w:rPr>
-      </w:pPr>
-      <w:r>
-        <w:rPr>
-          <w:rFonts w:ascii="Courier New" w:hAnsi="Courier New" w:cs="Courier New"/>
-        </w:rPr>
-        <w:t xml:space="preserve">        the memory used and the billed time. &lt;code&gt;Duration&lt;/code&gt; is what the p90 alarm</w:t>
+        <w:t xml:space="preserve">        learn is &lt;code&gt;REPORT&lt;/code&gt; at the end of each invocation: it carries the duration,</w:t>
+      </w:r>
+    </w:p>
+    <w:p>
+      <w:pPr>
+        <w:pStyle w:val="PlainText"/>
+        <w:rPr>
+          <w:rFonts w:ascii="Courier New" w:hAnsi="Courier New" w:cs="Courier New"/>
+        </w:rPr>
+      </w:pPr>
+      <w:r>
+        <w:rPr>
+          <w:rFonts w:ascii="Courier New" w:hAnsi="Courier New" w:cs="Courier New"/>
+        </w:rPr>
+        <w:t xml:space="preserve">        the </w:t>
+      </w:r>
+      <w:r>
+        <w:rPr>
+          <w:rFonts w:ascii="Courier New" w:hAnsi="Courier New" w:cs="Courier New"/>
+        </w:rPr>
+        <w:t>memory used and the billed time. &lt;code&gt;Duration&lt;/code&gt; is what the p90 alarm</w:t>
       </w:r>
     </w:p>
     <w:p>
@@ -15748,13 +15754,13 @@
         <w:rPr>
           <w:rFonts w:ascii="Courier New" w:hAnsi="Courier New" w:cs="Courier New"/>
         </w:rPr>
-        <w:t xml:space="preserve">        &lt;pre&gt;&lt;code&gt;aws logs tail /aws/apigateway/</w:t>
-      </w:r>
-      <w:r>
-        <w:rPr>
-          <w:rFonts w:ascii="Courier New" w:hAnsi="Courier New" w:cs="Courier New"/>
-        </w:rPr>
-        <w:t>northwind-hr-api --since 30m --format short&lt;/code&gt;&lt;/pre&gt;</w:t>
+        <w:t xml:space="preserve">        &lt;pre&gt;&lt;code&gt;aws logs tail /aws/apigateway/northwind-hr-a</w:t>
+      </w:r>
+      <w:r>
+        <w:rPr>
+          <w:rFonts w:ascii="Courier New" w:hAnsi="Courier New" w:cs="Courier New"/>
+        </w:rPr>
+        <w:t>pi --since 30m --format short&lt;/code&gt;&lt;/pre&gt;</w:t>
       </w:r>
     </w:p>
     <w:p>
@@ -15860,13 +15866,13 @@
         <w:rPr>
           <w:rFonts w:ascii="Courier New" w:hAnsi="Courier New" w:cs="Courier New"/>
         </w:rPr>
-        <w:t xml:space="preserve">     </w:t>
-      </w:r>
-      <w:r>
-        <w:rPr>
-          <w:rFonts w:ascii="Courier New" w:hAnsi="Courier New" w:cs="Courier New"/>
-        </w:rPr>
-        <w:t xml:space="preserve">     &lt;p&gt;The reason to declare them at all: &lt;strong&gt;if you do not, Lambda creates the log</w:t>
+        <w:t xml:space="preserve">          &lt;p&gt;The re</w:t>
+      </w:r>
+      <w:r>
+        <w:rPr>
+          <w:rFonts w:ascii="Courier New" w:hAnsi="Courier New" w:cs="Courier New"/>
+        </w:rPr>
+        <w:t>ason to declare them at all: &lt;strong&gt;if you do not, Lambda creates the log</w:t>
       </w:r>
     </w:p>
     <w:p>
@@ -15973,13 +15979,13 @@
         <w:rPr>
           <w:rFonts w:ascii="Courier New" w:hAnsi="Courier New" w:cs="Courier New"/>
         </w:rPr>
-        <w:t xml:space="preserve">        &lt;pre&gt;&lt;code&gt;aws cloudwatch list-metrics --n</w:t>
-      </w:r>
-      <w:r>
-        <w:rPr>
-          <w:rFonts w:ascii="Courier New" w:hAnsi="Courier New" w:cs="Courier New"/>
-        </w:rPr>
-        <w:t>amespace AWS/Bedrock \</w:t>
+        <w:t xml:space="preserve">        &lt;pre&gt;&lt;code&gt;aws cloudwatch list-metrics --namespace AWS/B</w:t>
+      </w:r>
+      <w:r>
+        <w:rPr>
+          <w:rFonts w:ascii="Courier New" w:hAnsi="Courier New" w:cs="Courier New"/>
+        </w:rPr>
+        <w:t>edrock \</w:t>
       </w:r>
     </w:p>
     <w:p>
@@ -16091,27 +16097,27 @@
         <w:rPr>
           <w:rFonts w:ascii="Courier New" w:hAnsi="Courier New" w:cs="Courier New"/>
         </w:rPr>
-        <w:t xml:space="preserve">      &lt;div class="table-</w:t>
-      </w:r>
-      <w:r>
-        <w:rPr>
-          <w:rFonts w:ascii="Courier New" w:hAnsi="Courier New" w:cs="Courier New"/>
-        </w:rPr>
-        <w:t>wrap"&gt;</w:t>
-      </w:r>
-    </w:p>
-    <w:p>
-      <w:pPr>
-        <w:pStyle w:val="PlainText"/>
-        <w:rPr>
-          <w:rFonts w:ascii="Courier New" w:hAnsi="Courier New" w:cs="Courier New"/>
-        </w:rPr>
-      </w:pPr>
-      <w:r>
-        <w:rPr>
-          <w:rFonts w:ascii="Courier New" w:hAnsi="Courier New" w:cs="Courier New"/>
-        </w:rPr>
-        <w:t xml:space="preserve">        &lt;table&gt;</w:t>
+        <w:t xml:space="preserve">      &lt;div class="table-wrap"&gt;</w:t>
+      </w:r>
+    </w:p>
+    <w:p>
+      <w:pPr>
+        <w:pStyle w:val="PlainText"/>
+        <w:rPr>
+          <w:rFonts w:ascii="Courier New" w:hAnsi="Courier New" w:cs="Courier New"/>
+        </w:rPr>
+      </w:pPr>
+      <w:r>
+        <w:rPr>
+          <w:rFonts w:ascii="Courier New" w:hAnsi="Courier New" w:cs="Courier New"/>
+        </w:rPr>
+        <w:t xml:space="preserve">       </w:t>
+      </w:r>
+      <w:r>
+        <w:rPr>
+          <w:rFonts w:ascii="Courier New" w:hAnsi="Courier New" w:cs="Courier New"/>
+        </w:rPr>
+        <w:t xml:space="preserve"> &lt;table&gt;</w:t>
       </w:r>
     </w:p>
     <w:p>
@@ -16167,27 +16173,27 @@
         <w:rPr>
           <w:rFonts w:ascii="Courier New" w:hAnsi="Courier New" w:cs="Courier New"/>
         </w:rPr>
-        <w:t xml:space="preserve">            &lt;tr&gt;&lt;td&gt;Nova Lite (fallback)&lt;/td&gt;&lt;td class="num"&gt;9&lt;/td&gt;&lt;td class="num"&gt;5,388&lt;/td&gt;&lt;td class="num"&gt;395&lt;/td&gt;&lt;td class="num"&gt;502 ms&lt;/td&gt;&lt;/t</w:t>
-      </w:r>
-      <w:r>
-        <w:rPr>
-          <w:rFonts w:ascii="Courier New" w:hAnsi="Courier New" w:cs="Courier New"/>
-        </w:rPr>
-        <w:t>r&gt;</w:t>
-      </w:r>
-    </w:p>
-    <w:p>
-      <w:pPr>
-        <w:pStyle w:val="PlainText"/>
-        <w:rPr>
-          <w:rFonts w:ascii="Courier New" w:hAnsi="Courier New" w:cs="Courier New"/>
-        </w:rPr>
-      </w:pPr>
-      <w:r>
-        <w:rPr>
-          <w:rFonts w:ascii="Courier New" w:hAnsi="Courier New" w:cs="Courier New"/>
-        </w:rPr>
-        <w:t xml:space="preserve">            &lt;tr&gt;&lt;td&gt;Titan Embeddings V2&lt;/td&gt;&lt;td class="num"&gt;1,254&lt;/td&gt;&lt;td class="num"&gt;87,862&lt;/td&gt;&lt;td class="num"&gt;n/a&lt;/td&gt;&lt;td class="num"&gt;105 ms&lt;/td&gt;&lt;/tr&gt;</w:t>
+        <w:t xml:space="preserve">            &lt;tr&gt;&lt;td&gt;Nova Lite (fallback)&lt;/td&gt;&lt;td class="num"&gt;9&lt;/td&gt;&lt;td class="num"&gt;5,388&lt;/td&gt;&lt;td class="num"&gt;395&lt;/td&gt;&lt;td class="num"&gt;502 ms&lt;/td&gt;&lt;/tr&gt;</w:t>
+      </w:r>
+    </w:p>
+    <w:p>
+      <w:pPr>
+        <w:pStyle w:val="PlainText"/>
+        <w:rPr>
+          <w:rFonts w:ascii="Courier New" w:hAnsi="Courier New" w:cs="Courier New"/>
+        </w:rPr>
+      </w:pPr>
+      <w:r>
+        <w:rPr>
+          <w:rFonts w:ascii="Courier New" w:hAnsi="Courier New" w:cs="Courier New"/>
+        </w:rPr>
+        <w:t xml:space="preserve">           </w:t>
+      </w:r>
+      <w:r>
+        <w:rPr>
+          <w:rFonts w:ascii="Courier New" w:hAnsi="Courier New" w:cs="Courier New"/>
+        </w:rPr>
+        <w:t xml:space="preserve"> &lt;tr&gt;&lt;td&gt;Titan Embeddings V2&lt;/td&gt;&lt;td class="num"&gt;1,254&lt;/td&gt;&lt;td class="num"&gt;87,862&lt;/td&gt;&lt;td class="num"&gt;n/a&lt;/td&gt;&lt;td class="num"&gt;105 ms&lt;/td&gt;&lt;/tr&gt;</w:t>
       </w:r>
     </w:p>
     <w:p>
@@ -16285,13 +16291,13 @@
         <w:rPr>
           <w:rFonts w:ascii="Courier New" w:hAnsi="Courier New" w:cs="Courier New"/>
         </w:rPr>
-        <w:t xml:space="preserve">        failed attempts are still there, recorded as </w:t>
-      </w:r>
-      <w:r>
-        <w:rPr>
-          <w:rFonts w:ascii="Courier New" w:hAnsi="Courier New" w:cs="Courier New"/>
-        </w:rPr>
-        <w:t>&lt;code&gt;InvocationClientErrors&lt;/code&gt; with no</w:t>
+        <w:t xml:space="preserve">        failed attempts are still there, recorded as &lt;code&gt;Invocati</w:t>
+      </w:r>
+      <w:r>
+        <w:rPr>
+          <w:rFonts w:ascii="Courier New" w:hAnsi="Courier New" w:cs="Courier New"/>
+        </w:rPr>
+        <w:t>onClientErrors&lt;/code&gt; with no</w:t>
       </w:r>
     </w:p>
     <w:p>
@@ -16398,13 +16404,13 @@
         <w:rPr>
           <w:rFonts w:ascii="Courier New" w:hAnsi="Courier New" w:cs="Courier New"/>
         </w:rPr>
-        <w:t xml:space="preserve">        $0.00</w:t>
-      </w:r>
-      <w:r>
-        <w:rPr>
-          <w:rFonts w:ascii="Courier New" w:hAnsi="Courier New" w:cs="Courier New"/>
-        </w:rPr>
-        <w:t>09. &lt;strong&gt;The whole lab cost about 14 cents in model usage.&lt;/strong&gt; That is</w:t>
+        <w:t xml:space="preserve">        $0.0009. &lt;strong&gt;Th</w:t>
+      </w:r>
+      <w:r>
+        <w:rPr>
+          <w:rFonts w:ascii="Courier New" w:hAnsi="Courier New" w:cs="Courier New"/>
+        </w:rPr>
+        <w:t>e whole lab cost about 14 cents in model usage.&lt;/strong&gt; That is</w:t>
       </w:r>
     </w:p>
     <w:p>
@@ -16502,13 +16508,13 @@
         <w:rPr>
           <w:rFonts w:ascii="Courier New" w:hAnsi="Courier New" w:cs="Courier New"/>
         </w:rPr>
-        <w:t xml:space="preserve">          chunks instead of 4 doubles t</w:t>
-      </w:r>
-      <w:r>
-        <w:rPr>
-          <w:rFonts w:ascii="Courier New" w:hAnsi="Courier New" w:cs="Courier New"/>
-        </w:rPr>
-        <w:t>he cost and often does not improve the answer.&lt;/li&gt;</w:t>
+        <w:t xml:space="preserve">          chunks instead of 4 doubles the cost and of</w:t>
+      </w:r>
+      <w:r>
+        <w:rPr>
+          <w:rFonts w:ascii="Courier New" w:hAnsi="Courier New" w:cs="Courier New"/>
+        </w:rPr>
+        <w:t>ten does not improve the answer.&lt;/li&gt;</w:t>
       </w:r>
     </w:p>
     <w:p>
@@ -16614,13 +16620,7 @@
         <w:rPr>
           <w:rFonts w:ascii="Courier New" w:hAnsi="Courier New" w:cs="Courier New"/>
         </w:rPr>
-        <w:t xml:space="preserve">        &lt;h3&gt;What CloudWatch cannot </w:t>
-      </w:r>
-      <w:r>
-        <w:rPr>
-          <w:rFonts w:ascii="Courier New" w:hAnsi="Courier New" w:cs="Courier New"/>
-        </w:rPr>
-        <w:t>tell you&lt;/h3&gt;</w:t>
+        <w:t xml:space="preserve">        &lt;h3&gt;What CloudWatch cannot tell you&lt;/h3&gt;</w:t>
       </w:r>
     </w:p>
     <w:p>
@@ -16718,13 +16718,13 @@
         <w:rPr>
           <w:rFonts w:ascii="Courier New" w:hAnsi="Courier New" w:cs="Courier New"/>
         </w:rPr>
-        <w:t xml:space="preserve">        &lt;p&gt;&lt;strong&gt;Your platform gives </w:t>
-      </w:r>
-      <w:r>
-        <w:rPr>
-          <w:rFonts w:ascii="Courier New" w:hAnsi="Courier New" w:cs="Courier New"/>
-        </w:rPr>
-        <w:t>you infrastructure metrics. Product metrics you have</w:t>
+        <w:t xml:space="preserve">        &lt;p&gt;&lt;strong&gt;Your platform gives you infrastruc</w:t>
+      </w:r>
+      <w:r>
+        <w:rPr>
+          <w:rFonts w:ascii="Courier New" w:hAnsi="Courier New" w:cs="Courier New"/>
+        </w:rPr>
+        <w:t>ture metrics. Product metrics you have</w:t>
       </w:r>
     </w:p>
     <w:p>
@@ -16873,13 +16873,13 @@
         <w:rPr>
           <w:rFonts w:ascii="Courier New" w:hAnsi="Courier New" w:cs="Courier New"/>
         </w:rPr>
-        <w:t xml:space="preserve">            &lt;tr&gt;&lt;td&gt;&lt;code&gt;conversations&lt;/code&gt;&lt;/td</w:t>
-      </w:r>
-      <w:r>
-        <w:rPr>
-          <w:rFonts w:ascii="Courier New" w:hAnsi="Courier New" w:cs="Courier New"/>
-        </w:rPr>
-        <w:t>&gt;&lt;td&gt;One row per chat&lt;/td&gt;&lt;td&gt;Own rows only&lt;/td&gt;&lt;/tr&gt;</w:t>
+        <w:t xml:space="preserve">            &lt;tr&gt;&lt;td&gt;&lt;code&gt;conversations&lt;/code&gt;&lt;/td&gt;&lt;td&gt;One row p</w:t>
+      </w:r>
+      <w:r>
+        <w:rPr>
+          <w:rFonts w:ascii="Courier New" w:hAnsi="Courier New" w:cs="Courier New"/>
+        </w:rPr>
+        <w:t>er chat&lt;/td&gt;&lt;td&gt;Own rows only&lt;/td&gt;&lt;/tr&gt;</w:t>
       </w:r>
     </w:p>
     <w:p>
@@ -16963,27 +16963,27 @@
         <w:rPr>
           <w:rFonts w:ascii="Courier New" w:hAnsi="Courier New" w:cs="Courier New"/>
         </w:rPr>
-        <w:t xml:space="preserve"> </w:t>
-      </w:r>
-      <w:r>
-        <w:rPr>
-          <w:rFonts w:ascii="Courier New" w:hAnsi="Courier New" w:cs="Courier New"/>
-        </w:rPr>
-        <w:t xml:space="preserve">     &lt;/div&gt;</w:t>
-      </w:r>
-    </w:p>
-    <w:p>
-      <w:pPr>
-        <w:pStyle w:val="PlainText"/>
-        <w:rPr>
-          <w:rFonts w:ascii="Courier New" w:hAnsi="Courier New" w:cs="Courier New"/>
-        </w:rPr>
-      </w:pPr>
-      <w:r>
-        <w:rPr>
-          <w:rFonts w:ascii="Courier New" w:hAnsi="Courier New" w:cs="Courier New"/>
-        </w:rPr>
-        <w:t xml:space="preserve">      &lt;div class="prose"&gt;</w:t>
+        <w:t xml:space="preserve">      &lt;/div&gt;</w:t>
+      </w:r>
+    </w:p>
+    <w:p>
+      <w:pPr>
+        <w:pStyle w:val="PlainText"/>
+        <w:rPr>
+          <w:rFonts w:ascii="Courier New" w:hAnsi="Courier New" w:cs="Courier New"/>
+        </w:rPr>
+      </w:pPr>
+      <w:r>
+        <w:rPr>
+          <w:rFonts w:ascii="Courier New" w:hAnsi="Courier New" w:cs="Courier New"/>
+        </w:rPr>
+        <w:t xml:space="preserve">  </w:t>
+      </w:r>
+      <w:r>
+        <w:rPr>
+          <w:rFonts w:ascii="Courier New" w:hAnsi="Courier New" w:cs="Courier New"/>
+        </w:rPr>
+        <w:t xml:space="preserve">    &lt;div class="prose"&gt;</w:t>
       </w:r>
     </w:p>
     <w:p>
@@ -17067,13 +17067,13 @@
         <w:rPr>
           <w:rFonts w:ascii="Courier New" w:hAnsi="Courier New" w:cs="Courier New"/>
         </w:rPr>
-        <w:t xml:space="preserve">        never has. A component that writes an audit trail should no</w:t>
-      </w:r>
-      <w:r>
-        <w:rPr>
-          <w:rFonts w:ascii="Courier New" w:hAnsi="Courier New" w:cs="Courier New"/>
-        </w:rPr>
-        <w:t>t be able to change it,</w:t>
+        <w:t xml:space="preserve">        never has. A component that writes an audit trail should not be able to c</w:t>
+      </w:r>
+      <w:r>
+        <w:rPr>
+          <w:rFonts w:ascii="Courier New" w:hAnsi="Courier New" w:cs="Courier New"/>
+        </w:rPr>
+        <w:t>hange it,</w:t>
       </w:r>
     </w:p>
     <w:p>
@@ -17165,27 +17165,27 @@
         <w:rPr>
           <w:rFonts w:ascii="Courier New" w:hAnsi="Courier New" w:cs="Courier New"/>
         </w:rPr>
-        <w:t xml:space="preserve">        &lt;p&gt;The evaluation set is not something you run when you remember. It is a gate. In a re</w:t>
-      </w:r>
-      <w:r>
-        <w:rPr>
-          <w:rFonts w:ascii="Courier New" w:hAnsi="Courier New" w:cs="Courier New"/>
-        </w:rPr>
-        <w:t>al</w:t>
-      </w:r>
-    </w:p>
-    <w:p>
-      <w:pPr>
-        <w:pStyle w:val="PlainText"/>
-        <w:rPr>
-          <w:rFonts w:ascii="Courier New" w:hAnsi="Courier New" w:cs="Courier New"/>
-        </w:rPr>
-      </w:pPr>
-      <w:r>
-        <w:rPr>
-          <w:rFonts w:ascii="Courier New" w:hAnsi="Courier New" w:cs="Courier New"/>
-        </w:rPr>
-        <w:t xml:space="preserve">        pipeline it runs after every change that could move an answer: code, prompt, model,</w:t>
+        <w:t xml:space="preserve">        &lt;p&gt;The evaluation set is not something you run when you remember. It is a gate. In a real</w:t>
+      </w:r>
+    </w:p>
+    <w:p>
+      <w:pPr>
+        <w:pStyle w:val="PlainText"/>
+        <w:rPr>
+          <w:rFonts w:ascii="Courier New" w:hAnsi="Courier New" w:cs="Courier New"/>
+        </w:rPr>
+      </w:pPr>
+      <w:r>
+        <w:rPr>
+          <w:rFonts w:ascii="Courier New" w:hAnsi="Courier New" w:cs="Courier New"/>
+        </w:rPr>
+        <w:t xml:space="preserve">        pip</w:t>
+      </w:r>
+      <w:r>
+        <w:rPr>
+          <w:rFonts w:ascii="Courier New" w:hAnsi="Courier New" w:cs="Courier New"/>
+        </w:rPr>
+        <w:t>eline it runs after every change that could move an answer: code, prompt, model,</w:t>
       </w:r>
     </w:p>
     <w:p>
@@ -17311,13 +17311,13 @@
         <w:rPr>
           <w:rFonts w:ascii="Courier New" w:hAnsi="Courier New" w:cs="Courier New"/>
         </w:rPr>
-        <w:t xml:space="preserve">        &lt;p&gt;Two gates,</w:t>
-      </w:r>
-      <w:r>
-        <w:rPr>
-          <w:rFonts w:ascii="Courier New" w:hAnsi="Courier New" w:cs="Courier New"/>
-        </w:rPr>
-        <w:t xml:space="preserve"> not one. A score that stays the same while two cases swap places is a</w:t>
+        <w:t xml:space="preserve">        &lt;p&gt;Two gates, not one. A sc</w:t>
+      </w:r>
+      <w:r>
+        <w:rPr>
+          <w:rFonts w:ascii="Courier New" w:hAnsi="Courier New" w:cs="Courier New"/>
+        </w:rPr>
+        <w:t>ore that stays the same while two cases swap places is a</w:t>
       </w:r>
     </w:p>
     <w:p>
@@ -17402,13 +17402,13 @@
         <w:rPr>
           <w:rFonts w:ascii="Courier New" w:hAnsi="Courier New" w:cs="Courier New"/>
         </w:rPr>
-        <w:t xml:space="preserve">        percent of the last run. That last one catches the fa</w:t>
-      </w:r>
-      <w:r>
-        <w:rPr>
-          <w:rFonts w:ascii="Courier New" w:hAnsi="Courier New" w:cs="Courier New"/>
-        </w:rPr>
-        <w:t>ilure nothing else does, where</w:t>
+        <w:t xml:space="preserve">        percent of the last run. That last one catches the failure nothing </w:t>
+      </w:r>
+      <w:r>
+        <w:rPr>
+          <w:rFonts w:ascii="Courier New" w:hAnsi="Courier New" w:cs="Courier New"/>
+        </w:rPr>
+        <w:t>else does, where</w:t>
       </w:r>
     </w:p>
     <w:p>
@@ -17550,13 +17550,13 @@
         <w:rPr>
           <w:rFonts w:ascii="Courier New" w:hAnsi="Courier New" w:cs="Courier New"/>
         </w:rPr>
-        <w:t>&lt;!-- ====</w:t>
-      </w:r>
-      <w:r>
-        <w:rPr>
-          <w:rFonts w:ascii="Courier New" w:hAnsi="Courier New" w:cs="Courier New"/>
-        </w:rPr>
-        <w:t>======================================================== --&gt;</w:t>
+        <w:t>&lt;!-- ==================</w:t>
+      </w:r>
+      <w:r>
+        <w:rPr>
+          <w:rFonts w:ascii="Courier New" w:hAnsi="Courier New" w:cs="Courier New"/>
+        </w:rPr>
+        <w:t>========================================== --&gt;</w:t>
       </w:r>
     </w:p>
     <w:p>
@@ -17640,13 +17640,13 @@
         <w:rPr>
           <w:rFonts w:ascii="Courier New" w:hAnsi="Courier New" w:cs="Courier New"/>
         </w:rPr>
-        <w:t xml:space="preserve">          &lt;li&gt;&lt;s</w:t>
-      </w:r>
-      <w:r>
-        <w:rPr>
-          <w:rFonts w:ascii="Courier New" w:hAnsi="Courier New" w:cs="Courier New"/>
-        </w:rPr>
-        <w:t>trong&gt;The model:&lt;/strong&gt; change &lt;code&gt;chat_model_id&lt;/code&gt; in &lt;code&gt;terraform.tfvars&lt;/code&gt; and apply. No code change, because every model is reached through the same Converse API.&lt;/li&gt;</w:t>
+        <w:t xml:space="preserve">          &lt;li&gt;&lt;strong&gt;The mode</w:t>
+      </w:r>
+      <w:r>
+        <w:rPr>
+          <w:rFonts w:ascii="Courier New" w:hAnsi="Courier New" w:cs="Courier New"/>
+        </w:rPr>
+        <w:t>l:&lt;/strong&gt; change &lt;code&gt;chat_model_id&lt;/code&gt; in &lt;code&gt;terraform.tfvars&lt;/code&gt; and apply. No code change, because every model is reached through the same Converse API.&lt;/li&gt;</w:t>
       </w:r>
     </w:p>
     <w:p>
@@ -17688,13 +17688,13 @@
         <w:rPr>
           <w:rFonts w:ascii="Courier New" w:hAnsi="Courier New" w:cs="Courier New"/>
         </w:rPr>
-        <w:t xml:space="preserve">          &lt;li&gt;&lt;strong&gt;The React app:&lt;/strong</w:t>
-      </w:r>
-      <w:r>
-        <w:rPr>
-          <w:rFonts w:ascii="Courier New" w:hAnsi="Courier New" w:cs="Courier New"/>
-        </w:rPr>
-        <w:t>&gt; &lt;code&gt;npm run build&lt;/code&gt;, &lt;code&gt;aws s3 sync&lt;/code&gt;, CloudFront invalidation (step 7).&lt;/li&gt;</w:t>
+        <w:t xml:space="preserve">          &lt;li&gt;&lt;strong&gt;The React app:&lt;/strong&gt; &lt;code&gt;npm ru</w:t>
+      </w:r>
+      <w:r>
+        <w:rPr>
+          <w:rFonts w:ascii="Courier New" w:hAnsi="Courier New" w:cs="Courier New"/>
+        </w:rPr>
+        <w:t>n build&lt;/code&gt;, &lt;code&gt;aws s3 sync&lt;/code&gt;, CloudFront invalidation (step 7).&lt;/li&gt;</w:t>
       </w:r>
     </w:p>
     <w:p>
@@ -17829,13 +17829,13 @@
           <w:rFonts w:ascii="Courier New" w:hAnsi="Courier New" w:cs="Courier New"/>
         </w:rPr>
         <w:lastRenderedPageBreak/>
-        <w:t xml:space="preserve">      </w:t>
-      </w:r>
-      <w:r>
-        <w:rPr>
-          <w:rFonts w:ascii="Courier New" w:hAnsi="Courier New" w:cs="Courier New"/>
-        </w:rPr>
-        <w:t xml:space="preserve">  &lt;p&gt;Approximate us-east-1 list prices at the time of writing, for a class demo with little traffic. Check the AWS Pricing Calculator before you deploy.&lt;/p&gt;</w:t>
+        <w:t xml:space="preserve">        &lt;p&gt;Approxima</w:t>
+      </w:r>
+      <w:r>
+        <w:rPr>
+          <w:rFonts w:ascii="Courier New" w:hAnsi="Courier New" w:cs="Courier New"/>
+        </w:rPr>
+        <w:t>te us-east-1 list prices at the time of writing, for a class demo with little traffic. Check the AWS Pricing Calculator before you deploy.&lt;/p&gt;</w:t>
       </w:r>
     </w:p>
     <w:p>
@@ -17919,13 +17919,13 @@
         <w:rPr>
           <w:rFonts w:ascii="Courier New" w:hAnsi="Courier New" w:cs="Courier New"/>
         </w:rPr>
-        <w:t xml:space="preserve">            &lt;tr&gt;&lt;td&gt;OpenSearch Serverless&lt;/td&gt;&lt;td&gt;Minimum capacity while the collection exists: 0.5 indexing + 0.5 search OCU (OpenSearch Compute Units, the unit it bill</w:t>
-      </w:r>
-      <w:r>
-        <w:rPr>
-          <w:rFonts w:ascii="Courier New" w:hAnsi="Courier New" w:cs="Courier New"/>
-        </w:rPr>
-        <w:t>s in) with standby replicas off, at about $0.24 per OCU-hour&lt;/td&gt;&lt;td class="num"&gt;≈ $175&lt;/td&gt;&lt;/tr&gt;</w:t>
+        <w:t xml:space="preserve">            &lt;tr&gt;&lt;td&gt;OpenSearch Serverless&lt;/td&gt;&lt;td&gt;Minimum capacity while the collection exists: 0.5 indexing + 0.5 search OCU (OpenSearch Compute Units, the unit it bills in) with sta</w:t>
+      </w:r>
+      <w:r>
+        <w:rPr>
+          <w:rFonts w:ascii="Courier New" w:hAnsi="Courier New" w:cs="Courier New"/>
+        </w:rPr>
+        <w:t>ndby replicas off, at about $0.24 per OCU-hour&lt;/td&gt;&lt;td class="num"&gt;≈ $175&lt;/td&gt;&lt;/tr&gt;</w:t>
       </w:r>
     </w:p>
     <w:p>
@@ -17967,13 +17967,13 @@
         <w:rPr>
           <w:rFonts w:ascii="Courier New" w:hAnsi="Courier New" w:cs="Courier New"/>
         </w:rPr>
-        <w:t xml:space="preserve">            &lt;tr&gt;&lt;td&gt;Aurora Serverless v2&lt;/td&gt;&lt;td&gt;Storage while paused; about $0.12 per ACU-hour per instance </w:t>
-      </w:r>
-      <w:r>
-        <w:rPr>
-          <w:rFonts w:ascii="Courier New" w:hAnsi="Courier New" w:cs="Courier New"/>
-        </w:rPr>
-        <w:t>while active&lt;/td&gt;&lt;td class="num"&gt;$1–$20&lt;/td&gt;&lt;/tr&gt;</w:t>
+        <w:t xml:space="preserve">            &lt;tr&gt;&lt;td&gt;Aurora Serverless v2&lt;/td&gt;&lt;td&gt;Storage while paused; about $0.12 per ACU-hour per instance while active&lt;/</w:t>
+      </w:r>
+      <w:r>
+        <w:rPr>
+          <w:rFonts w:ascii="Courier New" w:hAnsi="Courier New" w:cs="Courier New"/>
+        </w:rPr>
+        <w:t>td&gt;&lt;td class="num"&gt;$1–$20&lt;/td&gt;&lt;/tr&gt;</w:t>
       </w:r>
     </w:p>
     <w:p>
@@ -18029,13 +18029,13 @@
         <w:rPr>
           <w:rFonts w:ascii="Courier New" w:hAnsi="Courier New" w:cs="Courier New"/>
         </w:rPr>
-        <w:t xml:space="preserve">            &lt;tr&gt;&lt;td&gt;&lt;strong&gt;Total&lt;/strong&gt;&lt;/td&gt;&lt;td&gt;Ab</w:t>
-      </w:r>
-      <w:r>
-        <w:rPr>
-          <w:rFonts w:ascii="Courier New" w:hAnsi="Courier New" w:cs="Courier New"/>
-        </w:rPr>
-        <w:t>out $7–8 a day, most of it OpenSearch Serverless&lt;/td&gt;&lt;td class="num"&gt;&lt;strong&gt;≈ $220–245&lt;/strong&gt;&lt;/td&gt;&lt;/tr&gt;</w:t>
+        <w:t xml:space="preserve">            &lt;tr&gt;&lt;td&gt;&lt;strong&gt;Total&lt;/strong&gt;&lt;/td&gt;&lt;td&gt;About $7–8 a day</w:t>
+      </w:r>
+      <w:r>
+        <w:rPr>
+          <w:rFonts w:ascii="Courier New" w:hAnsi="Courier New" w:cs="Courier New"/>
+        </w:rPr>
+        <w:t>, most of it OpenSearch Serverless&lt;/td&gt;&lt;td class="num"&gt;&lt;strong&gt;≈ $220–245&lt;/strong&gt;&lt;/td&gt;&lt;/tr&gt;</w:t>
       </w:r>
     </w:p>
     <w:p>
@@ -18119,13 +18119,13 @@
         <w:rPr>
           <w:rFonts w:ascii="Courier New" w:hAnsi="Courier New" w:cs="Courier New"/>
         </w:rPr>
-        <w:t xml:space="preserve">        &lt;p&gt;This architecture meets it only if you &lt;strong&gt;destroy it between sessions&lt;/strong&gt;: about 10 running days a month. Terraform makes that practical: apply takes 30 minutes, destroy about 20. To run it longer for less, replace OpenSearch Serverless wi</w:t>
-      </w:r>
-      <w:r>
-        <w:rPr>
-          <w:rFonts w:ascii="Courier New" w:hAnsi="Courier New" w:cs="Courier New"/>
-        </w:rPr>
-        <w:t>th an OpenSearch Service domain on a small instance, or with pgvector in the Aurora database you already have. Both change &lt;code&gt;search_index.py&lt;/code&gt; and &lt;code&gt;opensearch.tf&lt;/code&gt; only.&lt;/p&gt;</w:t>
+        <w:t xml:space="preserve">        &lt;p&gt;This architecture meets it only if you &lt;strong&gt;destroy it between sessions&lt;/strong&gt;: about 10 running days a month. Terraform makes that practical: apply takes 30 minutes, destroy about 20. To run it longer for less, replace OpenSearch Serverless with an OpenSear</w:t>
+      </w:r>
+      <w:r>
+        <w:rPr>
+          <w:rFonts w:ascii="Courier New" w:hAnsi="Courier New" w:cs="Courier New"/>
+        </w:rPr>
+        <w:t>ch Service domain on a small instance, or with pgvector in the Aurora database you already have. Both change &lt;code&gt;search_index.py&lt;/code&gt; and &lt;code&gt;opensearch.tf&lt;/code&gt; only.&lt;/p&gt;</w:t>
       </w:r>
     </w:p>
     <w:p>
@@ -18245,13 +18245,13 @@
         <w:rPr>
           <w:rFonts w:ascii="Courier New" w:hAnsi="Courier New" w:cs="Courier New"/>
         </w:rPr>
-        <w:t xml:space="preserve">        &lt;p&gt;About &lt;strong&gt;20 minutes&lt;/strong&gt;, against 8 to cre</w:t>
-      </w:r>
-      <w:r>
-        <w:rPr>
-          <w:rFonts w:ascii="Courier New" w:hAnsi="Courier New" w:cs="Courier New"/>
-        </w:rPr>
-        <w:t>ate. Start it and go and do</w:t>
+        <w:t xml:space="preserve">        &lt;p&gt;About &lt;strong&gt;20 minutes&lt;/strong&gt;, against 8 to create. Start it </w:t>
+      </w:r>
+      <w:r>
+        <w:rPr>
+          <w:rFonts w:ascii="Courier New" w:hAnsi="Courier New" w:cs="Courier New"/>
+        </w:rPr>
+        <w:t>and go and do</w:t>
       </w:r>
     </w:p>
     <w:p>
@@ -18364,13 +18364,13 @@
         <w:rPr>
           <w:rFonts w:ascii="Courier New" w:hAnsi="Courier New" w:cs="Courier New"/>
         </w:rPr>
-        <w:t xml:space="preserve">          &lt;code&gt;aws opensearchserverless list-</w:t>
-      </w:r>
-      <w:r>
-        <w:rPr>
-          <w:rFonts w:ascii="Courier New" w:hAnsi="Courier New" w:cs="Courier New"/>
-        </w:rPr>
-        <w:t>collections&lt;/code&gt; and</w:t>
+        <w:t xml:space="preserve">          &lt;code&gt;aws opensearchserverless list-collections&lt;/c</w:t>
+      </w:r>
+      <w:r>
+        <w:rPr>
+          <w:rFonts w:ascii="Courier New" w:hAnsi="Courier New" w:cs="Courier New"/>
+        </w:rPr>
+        <w:t>ode&gt; and</w:t>
       </w:r>
     </w:p>
     <w:p>
@@ -18524,13 +18524,13 @@
         <w:rPr>
           <w:rFonts w:ascii="Courier New" w:hAnsi="Courier New" w:cs="Courier New"/>
         </w:rPr>
-        <w:t xml:space="preserve">        &lt;p&gt;Th</w:t>
-      </w:r>
-      <w:r>
-        <w:rPr>
-          <w:rFonts w:ascii="Courier New" w:hAnsi="Courier New" w:cs="Courier New"/>
-        </w:rPr>
-        <w:t>is project makes one choice at every step. Here are the choices that existed,</w:t>
+        <w:t xml:space="preserve">        &lt;p&gt;This project mak</w:t>
+      </w:r>
+      <w:r>
+        <w:rPr>
+          <w:rFonts w:ascii="Courier New" w:hAnsi="Courier New" w:cs="Courier New"/>
+        </w:rPr>
+        <w:t>es one choice at every step. Here are the choices that existed,</w:t>
       </w:r>
     </w:p>
     <w:p>
@@ -18650,13 +18650,13 @@
         <w:rPr>
           <w:rFonts w:ascii="Courier New" w:hAnsi="Courier New" w:cs="Courier New"/>
         </w:rPr>
-        <w:t xml:space="preserve">        how do you find out one c</w:t>
-      </w:r>
-      <w:r>
-        <w:rPr>
-          <w:rFonts w:ascii="Courier New" w:hAnsi="Courier New" w:cs="Courier New"/>
-        </w:rPr>
-        <w:t>hanged, and what happens when one is withdrawn. If any of it</w:t>
+        <w:t xml:space="preserve">        how do you find out one changed, and wh</w:t>
+      </w:r>
+      <w:r>
+        <w:rPr>
+          <w:rFonts w:ascii="Courier New" w:hAnsi="Courier New" w:cs="Courier New"/>
+        </w:rPr>
+        <w:t>at happens when one is withdrawn. If any of it</w:t>
       </w:r>
     </w:p>
     <w:p>
@@ -18740,35 +18740,35 @@
         <w:rPr>
           <w:rFonts w:ascii="Courier New" w:hAnsi="Courier New" w:cs="Courier New"/>
         </w:rPr>
-        <w:t xml:space="preserve">        documents that flips.&lt;</w:t>
-      </w:r>
-      <w:r>
-        <w:rPr>
-          <w:rFonts w:ascii="Courier New" w:hAnsi="Courier New" w:cs="Courier New"/>
-        </w:rPr>
-        <w:t>/p&gt;</w:t>
-      </w:r>
-    </w:p>
-    <w:p>
-      <w:pPr>
-        <w:pStyle w:val="PlainText"/>
-        <w:rPr>
-          <w:rFonts w:ascii="Courier New" w:hAnsi="Courier New" w:cs="Courier New"/>
-        </w:rPr>
-      </w:pPr>
-    </w:p>
-    <w:p>
-      <w:pPr>
-        <w:pStyle w:val="PlainText"/>
-        <w:rPr>
-          <w:rFonts w:ascii="Courier New" w:hAnsi="Courier New" w:cs="Courier New"/>
-        </w:rPr>
-      </w:pPr>
-      <w:r>
-        <w:rPr>
-          <w:rFonts w:ascii="Courier New" w:hAnsi="Courier New" w:cs="Courier New"/>
-        </w:rPr>
-        <w:t xml:space="preserve">        &lt;h3&gt;Loading and parsing&lt;/h3&gt;</w:t>
+        <w:t xml:space="preserve">        documents that flips.&lt;/p&gt;</w:t>
+      </w:r>
+    </w:p>
+    <w:p>
+      <w:pPr>
+        <w:pStyle w:val="PlainText"/>
+        <w:rPr>
+          <w:rFonts w:ascii="Courier New" w:hAnsi="Courier New" w:cs="Courier New"/>
+        </w:rPr>
+      </w:pPr>
+    </w:p>
+    <w:p>
+      <w:pPr>
+        <w:pStyle w:val="PlainText"/>
+        <w:rPr>
+          <w:rFonts w:ascii="Courier New" w:hAnsi="Courier New" w:cs="Courier New"/>
+        </w:rPr>
+      </w:pPr>
+      <w:r>
+        <w:rPr>
+          <w:rFonts w:ascii="Courier New" w:hAnsi="Courier New" w:cs="Courier New"/>
+        </w:rPr>
+        <w:t xml:space="preserve">        &lt;</w:t>
+      </w:r>
+      <w:r>
+        <w:rPr>
+          <w:rFonts w:ascii="Courier New" w:hAnsi="Courier New" w:cs="Courier New"/>
+        </w:rPr>
+        <w:t>h3&gt;Loading and parsing&lt;/h3&gt;</w:t>
       </w:r>
     </w:p>
     <w:p>
@@ -18895,13 +18895,13 @@
         <w:rPr>
           <w:rFonts w:ascii="Courier New" w:hAnsi="Courier New" w:cs="Courier New"/>
         </w:rPr>
-        <w:t xml:space="preserve">      </w:t>
-      </w:r>
-      <w:r>
-        <w:rPr>
-          <w:rFonts w:ascii="Courier New" w:hAnsi="Courier New" w:cs="Courier New"/>
-        </w:rPr>
-        <w:t xml:space="preserve">      &lt;tr&gt;&lt;td&gt;DOCX&lt;/td&gt;&lt;td&gt;Tables and headers are easy to lose. Tracked changes may still be in there&lt;/td&gt;&lt;/tr&gt;</w:t>
+        <w:t xml:space="preserve">            &lt;tr&gt;&lt;td&gt;</w:t>
+      </w:r>
+      <w:r>
+        <w:rPr>
+          <w:rFonts w:ascii="Courier New" w:hAnsi="Courier New" w:cs="Courier New"/>
+        </w:rPr>
+        <w:t>DOCX&lt;/td&gt;&lt;td&gt;Tables and headers are easy to lose. Tracked changes may still be in there&lt;/td&gt;&lt;/tr&gt;</w:t>
       </w:r>
     </w:p>
     <w:p>
@@ -19013,13 +19013,7 @@
         <w:rPr>
           <w:rFonts w:ascii="Courier New" w:hAnsi="Courier New" w:cs="Courier New"/>
         </w:rPr>
-        <w:t xml:space="preserve">  </w:t>
-      </w:r>
-      <w:r>
-        <w:rPr>
-          <w:rFonts w:ascii="Courier New" w:hAnsi="Courier New" w:cs="Courier New"/>
-        </w:rPr>
-        <w:t xml:space="preserve">      &lt;table&gt;</w:t>
+        <w:t xml:space="preserve">        &lt;table&gt;</w:t>
       </w:r>
     </w:p>
     <w:p>
@@ -19089,13 +19083,13 @@
         <w:rPr>
           <w:rFonts w:ascii="Courier New" w:hAnsi="Courier New" w:cs="Courier New"/>
         </w:rPr>
-        <w:t xml:space="preserve">            &lt;tr&gt;&lt;td&gt;&lt;str</w:t>
-      </w:r>
-      <w:r>
-        <w:rPr>
-          <w:rFonts w:ascii="Courier New" w:hAnsi="Courier New" w:cs="Courier New"/>
-        </w:rPr>
-        <w:t>ong&gt;LlamaParse&lt;/strong&gt; and similar&lt;/td&gt;&lt;td&gt;Better on complex PDFs and tables, at a per-page cost&lt;/td&gt;&lt;/tr&gt;</w:t>
+        <w:t xml:space="preserve">            &lt;tr&gt;&lt;td&gt;&lt;strong&gt;LlamaParse</w:t>
+      </w:r>
+      <w:r>
+        <w:rPr>
+          <w:rFonts w:ascii="Courier New" w:hAnsi="Courier New" w:cs="Courier New"/>
+        </w:rPr>
+        <w:t>&lt;/strong&gt; and similar&lt;/td&gt;&lt;td&gt;Better on complex PDFs and tables, at a per-page cost&lt;/td&gt;&lt;/tr&gt;</w:t>
       </w:r>
     </w:p>
     <w:p>
@@ -19137,13 +19131,13 @@
         <w:rPr>
           <w:rFonts w:ascii="Courier New" w:hAnsi="Courier New" w:cs="Courier New"/>
         </w:rPr>
-        <w:t xml:space="preserve">            &lt;tr&gt;&lt;td&gt;&lt;strong&gt;Docling, Apache Tika&lt;/strong&gt;&lt;/td&gt;&lt;td&gt;Bro</w:t>
-      </w:r>
-      <w:r>
-        <w:rPr>
-          <w:rFonts w:ascii="Courier New" w:hAnsi="Courier New" w:cs="Courier New"/>
-        </w:rPr>
-        <w:t>ad format coverage, often in a JVM stack&lt;/td&gt;&lt;/tr&gt;</w:t>
+        <w:t xml:space="preserve">            &lt;tr&gt;&lt;td&gt;&lt;strong&gt;Docling, Apache Tika&lt;/strong&gt;&lt;/td&gt;&lt;td&gt;Broad format cove</w:t>
+      </w:r>
+      <w:r>
+        <w:rPr>
+          <w:rFonts w:ascii="Courier New" w:hAnsi="Courier New" w:cs="Courier New"/>
+        </w:rPr>
+        <w:t>rage, often in a JVM stack&lt;/td&gt;&lt;/tr&gt;</w:t>
       </w:r>
     </w:p>
     <w:p>
@@ -19270,13 +19264,13 @@
         <w:rPr>
           <w:rFonts w:ascii="Courier New" w:hAnsi="Courier New" w:cs="Courier New"/>
         </w:rPr>
-        <w:t xml:space="preserve">        It matters </w:t>
-      </w:r>
-      <w:r>
-        <w:rPr>
-          <w:rFonts w:ascii="Courier New" w:hAnsi="Courier New" w:cs="Courier New"/>
-        </w:rPr>
-        <w:t>more than the choice of embedding model.&lt;/p&gt;</w:t>
+        <w:t xml:space="preserve">        It matters more than the </w:t>
+      </w:r>
+      <w:r>
+        <w:rPr>
+          <w:rFonts w:ascii="Courier New" w:hAnsi="Courier New" w:cs="Courier New"/>
+        </w:rPr>
+        <w:t>choice of embedding model.&lt;/p&gt;</w:t>
       </w:r>
     </w:p>
     <w:p>
@@ -19368,27 +19362,27 @@
         <w:rPr>
           <w:rFonts w:ascii="Courier New" w:hAnsi="Courier New" w:cs="Courier New"/>
         </w:rPr>
-        <w:t xml:space="preserve">        &lt;p&gt;This project uses LangChain's &lt;code&gt;RecursiveCharacterTextSplitter&lt;/code&gt; at </w:t>
-      </w:r>
-      <w:r>
-        <w:rPr>
-          <w:rFonts w:ascii="Courier New" w:hAnsi="Courier New" w:cs="Courier New"/>
-        </w:rPr>
-        <w:t>700</w:t>
-      </w:r>
-    </w:p>
-    <w:p>
-      <w:pPr>
-        <w:pStyle w:val="PlainText"/>
-        <w:rPr>
-          <w:rFonts w:ascii="Courier New" w:hAnsi="Courier New" w:cs="Courier New"/>
-        </w:rPr>
-      </w:pPr>
-      <w:r>
-        <w:rPr>
-          <w:rFonts w:ascii="Courier New" w:hAnsi="Courier New" w:cs="Courier New"/>
-        </w:rPr>
-        <w:t xml:space="preserve">        characters with 80 of overlap. It tries paragraph breaks first, then line breaks,</w:t>
+        <w:t xml:space="preserve">        &lt;p&gt;This project uses LangChain's &lt;code&gt;RecursiveCharacterTextSplitter&lt;/code&gt; at 700</w:t>
+      </w:r>
+    </w:p>
+    <w:p>
+      <w:pPr>
+        <w:pStyle w:val="PlainText"/>
+        <w:rPr>
+          <w:rFonts w:ascii="Courier New" w:hAnsi="Courier New" w:cs="Courier New"/>
+        </w:rPr>
+      </w:pPr>
+      <w:r>
+        <w:rPr>
+          <w:rFonts w:ascii="Courier New" w:hAnsi="Courier New" w:cs="Courier New"/>
+        </w:rPr>
+        <w:t xml:space="preserve">        ch</w:t>
+      </w:r>
+      <w:r>
+        <w:rPr>
+          <w:rFonts w:ascii="Courier New" w:hAnsi="Courier New" w:cs="Courier New"/>
+        </w:rPr>
+        <w:t>aracters with 80 of overlap. It tries paragraph breaks first, then line breaks,</w:t>
       </w:r>
     </w:p>
     <w:p>
@@ -19472,13 +19466,13 @@
         <w:rPr>
           <w:rFonts w:ascii="Courier New" w:hAnsi="Courier New" w:cs="Courier New"/>
         </w:rPr>
-        <w:t xml:space="preserve">        reference to yo</w:t>
-      </w:r>
-      <w:r>
-        <w:rPr>
-          <w:rFonts w:ascii="Courier New" w:hAnsi="Courier New" w:cs="Courier New"/>
-        </w:rPr>
-        <w:t>ur documents is a guess.&lt;/p&gt;</w:t>
+        <w:t xml:space="preserve">        reference to your documents i</w:t>
+      </w:r>
+      <w:r>
+        <w:rPr>
+          <w:rFonts w:ascii="Courier New" w:hAnsi="Courier New" w:cs="Courier New"/>
+        </w:rPr>
+        <w:t>s a guess.&lt;/p&gt;</w:t>
       </w:r>
     </w:p>
     <w:p>
@@ -19612,13 +19606,13 @@
         <w:rPr>
           <w:rFonts w:ascii="Courier New" w:hAnsi="Courier New" w:cs="Courier New"/>
         </w:rPr>
-        <w:t xml:space="preserve">            &lt;tr&gt;&lt;td&gt;OpenAI text-embedding-3&lt;/td&gt;&lt;td&gt;153</w:t>
-      </w:r>
-      <w:r>
-        <w:rPr>
-          <w:rFonts w:ascii="Courier New" w:hAnsi="Courier New" w:cs="Courier New"/>
-        </w:rPr>
-        <w:t>6 or 3072&lt;/td&gt;&lt;td&gt;Very widely used outside AWS&lt;/td&gt;&lt;/tr&gt;</w:t>
+        <w:t xml:space="preserve">            &lt;tr&gt;&lt;td&gt;OpenAI text-embedding-3&lt;/td&gt;&lt;td&gt;1536 or 3072&lt;/td&gt;</w:t>
+      </w:r>
+      <w:r>
+        <w:rPr>
+          <w:rFonts w:ascii="Courier New" w:hAnsi="Courier New" w:cs="Courier New"/>
+        </w:rPr>
+        <w:t>&lt;td&gt;Very widely used outside AWS&lt;/td&gt;&lt;/tr&gt;</w:t>
       </w:r>
     </w:p>
     <w:p>
@@ -19730,13 +19724,13 @@
         <w:rPr>
           <w:rFonts w:ascii="Courier New" w:hAnsi="Courier New" w:cs="Courier New"/>
         </w:rPr>
-        <w:t xml:space="preserve">        a migration with a cos</w:t>
-      </w:r>
-      <w:r>
-        <w:rPr>
-          <w:rFonts w:ascii="Courier New" w:hAnsi="Courier New" w:cs="Courier New"/>
-        </w:rPr>
-        <w:t>t and a window, not a config tweak.&lt;/p&gt;</w:t>
+        <w:t xml:space="preserve">        a migration with a cost and a window</w:t>
+      </w:r>
+      <w:r>
+        <w:rPr>
+          <w:rFonts w:ascii="Courier New" w:hAnsi="Courier New" w:cs="Courier New"/>
+        </w:rPr>
+        <w:t>, not a config tweak.&lt;/p&gt;</w:t>
       </w:r>
     </w:p>
     <w:p>
@@ -19885,13 +19879,13 @@
         <w:rPr>
           <w:rFonts w:ascii="Courier New" w:hAnsi="Courier New" w:cs="Courier New"/>
         </w:rPr>
-        <w:t xml:space="preserve">            &lt;tr&gt;&lt;td&gt;pgvector in PostgreSQL&lt;</w:t>
-      </w:r>
-      <w:r>
-        <w:rPr>
-          <w:rFonts w:ascii="Courier New" w:hAnsi="Courier New" w:cs="Courier New"/>
-        </w:rPr>
-        <w:t>/td&gt;&lt;td&gt;You already have Postgres and do not want another system. The POC&lt;/td&gt;&lt;/tr&gt;</w:t>
+        <w:t xml:space="preserve">            &lt;tr&gt;&lt;td&gt;pgvector in PostgreSQL&lt;/td&gt;&lt;td&gt;You al</w:t>
+      </w:r>
+      <w:r>
+        <w:rPr>
+          <w:rFonts w:ascii="Courier New" w:hAnsi="Courier New" w:cs="Courier New"/>
+        </w:rPr>
+        <w:t>ready have Postgres and do not want another system. The POC&lt;/td&gt;&lt;/tr&gt;</w:t>
       </w:r>
     </w:p>
     <w:p>
@@ -20003,27 +19997,27 @@
         <w:rPr>
           <w:rFonts w:ascii="Courier New" w:hAnsi="Courier New" w:cs="Courier New"/>
         </w:rPr>
-        <w:t xml:space="preserve">        &lt;p&gt;The question that matters most is whether it filters &lt;em&gt;inside&lt;/em&gt; the s</w:t>
-      </w:r>
-      <w:r>
-        <w:rPr>
-          <w:rFonts w:ascii="Courier New" w:hAnsi="Courier New" w:cs="Courier New"/>
-        </w:rPr>
-        <w:t>earch.</w:t>
-      </w:r>
-    </w:p>
-    <w:p>
-      <w:pPr>
-        <w:pStyle w:val="PlainText"/>
-        <w:rPr>
-          <w:rFonts w:ascii="Courier New" w:hAnsi="Courier New" w:cs="Courier New"/>
-        </w:rPr>
-      </w:pPr>
-      <w:r>
-        <w:rPr>
-          <w:rFonts w:ascii="Courier New" w:hAnsi="Courier New" w:cs="Courier New"/>
-        </w:rPr>
-        <w:t xml:space="preserve">        If it can only filter afterwards, you cannot do access control properly, for the</w:t>
+        <w:t xml:space="preserve">        &lt;p&gt;The question that matters most is whether it filters &lt;em&gt;inside&lt;/em&gt; the search.</w:t>
+      </w:r>
+    </w:p>
+    <w:p>
+      <w:pPr>
+        <w:pStyle w:val="PlainText"/>
+        <w:rPr>
+          <w:rFonts w:ascii="Courier New" w:hAnsi="Courier New" w:cs="Courier New"/>
+        </w:rPr>
+      </w:pPr>
+      <w:r>
+        <w:rPr>
+          <w:rFonts w:ascii="Courier New" w:hAnsi="Courier New" w:cs="Courier New"/>
+        </w:rPr>
+        <w:t xml:space="preserve">       </w:t>
+      </w:r>
+      <w:r>
+        <w:rPr>
+          <w:rFonts w:ascii="Courier New" w:hAnsi="Courier New" w:cs="Courier New"/>
+        </w:rPr>
+        <w:t xml:space="preserve"> If it can only filter afterwards, you cannot do access control properly, for the</w:t>
       </w:r>
     </w:p>
     <w:p>
@@ -20129,13 +20123,13 @@
         <w:rPr>
           <w:rFonts w:ascii="Courier New" w:hAnsi="Courier New" w:cs="Courier New"/>
         </w:rPr>
-        <w:t xml:space="preserve">        &lt;p&gt;Roughly seventy models have on-demand pricing on Bedr</w:t>
-      </w:r>
-      <w:r>
-        <w:rPr>
-          <w:rFonts w:ascii="Courier New" w:hAnsi="Courier New" w:cs="Courier New"/>
-        </w:rPr>
-        <w:t>ock in us-east-1: the Nova</w:t>
+        <w:t xml:space="preserve">        &lt;p&gt;Roughly seventy models have on-demand pricing on Bedrock in us-east</w:t>
+      </w:r>
+      <w:r>
+        <w:rPr>
+          <w:rFonts w:ascii="Courier New" w:hAnsi="Courier New" w:cs="Courier New"/>
+        </w:rPr>
+        <w:t>-1: the Nova</w:t>
       </w:r>
     </w:p>
     <w:p>
@@ -20261,13 +20255,13 @@
         <w:rPr>
           <w:rFonts w:ascii="Courier New" w:hAnsi="Courier New" w:cs="Courier New"/>
         </w:rPr>
-        <w:t xml:space="preserve">     </w:t>
-      </w:r>
-      <w:r>
-        <w:rPr>
-          <w:rFonts w:ascii="Courier New" w:hAnsi="Courier New" w:cs="Courier New"/>
-        </w:rPr>
-        <w:t xml:space="preserve">       &lt;tr&gt;&lt;td&gt;Does it support tool use?&lt;/td&gt;&lt;td&gt;This whole design depends on it&lt;/td&gt;&lt;/tr&gt;</w:t>
+        <w:t xml:space="preserve">            &lt;tr&gt;&lt;td</w:t>
+      </w:r>
+      <w:r>
+        <w:rPr>
+          <w:rFonts w:ascii="Courier New" w:hAnsi="Courier New" w:cs="Courier New"/>
+        </w:rPr>
+        <w:t>&gt;Does it support tool use?&lt;/td&gt;&lt;td&gt;This whole design depends on it&lt;/td&gt;&lt;/tr&gt;</w:t>
       </w:r>
     </w:p>
     <w:p>
@@ -20310,13 +20304,13 @@
         <w:rPr>
           <w:rFonts w:ascii="Courier New" w:hAnsi="Courier New" w:cs="Courier New"/>
         </w:rPr>
-        <w:t xml:space="preserve">            &lt;tr&gt;&lt;td&gt;Must the data stay in one geography?&lt;/td&gt;&lt;td&gt;Use a regional inference profile (&lt;code&gt;us.&lt;/code</w:t>
-      </w:r>
-      <w:r>
-        <w:rPr>
-          <w:rFonts w:ascii="Courier New" w:hAnsi="Courier New" w:cs="Courier New"/>
-        </w:rPr>
-        <w:t>&gt;, &lt;code&gt;eu.&lt;/code&gt;) rather than &lt;code&gt;global.&lt;/code&gt;&lt;/td&gt;&lt;/tr&gt;</w:t>
+        <w:t xml:space="preserve">            &lt;tr&gt;&lt;td&gt;Must the data stay in one geography?&lt;/td&gt;&lt;td&gt;Use a regional inference profile (&lt;code&gt;us.&lt;/code&gt;, &lt;code&gt;eu.&lt;/</w:t>
+      </w:r>
+      <w:r>
+        <w:rPr>
+          <w:rFonts w:ascii="Courier New" w:hAnsi="Courier New" w:cs="Courier New"/>
+        </w:rPr>
+        <w:t>code&gt;) rather than &lt;code&gt;global.&lt;/code&gt;&lt;/td&gt;&lt;/tr&gt;</w:t>
       </w:r>
     </w:p>
     <w:p>
@@ -20464,69 +20458,55 @@
         <w:rPr>
           <w:rFonts w:ascii="Courier New" w:hAnsi="Courier New" w:cs="Courier New"/>
         </w:rPr>
-        <w:t xml:space="preserve">  </w:t>
-      </w:r>
-      <w:r>
-        <w:rPr>
-          <w:rFonts w:ascii="Courier New" w:hAnsi="Courier New" w:cs="Courier New"/>
-        </w:rPr>
-        <w:t xml:space="preserve">      &lt;p&gt;This comes up immediately, and it is worth being clear about what kind of work it</w:t>
-      </w:r>
-    </w:p>
-    <w:p>
-      <w:pPr>
-        <w:pStyle w:val="PlainText"/>
-        <w:rPr>
-          <w:rFonts w:ascii="Courier New" w:hAnsi="Courier New" w:cs="Courier New"/>
-        </w:rPr>
-      </w:pPr>
-      <w:r>
-        <w:rPr>
-          <w:rFonts w:ascii="Courier New" w:hAnsi="Courier New" w:cs="Courier New"/>
-        </w:rPr>
-        <w:t xml:space="preserve">        is. The React app is one client of the API. Slack or Teams would be another. The</w:t>
-      </w:r>
-    </w:p>
-    <w:p>
-      <w:pPr>
-        <w:pStyle w:val="PlainText"/>
-        <w:rPr>
-          <w:rFonts w:ascii="Courier New" w:hAnsi="Courier New" w:cs="Courier New"/>
-        </w:rPr>
-      </w:pPr>
-      <w:r>
-        <w:rPr>
-          <w:rFonts w:ascii="Courier New" w:hAnsi="Courier New" w:cs="Courier New"/>
-        </w:rPr>
-        <w:t xml:space="preserve">        retrieval, the access filter, the row-level security, the prompt and the model do not</w:t>
-      </w:r>
-    </w:p>
-    <w:p>
-      <w:pPr>
-        <w:pStyle w:val="PlainText"/>
-        <w:rPr>
-          <w:rFonts w:ascii="Courier New" w:hAnsi="Courier New" w:cs="Courier New"/>
-        </w:rPr>
-      </w:pPr>
-      <w:r>
-        <w:rPr>
-          <w:rFonts w:ascii="Courier New" w:hAnsi="Courier New" w:cs="Courier New"/>
-        </w:rPr>
-        <w:t xml:space="preserve">        change at all, because they sit behind the API and never knew which client was</w:t>
-      </w:r>
-    </w:p>
-    <w:p>
-      <w:pPr>
-        <w:pStyle w:val="PlainText"/>
-        <w:rPr>
-          <w:rFonts w:ascii="Courier New" w:hAnsi="Courier New" w:cs="Courier New"/>
-        </w:rPr>
-      </w:pPr>
-      <w:r>
-        <w:rPr>
-          <w:rFonts w:ascii="Courier New" w:hAnsi="Courier New" w:cs="Courier New"/>
-        </w:rPr>
-        <w:t xml:space="preserve">        calling.&lt;/p&gt;</w:t>
+        <w:t xml:space="preserve">        &lt;p&gt;It is</w:t>
+      </w:r>
+      <w:r>
+        <w:rPr>
+          <w:rFonts w:ascii="Courier New" w:hAnsi="Courier New" w:cs="Courier New"/>
+        </w:rPr>
+        <w:t xml:space="preserve"> wiring, not AI work.&lt;/p&gt;</w:t>
+      </w:r>
+    </w:p>
+    <w:p>
+      <w:pPr>
+        <w:pStyle w:val="PlainText"/>
+        <w:rPr>
+          <w:rFonts w:ascii="Courier New" w:hAnsi="Courier New" w:cs="Courier New"/>
+        </w:rPr>
+      </w:pPr>
+      <w:r>
+        <w:rPr>
+          <w:rFonts w:ascii="Courier New" w:hAnsi="Courier New" w:cs="Courier New"/>
+        </w:rPr>
+        <w:t xml:space="preserve">        &lt;p&gt;The React app is one client of the API. Slack or Teams would be another. The</w:t>
+      </w:r>
+    </w:p>
+    <w:p>
+      <w:pPr>
+        <w:pStyle w:val="PlainText"/>
+        <w:rPr>
+          <w:rFonts w:ascii="Courier New" w:hAnsi="Courier New" w:cs="Courier New"/>
+        </w:rPr>
+      </w:pPr>
+      <w:r>
+        <w:rPr>
+          <w:rFonts w:ascii="Courier New" w:hAnsi="Courier New" w:cs="Courier New"/>
+        </w:rPr>
+        <w:t xml:space="preserve">        retrieval, the access filter, the row-level security, the prompt and the model do</w:t>
+      </w:r>
+    </w:p>
+    <w:p>
+      <w:pPr>
+        <w:pStyle w:val="PlainText"/>
+        <w:rPr>
+          <w:rFonts w:ascii="Courier New" w:hAnsi="Courier New" w:cs="Courier New"/>
+        </w:rPr>
+      </w:pPr>
+      <w:r>
+        <w:rPr>
+          <w:rFonts w:ascii="Courier New" w:hAnsi="Courier New" w:cs="Courier New"/>
+        </w:rPr>
+        <w:t xml:space="preserve">        not change. They sit behind the API and never knew which client was calling.&lt;/p&gt;</w:t>
       </w:r>
     </w:p>
     <w:p>
@@ -20554,27 +20534,27 @@
         <w:rPr>
           <w:rFonts w:ascii="Courier New" w:hAnsi="Courier New" w:cs="Courier New"/>
         </w:rPr>
-        <w:t xml:space="preserve">        map the sender to an employ</w:t>
-      </w:r>
-      <w:r>
-        <w:rPr>
-          <w:rFonts w:ascii="Courier New" w:hAnsi="Courier New" w:cs="Courier New"/>
-        </w:rPr>
-        <w:t>ee, call &lt;code&gt;POST /api/chat&lt;/code&gt;, and format the reply.</w:t>
-      </w:r>
-    </w:p>
-    <w:p>
-      <w:pPr>
-        <w:pStyle w:val="PlainText"/>
-        <w:rPr>
-          <w:rFonts w:ascii="Courier New" w:hAnsi="Courier New" w:cs="Courier New"/>
-        </w:rPr>
-      </w:pPr>
-      <w:r>
-        <w:rPr>
-          <w:rFonts w:ascii="Courier New" w:hAnsi="Courier New" w:cs="Courier New"/>
-        </w:rPr>
-        <w:t xml:space="preserve">        That is ordinary application code, not AI work.&lt;/p&gt;</w:t>
+        <w:t xml:space="preserve">        map the sender to an employee, call &lt;code&gt;POST /api/chat&lt;/code&gt;, and format the reply.</w:t>
+      </w:r>
+    </w:p>
+    <w:p>
+      <w:pPr>
+        <w:pStyle w:val="PlainText"/>
+        <w:rPr>
+          <w:rFonts w:ascii="Courier New" w:hAnsi="Courier New" w:cs="Courier New"/>
+        </w:rPr>
+      </w:pPr>
+      <w:r>
+        <w:rPr>
+          <w:rFonts w:ascii="Courier New" w:hAnsi="Courier New" w:cs="Courier New"/>
+        </w:rPr>
+        <w:t xml:space="preserve">        That is ordinary appl</w:t>
+      </w:r>
+      <w:r>
+        <w:rPr>
+          <w:rFonts w:ascii="Courier New" w:hAnsi="Courier New" w:cs="Courier New"/>
+        </w:rPr>
+        <w:t>ication code, not AI work.&lt;/p&gt;</w:t>
       </w:r>
     </w:p>
     <w:p>
@@ -20658,13 +20638,7 @@
         <w:rPr>
           <w:rFonts w:ascii="Courier New" w:hAnsi="Courier New" w:cs="Courier New"/>
         </w:rPr>
-        <w:t xml:space="preserve">      </w:t>
-      </w:r>
-      <w:r>
-        <w:rPr>
-          <w:rFonts w:ascii="Courier New" w:hAnsi="Courier New" w:cs="Courier New"/>
-        </w:rPr>
-        <w:t>&lt;/div&gt;</w:t>
+        <w:t xml:space="preserve">      &lt;/div&gt;</w:t>
       </w:r>
     </w:p>
     <w:p>
@@ -20708,7 +20682,13 @@
         <w:rPr>
           <w:rFonts w:ascii="Courier New" w:hAnsi="Courier New" w:cs="Courier New"/>
         </w:rPr>
-        <w:t xml:space="preserve">    &lt;!-- ============================================================ --&gt;</w:t>
+        <w:t xml:space="preserve">    &lt;!-- ========================================================</w:t>
+      </w:r>
+      <w:r>
+        <w:rPr>
+          <w:rFonts w:ascii="Courier New" w:hAnsi="Courier New" w:cs="Courier New"/>
+        </w:rPr>
+        <w:t>==== --&gt;</w:t>
       </w:r>
     </w:p>
     <w:p>
@@ -20792,7 +20772,504 @@
         <w:rPr>
           <w:rFonts w:ascii="Courier New" w:hAnsi="Courier New" w:cs="Courier New"/>
         </w:rPr>
+        <w:t xml:space="preserve">        &lt;table&gt;</w:t>
+      </w:r>
+    </w:p>
+    <w:p>
+      <w:pPr>
+        <w:pStyle w:val="PlainText"/>
+        <w:rPr>
+          <w:rFonts w:ascii="Courier New" w:hAnsi="Courier New" w:cs="Courier New"/>
+        </w:rPr>
+      </w:pPr>
+      <w:r>
+        <w:rPr>
+          <w:rFonts w:ascii="Courier New" w:hAnsi="Courier New" w:cs="Courier New"/>
+        </w:rPr>
         <w:lastRenderedPageBreak/>
+        <w:t xml:space="preserve">          &lt;thead&gt;&lt;tr&gt;&lt;th&gt;You see&lt;/th&gt;&lt;th&gt;Likely cause&lt;/th&gt;&lt;th&gt;Fix&lt;/th&gt;&lt;/tr&gt;&lt;/thead&gt;</w:t>
+      </w:r>
+    </w:p>
+    <w:p>
+      <w:pPr>
+        <w:pStyle w:val="PlainText"/>
+        <w:rPr>
+          <w:rFonts w:ascii="Courier New" w:hAnsi="Courier New" w:cs="Courier New"/>
+        </w:rPr>
+      </w:pPr>
+      <w:r>
+        <w:rPr>
+          <w:rFonts w:ascii="Courier New" w:hAnsi="Courier New" w:cs="Courier New"/>
+        </w:rPr>
+        <w:t xml:space="preserve">          &lt;tbody&gt;</w:t>
+      </w:r>
+    </w:p>
+    <w:p>
+      <w:pPr>
+        <w:pStyle w:val="PlainText"/>
+        <w:rPr>
+          <w:rFonts w:ascii="Courier New" w:hAnsi="Courier New" w:cs="Courier New"/>
+        </w:rPr>
+      </w:pPr>
+      <w:r>
+        <w:rPr>
+          <w:rFonts w:ascii="Courier New" w:hAnsi="Courier New" w:cs="Courier New"/>
+        </w:rPr>
+        <w:t xml:space="preserve">            &lt;tr&gt;&lt;td&gt;Terraform: &lt;code&gt;build/layer.zip is missing&lt;/code&gt;&lt;/td&gt;&lt;td&gt;The dependency layer was never built&lt;/td&gt;&lt;td&gt;&lt;code&gt;bash scripts/build-layer.sh&lt;/code&gt;, then apply again&lt;/td&gt;&lt;/tr&gt;</w:t>
+      </w:r>
+    </w:p>
+    <w:p>
+      <w:pPr>
+        <w:pStyle w:val="PlainText"/>
+        <w:rPr>
+          <w:rFonts w:ascii="Courier New" w:hAnsi="Courier New" w:cs="Courier New"/>
+        </w:rPr>
+      </w:pPr>
+      <w:r>
+        <w:rPr>
+          <w:rFonts w:ascii="Courier New" w:hAnsi="Courier New" w:cs="Courier New"/>
+        </w:rPr>
+        <w:t xml:space="preserve">            &lt;tr&gt;&lt;td&gt;New code does not take effect&lt;/td&gt;</w:t>
+      </w:r>
+      <w:r>
+        <w:rPr>
+          <w:rFonts w:ascii="Courier New" w:hAnsi="Courier New" w:cs="Courier New"/>
+        </w:rPr>
+        <w:t>&lt;td&gt;The update is still rolling out&lt;/td&gt;&lt;td&gt;Wait for &lt;code&gt;aws lambda get-function --function-name northwind-hr-chat --query 'Configuration.LastUpdateStatus'&lt;/code&gt; to say &lt;code&gt;Successful&lt;/code&gt;&lt;/td&gt;&lt;/tr&gt;</w:t>
+      </w:r>
+    </w:p>
+    <w:p>
+      <w:pPr>
+        <w:pStyle w:val="PlainText"/>
+        <w:rPr>
+          <w:rFonts w:ascii="Courier New" w:hAnsi="Courier New" w:cs="Courier New"/>
+        </w:rPr>
+      </w:pPr>
+      <w:r>
+        <w:rPr>
+          <w:rFonts w:ascii="Courier New" w:hAnsi="Courier New" w:cs="Courier New"/>
+        </w:rPr>
+        <w:t xml:space="preserve">            &lt;tr&gt;&lt;td&gt;&lt;code&gt;AccessDeniedException&lt;/code&gt; in chat logs, naming a model&lt;/td&gt;&lt;td&gt;That model is not enabled in this account and region&lt;/td&gt;&lt;td&gt;Bedrock console, Model catalog, request access. Anthropic models also need the use case form, which is why the default here is Nova&lt;/td&gt;&lt;/tr&gt;</w:t>
+      </w:r>
+    </w:p>
+    <w:p>
+      <w:pPr>
+        <w:pStyle w:val="PlainText"/>
+        <w:rPr>
+          <w:rFonts w:ascii="Courier New" w:hAnsi="Courier New" w:cs="Courier New"/>
+        </w:rPr>
+      </w:pPr>
+      <w:r>
+        <w:rPr>
+          <w:rFonts w:ascii="Courier New" w:hAnsi="Courier New" w:cs="Courier New"/>
+        </w:rPr>
+        <w:t xml:space="preserve">           </w:t>
+      </w:r>
+      <w:r>
+        <w:rPr>
+          <w:rFonts w:ascii="Courier New" w:hAnsi="Courier New" w:cs="Courier New"/>
+        </w:rPr>
+        <w:t xml:space="preserve"> &lt;tr&gt;&lt;td&gt;Answers are slower than usual and &lt;code&gt;model_fallback&lt;/code&gt; appears in &lt;code&gt;tools_used&lt;/code&gt;&lt;/td&gt;&lt;td&gt;The primary model would not answer, so the fallback did&lt;/td&gt;&lt;td&gt;Nothing is broken. This is the failover working. Check the chat log for the underlying Bedrock error&lt;/td&gt;&lt;/tr&gt;</w:t>
+      </w:r>
+    </w:p>
+    <w:p>
+      <w:pPr>
+        <w:pStyle w:val="PlainText"/>
+        <w:rPr>
+          <w:rFonts w:ascii="Courier New" w:hAnsi="Courier New" w:cs="Courier New"/>
+        </w:rPr>
+      </w:pPr>
+      <w:r>
+        <w:rPr>
+          <w:rFonts w:ascii="Courier New" w:hAnsi="Courier New" w:cs="Courier New"/>
+        </w:rPr>
+        <w:t xml:space="preserve">            &lt;tr&gt;&lt;td&gt;&lt;code&gt;InvalidParameterException&lt;/code&gt; on &lt;code&gt;logGroupName&lt;/code&gt;&lt;/td&gt;&lt;td&gt;Git Bash on Windows rewrote the &lt;code&gt;/aws/lambda/...&lt;/code&gt; path&lt;/td&gt;&lt;td&gt;&lt;code&gt;export MSYS_NO_PATHCONV=1&lt;/code&gt;&lt;/td&gt;&lt;/tr&gt;</w:t>
+      </w:r>
+    </w:p>
+    <w:p>
+      <w:pPr>
+        <w:pStyle w:val="PlainText"/>
+        <w:rPr>
+          <w:rFonts w:ascii="Courier New" w:hAnsi="Courier New" w:cs="Courier New"/>
+        </w:rPr>
+      </w:pPr>
+      <w:r>
+        <w:rPr>
+          <w:rFonts w:ascii="Courier New" w:hAnsi="Courier New" w:cs="Courier New"/>
+        </w:rPr>
+        <w:t xml:space="preserve">    </w:t>
+      </w:r>
+      <w:r>
+        <w:rPr>
+          <w:rFonts w:ascii="Courier New" w:hAnsi="Courier New" w:cs="Courier New"/>
+        </w:rPr>
+        <w:t xml:space="preserve">        &lt;tr&gt;&lt;td&gt;503 or 504 on the first question after a break&lt;/td&gt;&lt;td&gt;Aurora resuming from 0 ACU, close to the 30-second limit&lt;/td&gt;&lt;td&gt;Ask again. For a live demo, set &lt;code&gt;min_capacity = 0.5&lt;/code&gt; in &lt;code&gt;aurora.tf&lt;/code&gt; for the day&lt;/td&gt;&lt;/tr&gt;</w:t>
+      </w:r>
+    </w:p>
+    <w:p>
+      <w:pPr>
+        <w:pStyle w:val="PlainText"/>
+        <w:rPr>
+          <w:rFonts w:ascii="Courier New" w:hAnsi="Courier New" w:cs="Courier New"/>
+        </w:rPr>
+      </w:pPr>
+      <w:r>
+        <w:rPr>
+          <w:rFonts w:ascii="Courier New" w:hAnsi="Courier New" w:cs="Courier New"/>
+        </w:rPr>
+        <w:t xml:space="preserve">            &lt;tr&gt;&lt;td&gt;401 from &lt;code&gt;/api/me&lt;/code&gt;&lt;/td&gt;&lt;td&gt;Token expired, or built with another app client ID&lt;/td&gt;&lt;td&gt;Sign out and in; rebuild the React app with the current &lt;code&gt;frontend_env&lt;/code&gt;&lt;/td&gt;&lt;/tr&gt;</w:t>
+      </w:r>
+    </w:p>
+    <w:p>
+      <w:pPr>
+        <w:pStyle w:val="PlainText"/>
+        <w:rPr>
+          <w:rFonts w:ascii="Courier New" w:hAnsi="Courier New" w:cs="Courier New"/>
+        </w:rPr>
+      </w:pPr>
+      <w:r>
+        <w:rPr>
+          <w:rFonts w:ascii="Courier New" w:hAnsi="Courier New" w:cs="Courier New"/>
+        </w:rPr>
+        <w:t xml:space="preserve">            &lt;tr&gt;&lt;td&gt;"You don't have an HR assistant acc</w:t>
+      </w:r>
+      <w:r>
+        <w:rPr>
+          <w:rFonts w:ascii="Courier New" w:hAnsi="Courier New" w:cs="Courier New"/>
+        </w:rPr>
+        <w:t>ount"&lt;/td&gt;&lt;td&gt;The Cognito email isn't in the &lt;code&gt;employees&lt;/code&gt; table&lt;/td&gt;&lt;td&gt;Check spelling in &lt;code&gt;demo_user_emails&lt;/code&gt;; run setup-db&lt;/td&gt;&lt;/tr&gt;</w:t>
+      </w:r>
+    </w:p>
+    <w:p>
+      <w:pPr>
+        <w:pStyle w:val="PlainText"/>
+        <w:rPr>
+          <w:rFonts w:ascii="Courier New" w:hAnsi="Courier New" w:cs="Courier New"/>
+        </w:rPr>
+      </w:pPr>
+      <w:r>
+        <w:rPr>
+          <w:rFonts w:ascii="Courier New" w:hAnsi="Courier New" w:cs="Courier New"/>
+        </w:rPr>
+        <w:t xml:space="preserve">            &lt;tr&gt;&lt;td&gt;Ingest fails with 403 from OpenSearch&lt;/td&gt;&lt;td&gt;Data access policy not active yet&lt;/td&gt;&lt;td&gt;Wait a minute; upload &lt;code&gt;manifest.json&lt;/code&gt; again&lt;/td&gt;&lt;/tr&gt;</w:t>
+      </w:r>
+    </w:p>
+    <w:p>
+      <w:pPr>
+        <w:pStyle w:val="PlainText"/>
+        <w:rPr>
+          <w:rFonts w:ascii="Courier New" w:hAnsi="Courier New" w:cs="Courier New"/>
+        </w:rPr>
+      </w:pPr>
+      <w:r>
+        <w:rPr>
+          <w:rFonts w:ascii="Courier New" w:hAnsi="Courier New" w:cs="Courier New"/>
+        </w:rPr>
+        <w:t xml:space="preserve">            &lt;tr&gt;&lt;td&gt;Answers say "No matching policy text" right after ingestion&lt;/td&gt;&lt;td&gt;OpenSearch Serverless hasn't refreshed yet&lt;/td&gt;&lt;td&gt;Wait a minute&lt;/td&gt;&lt;/tr&gt;</w:t>
+      </w:r>
+    </w:p>
+    <w:p>
+      <w:pPr>
+        <w:pStyle w:val="PlainText"/>
+        <w:rPr>
+          <w:rFonts w:ascii="Courier New" w:hAnsi="Courier New" w:cs="Courier New"/>
+        </w:rPr>
+      </w:pPr>
+      <w:r>
+        <w:rPr>
+          <w:rFonts w:ascii="Courier New" w:hAnsi="Courier New" w:cs="Courier New"/>
+        </w:rPr>
+        <w:t xml:space="preserve">            &lt;tr&gt;&lt;td&gt;Sm</w:t>
+      </w:r>
+      <w:r>
+        <w:rPr>
+          <w:rFonts w:ascii="Courier New" w:hAnsi="Courier New" w:cs="Courier New"/>
+        </w:rPr>
+        <w:t>all talk returns policies, or real questions get none&lt;/td&gt;&lt;td&gt;Relevance threshold not measured on these documents&lt;/td&gt;&lt;td&gt;Run the similarity report; set &lt;code&gt;min_best_similarity&lt;/code&gt; between the two groups, not just below the lowest real question&lt;/td&gt;&lt;/tr&gt;</w:t>
+      </w:r>
+    </w:p>
+    <w:p>
+      <w:pPr>
+        <w:pStyle w:val="PlainText"/>
+        <w:rPr>
+          <w:rFonts w:ascii="Courier New" w:hAnsi="Courier New" w:cs="Courier New"/>
+        </w:rPr>
+      </w:pPr>
+      <w:r>
+        <w:rPr>
+          <w:rFonts w:ascii="Courier New" w:hAnsi="Courier New" w:cs="Courier New"/>
+        </w:rPr>
+        <w:t xml:space="preserve">            &lt;tr&gt;&lt;td&gt;The same question passes one run and fails the next&lt;/td&gt;&lt;td&gt;The threshold sits inside the noise of approximate vector search&lt;/td&gt;&lt;td&gt;Move it further from the lowest real score, and set temperature to 0 before comparing runs at all&lt;/</w:t>
+      </w:r>
+      <w:r>
+        <w:rPr>
+          <w:rFonts w:ascii="Courier New" w:hAnsi="Courier New" w:cs="Courier New"/>
+        </w:rPr>
+        <w:t>td&gt;&lt;/tr&gt;</w:t>
+      </w:r>
+    </w:p>
+    <w:p>
+      <w:pPr>
+        <w:pStyle w:val="PlainText"/>
+        <w:rPr>
+          <w:rFonts w:ascii="Courier New" w:hAnsi="Courier New" w:cs="Courier New"/>
+        </w:rPr>
+      </w:pPr>
+      <w:r>
+        <w:rPr>
+          <w:rFonts w:ascii="Courier New" w:hAnsi="Courier New" w:cs="Courier New"/>
+        </w:rPr>
+        <w:t xml:space="preserve">            &lt;tr&gt;&lt;td&gt;A normal HR question is blocked&lt;/td&gt;&lt;td&gt;Prompt attack filter at HIGH&lt;/td&gt;&lt;td&gt;Lower it to MEDIUM in &lt;code&gt;bedrock.tf&lt;/code&gt;, apply&lt;/td&gt;&lt;/tr&gt;</w:t>
+      </w:r>
+    </w:p>
+    <w:p>
+      <w:pPr>
+        <w:pStyle w:val="PlainText"/>
+        <w:rPr>
+          <w:rFonts w:ascii="Courier New" w:hAnsi="Courier New" w:cs="Courier New"/>
+        </w:rPr>
+      </w:pPr>
+      <w:r>
+        <w:rPr>
+          <w:rFonts w:ascii="Courier New" w:hAnsi="Courier New" w:cs="Courier New"/>
+        </w:rPr>
+        <w:lastRenderedPageBreak/>
+        <w:t xml:space="preserve">            &lt;tr&gt;&lt;td&gt;Cognito "redirect_mismatch"&lt;/td&gt;&lt;td&gt;App opened at an address other than the CloudFront one&lt;/td&gt;&lt;td&gt;Use &lt;code&gt;terraform output app_url&lt;/code&gt; exactly&lt;/td&gt;&lt;/tr&gt;</w:t>
+      </w:r>
+    </w:p>
+    <w:p>
+      <w:pPr>
+        <w:pStyle w:val="PlainText"/>
+        <w:rPr>
+          <w:rFonts w:ascii="Courier New" w:hAnsi="Courier New" w:cs="Courier New"/>
+        </w:rPr>
+      </w:pPr>
+      <w:r>
+        <w:rPr>
+          <w:rFonts w:ascii="Courier New" w:hAnsi="Courier New" w:cs="Courier New"/>
+        </w:rPr>
+        <w:t xml:space="preserve">            &lt;tr&gt;&lt;td&gt;Terraform: domain already exists&lt;/td&gt;&lt;td&gt;&lt;code&gt;cognito_domain_prefix&lt;/code&gt; taken&lt;/td&gt;&lt;td&gt;Choose another prefix&lt;/td&gt;&lt;/tr&gt;</w:t>
+      </w:r>
+    </w:p>
+    <w:p>
+      <w:pPr>
+        <w:pStyle w:val="PlainText"/>
+        <w:rPr>
+          <w:rFonts w:ascii="Courier New" w:hAnsi="Courier New" w:cs="Courier New"/>
+        </w:rPr>
+      </w:pPr>
+      <w:r>
+        <w:rPr>
+          <w:rFonts w:ascii="Courier New" w:hAnsi="Courier New" w:cs="Courier New"/>
+        </w:rPr>
+        <w:t xml:space="preserve">          &lt;/tbody&gt;</w:t>
+      </w:r>
+    </w:p>
+    <w:p>
+      <w:pPr>
+        <w:pStyle w:val="PlainText"/>
+        <w:rPr>
+          <w:rFonts w:ascii="Courier New" w:hAnsi="Courier New" w:cs="Courier New"/>
+        </w:rPr>
+      </w:pPr>
+      <w:r>
+        <w:rPr>
+          <w:rFonts w:ascii="Courier New" w:hAnsi="Courier New" w:cs="Courier New"/>
+        </w:rPr>
+        <w:t xml:space="preserve">   </w:t>
+      </w:r>
+      <w:r>
+        <w:rPr>
+          <w:rFonts w:ascii="Courier New" w:hAnsi="Courier New" w:cs="Courier New"/>
+        </w:rPr>
+        <w:t xml:space="preserve">     &lt;/table&gt;</w:t>
+      </w:r>
+    </w:p>
+    <w:p>
+      <w:pPr>
+        <w:pStyle w:val="PlainText"/>
+        <w:rPr>
+          <w:rFonts w:ascii="Courier New" w:hAnsi="Courier New" w:cs="Courier New"/>
+        </w:rPr>
+      </w:pPr>
+      <w:r>
+        <w:rPr>
+          <w:rFonts w:ascii="Courier New" w:hAnsi="Courier New" w:cs="Courier New"/>
+        </w:rPr>
+        <w:t xml:space="preserve">      &lt;/div&gt;</w:t>
+      </w:r>
+    </w:p>
+    <w:p>
+      <w:pPr>
+        <w:pStyle w:val="PlainText"/>
+        <w:rPr>
+          <w:rFonts w:ascii="Courier New" w:hAnsi="Courier New" w:cs="Courier New"/>
+        </w:rPr>
+      </w:pPr>
+      <w:r>
+        <w:rPr>
+          <w:rFonts w:ascii="Courier New" w:hAnsi="Courier New" w:cs="Courier New"/>
+        </w:rPr>
+        <w:t xml:space="preserve">    &lt;/section&gt;</w:t>
+      </w:r>
+    </w:p>
+    <w:p>
+      <w:pPr>
+        <w:pStyle w:val="PlainText"/>
+        <w:rPr>
+          <w:rFonts w:ascii="Courier New" w:hAnsi="Courier New" w:cs="Courier New"/>
+        </w:rPr>
+      </w:pPr>
+      <w:r>
+        <w:rPr>
+          <w:rFonts w:ascii="Courier New" w:hAnsi="Courier New" w:cs="Courier New"/>
+        </w:rPr>
+        <w:t xml:space="preserve">  &lt;!-- ============================================================ --&gt;</w:t>
+      </w:r>
+    </w:p>
+    <w:p>
+      <w:pPr>
+        <w:pStyle w:val="PlainText"/>
+        <w:rPr>
+          <w:rFonts w:ascii="Courier New" w:hAnsi="Courier New" w:cs="Courier New"/>
+        </w:rPr>
+      </w:pPr>
+      <w:r>
+        <w:rPr>
+          <w:rFonts w:ascii="Courier New" w:hAnsi="Courier New" w:cs="Courier New"/>
+        </w:rPr>
+        <w:t xml:space="preserve">    &lt;section id="clickops"&gt;</w:t>
+      </w:r>
+    </w:p>
+    <w:p>
+      <w:pPr>
+        <w:pStyle w:val="PlainText"/>
+        <w:rPr>
+          <w:rFonts w:ascii="Courier New" w:hAnsi="Courier New" w:cs="Courier New"/>
+        </w:rPr>
+      </w:pPr>
+      <w:r>
+        <w:rPr>
+          <w:rFonts w:ascii="Courier New" w:hAnsi="Courier New" w:cs="Courier New"/>
+        </w:rPr>
+        <w:t xml:space="preserve">      &lt;div class="prose"&gt;</w:t>
+      </w:r>
+    </w:p>
+    <w:p>
+      <w:pPr>
+        <w:pStyle w:val="PlainText"/>
+        <w:rPr>
+          <w:rFonts w:ascii="Courier New" w:hAnsi="Courier New" w:cs="Courier New"/>
+        </w:rPr>
+      </w:pPr>
+      <w:r>
+        <w:rPr>
+          <w:rFonts w:ascii="Courier New" w:hAnsi="Courier New" w:cs="Courier New"/>
+        </w:rPr>
+        <w:t xml:space="preserve">        &lt;h2&gt;Appendix: building it by hand in the console&lt;/h2&gt;</w:t>
+      </w:r>
+    </w:p>
+    <w:p>
+      <w:pPr>
+        <w:pStyle w:val="PlainText"/>
+        <w:rPr>
+          <w:rFonts w:ascii="Courier New" w:hAnsi="Courier New" w:cs="Courier New"/>
+        </w:rPr>
+      </w:pPr>
+      <w:r>
+        <w:rPr>
+          <w:rFonts w:ascii="Courier New" w:hAnsi="Courier New" w:cs="Courier New"/>
+        </w:rPr>
+        <w:t xml:space="preserve">        &lt;p&gt;Optional, and not part of the four hours. A console screen shows you choices a Terraform file hides. Do it once, on your own time, for the services you want to understand properly.&lt;/p&gt;</w:t>
+      </w:r>
+    </w:p>
+    <w:p>
+      <w:pPr>
+        <w:pStyle w:val="PlainText"/>
+        <w:rPr>
+          <w:rFonts w:ascii="Courier New" w:hAnsi="Courier New" w:cs="Courier New"/>
+        </w:rPr>
+      </w:pPr>
+      <w:r>
+        <w:rPr>
+          <w:rFonts w:ascii="Courier New" w:hAnsi="Courier New" w:cs="Courier New"/>
+        </w:rPr>
+        <w:t xml:space="preserve">        &lt;p&gt;&lt;strong&gt;The full walkthrough is &lt;a href="../infra/clickops.md"&gt;infra/clicko</w:t>
+      </w:r>
+      <w:r>
+        <w:rPr>
+          <w:rFonts w:ascii="Courier New" w:hAnsi="Courier New" w:cs="Courier New"/>
+        </w:rPr>
+        <w:t>ps.md&lt;/a&gt;&lt;/strong&gt;,</w:t>
+      </w:r>
+    </w:p>
+    <w:p>
+      <w:pPr>
+        <w:pStyle w:val="PlainText"/>
+        <w:rPr>
+          <w:rFonts w:ascii="Courier New" w:hAnsi="Courier New" w:cs="Courier New"/>
+        </w:rPr>
+      </w:pPr>
+      <w:r>
+        <w:rPr>
+          <w:rFonts w:ascii="Courier New" w:hAnsi="Courier New" w:cs="Courier New"/>
+        </w:rPr>
+        <w:t xml:space="preserve">        twenty numbered steps with every setting and why it is set that way. Expect a day.</w:t>
+      </w:r>
+    </w:p>
+    <w:p>
+      <w:pPr>
+        <w:pStyle w:val="PlainText"/>
+        <w:rPr>
+          <w:rFonts w:ascii="Courier New" w:hAnsi="Courier New" w:cs="Courier New"/>
+        </w:rPr>
+      </w:pPr>
+      <w:r>
+        <w:rPr>
+          <w:rFonts w:ascii="Courier New" w:hAnsi="Courier New" w:cs="Courier New"/>
+        </w:rPr>
+        <w:t xml:space="preserve">        The order is not arbitrary: each step needs something the one before it produced.&lt;/p&gt;</w:t>
+      </w:r>
+    </w:p>
+    <w:p>
+      <w:pPr>
+        <w:pStyle w:val="PlainText"/>
+        <w:rPr>
+          <w:rFonts w:ascii="Courier New" w:hAnsi="Courier New" w:cs="Courier New"/>
+        </w:rPr>
+      </w:pPr>
+      <w:r>
+        <w:rPr>
+          <w:rFonts w:ascii="Courier New" w:hAnsi="Courier New" w:cs="Courier New"/>
+        </w:rPr>
+        <w:t xml:space="preserve">      &lt;/div&gt;</w:t>
+      </w:r>
+    </w:p>
+    <w:p>
+      <w:pPr>
+        <w:pStyle w:val="PlainText"/>
+        <w:rPr>
+          <w:rFonts w:ascii="Courier New" w:hAnsi="Courier New" w:cs="Courier New"/>
+        </w:rPr>
+      </w:pPr>
+      <w:r>
+        <w:rPr>
+          <w:rFonts w:ascii="Courier New" w:hAnsi="Courier New" w:cs="Courier New"/>
+        </w:rPr>
+        <w:t xml:space="preserve">      &lt;div class="table-wrap"&gt;</w:t>
+      </w:r>
+    </w:p>
+    <w:p>
+      <w:pPr>
+        <w:pStyle w:val="PlainText"/>
+        <w:rPr>
+          <w:rFonts w:ascii="Courier New" w:hAnsi="Courier New" w:cs="Courier New"/>
+        </w:rPr>
+      </w:pPr>
+      <w:r>
+        <w:rPr>
+          <w:rFonts w:ascii="Courier New" w:hAnsi="Courier New" w:cs="Courier New"/>
+        </w:rPr>
         <w:t xml:space="preserve">        &lt;table&gt;</w:t>
       </w:r>
     </w:p>
@@ -20807,7 +21284,7 @@
         <w:rPr>
           <w:rFonts w:ascii="Courier New" w:hAnsi="Courier New" w:cs="Courier New"/>
         </w:rPr>
-        <w:t xml:space="preserve">          &lt;thead&gt;&lt;tr&gt;&lt;th&gt;You see&lt;/th&gt;&lt;th&gt;Likely cause&lt;/th&gt;&lt;th&gt;Fix&lt;/th&gt;&lt;/tr&gt;&lt;/thead&gt;</w:t>
+        <w:t xml:space="preserve">          &lt;thead&gt;&lt;tr&gt;&lt;th&gt;Step&lt;/th&gt;&lt;th&gt;What you build&lt;/th&gt;&lt;th&gt;Why in this order&lt;/th&gt;&lt;/tr&gt;&lt;/thead&gt;</w:t>
       </w:r>
     </w:p>
     <w:p>
@@ -20835,197 +21312,137 @@
         <w:rPr>
           <w:rFonts w:ascii="Courier New" w:hAnsi="Courier New" w:cs="Courier New"/>
         </w:rPr>
-        <w:t xml:space="preserve">            &lt;tr&gt;&lt;td&gt;Terraform: &lt;code&gt;build/layer.zip is missing&lt;/code&gt;&lt;/td&gt;&lt;td&gt;The dependency layer was never built&lt;/td&gt;&lt;td&gt;&lt;code&gt;bash scripts/build-layer.sh&lt;</w:t>
-      </w:r>
-      <w:r>
-        <w:rPr>
-          <w:rFonts w:ascii="Courier New" w:hAnsi="Courier New" w:cs="Courier New"/>
-        </w:rPr>
-        <w:t>/code&gt;, then apply again&lt;/td&gt;&lt;/tr&gt;</w:t>
-      </w:r>
-    </w:p>
-    <w:p>
-      <w:pPr>
-        <w:pStyle w:val="PlainText"/>
-        <w:rPr>
-          <w:rFonts w:ascii="Courier New" w:hAnsi="Courier New" w:cs="Courier New"/>
-        </w:rPr>
-      </w:pPr>
-      <w:r>
-        <w:rPr>
-          <w:rFonts w:ascii="Courier New" w:hAnsi="Courier New" w:cs="Courier New"/>
-        </w:rPr>
-        <w:t xml:space="preserve">            &lt;tr&gt;&lt;td&gt;New code does not take effect&lt;/td&gt;&lt;td&gt;The update is still rolling out&lt;/td&gt;&lt;td&gt;Wait for &lt;code&gt;aws lambda get-function --function-name northwind-hr-chat --query 'Configuration.LastUpdateStatus'&lt;/code&gt; to say &lt;code&gt;Successful&lt;/code&gt;&lt;/td&gt;&lt;/tr&gt;</w:t>
-      </w:r>
-    </w:p>
-    <w:p>
-      <w:pPr>
-        <w:pStyle w:val="PlainText"/>
-        <w:rPr>
-          <w:rFonts w:ascii="Courier New" w:hAnsi="Courier New" w:cs="Courier New"/>
-        </w:rPr>
-      </w:pPr>
-      <w:r>
-        <w:rPr>
-          <w:rFonts w:ascii="Courier New" w:hAnsi="Courier New" w:cs="Courier New"/>
-        </w:rPr>
-        <w:t xml:space="preserve">            &lt;tr&gt;&lt;td&gt;&lt;code&gt;AccessDeniedException&lt;/code&gt; in chat logs, naming a model&lt;/td&gt;&lt;td&gt;That model is not enabled in this account and region&lt;/td&gt;&lt;td&gt;Bedrock console, Model catalog, request access. Anthropic models</w:t>
-      </w:r>
-      <w:r>
-        <w:rPr>
-          <w:rFonts w:ascii="Courier New" w:hAnsi="Courier New" w:cs="Courier New"/>
-        </w:rPr>
-        <w:t xml:space="preserve"> also need the use case form, which is why the default here is Nova&lt;/td&gt;&lt;/tr&gt;</w:t>
-      </w:r>
-    </w:p>
-    <w:p>
-      <w:pPr>
-        <w:pStyle w:val="PlainText"/>
-        <w:rPr>
-          <w:rFonts w:ascii="Courier New" w:hAnsi="Courier New" w:cs="Courier New"/>
-        </w:rPr>
-      </w:pPr>
-      <w:r>
-        <w:rPr>
-          <w:rFonts w:ascii="Courier New" w:hAnsi="Courier New" w:cs="Courier New"/>
-        </w:rPr>
-        <w:t xml:space="preserve">            &lt;tr&gt;&lt;td&gt;Answers are slower than usual and &lt;code&gt;model_fallback&lt;/code&gt; appears in &lt;code&gt;tools_used&lt;/code&gt;&lt;/td&gt;&lt;td&gt;The primary model would not answer, so the fallback did&lt;/td&gt;&lt;td&gt;Nothing is broken. This is the failover working. Check the chat log for the underlying Bedrock error&lt;/td&gt;&lt;/tr&gt;</w:t>
-      </w:r>
-    </w:p>
-    <w:p>
-      <w:pPr>
-        <w:pStyle w:val="PlainText"/>
-        <w:rPr>
-          <w:rFonts w:ascii="Courier New" w:hAnsi="Courier New" w:cs="Courier New"/>
-        </w:rPr>
-      </w:pPr>
-      <w:r>
-        <w:rPr>
-          <w:rFonts w:ascii="Courier New" w:hAnsi="Courier New" w:cs="Courier New"/>
-        </w:rPr>
-        <w:t xml:space="preserve">            &lt;tr&gt;&lt;td&gt;&lt;code&gt;InvalidParameterException&lt;/code&gt; on &lt;code&gt;logGroupName&lt;/code&gt;&lt;/td&gt;&lt;td&gt;Git Bash on Windows rewrote the &lt;code&gt;</w:t>
-      </w:r>
-      <w:r>
-        <w:rPr>
-          <w:rFonts w:ascii="Courier New" w:hAnsi="Courier New" w:cs="Courier New"/>
-        </w:rPr>
-        <w:t>/aws/lambda/...&lt;/code&gt; path&lt;/td&gt;&lt;td&gt;&lt;code&gt;export MSYS_NO_PATHCONV=1&lt;/code&gt;&lt;/td&gt;&lt;/tr&gt;</w:t>
-      </w:r>
-    </w:p>
-    <w:p>
-      <w:pPr>
-        <w:pStyle w:val="PlainText"/>
-        <w:rPr>
-          <w:rFonts w:ascii="Courier New" w:hAnsi="Courier New" w:cs="Courier New"/>
-        </w:rPr>
-      </w:pPr>
-      <w:r>
-        <w:rPr>
-          <w:rFonts w:ascii="Courier New" w:hAnsi="Courier New" w:cs="Courier New"/>
-        </w:rPr>
-        <w:t xml:space="preserve">            &lt;tr&gt;&lt;td&gt;503 or 504 on the first question after a break&lt;/td&gt;&lt;td&gt;Aurora resuming from 0 ACU, close to the 30-second limit&lt;/td&gt;&lt;td&gt;Ask again. For a live demo, set &lt;code&gt;min_capacity = 0.5&lt;/code&gt; in &lt;code&gt;aurora.tf&lt;/code&gt; for the day&lt;/td&gt;&lt;/tr&gt;</w:t>
-      </w:r>
-    </w:p>
-    <w:p>
-      <w:pPr>
-        <w:pStyle w:val="PlainText"/>
-        <w:rPr>
-          <w:rFonts w:ascii="Courier New" w:hAnsi="Courier New" w:cs="Courier New"/>
-        </w:rPr>
-      </w:pPr>
-      <w:r>
-        <w:rPr>
-          <w:rFonts w:ascii="Courier New" w:hAnsi="Courier New" w:cs="Courier New"/>
-        </w:rPr>
-        <w:t xml:space="preserve">            &lt;tr&gt;&lt;td&gt;401 from &lt;code&gt;/api/me&lt;/code&gt;&lt;/td&gt;&lt;td&gt;Token expired, or built with another app client ID&lt;/td&gt;&lt;td&gt;Sign out and in; rebuild the React app with the current &lt;c</w:t>
-      </w:r>
-      <w:r>
-        <w:rPr>
-          <w:rFonts w:ascii="Courier New" w:hAnsi="Courier New" w:cs="Courier New"/>
-        </w:rPr>
-        <w:t>ode&gt;frontend_env&lt;/code&gt;&lt;/td&gt;&lt;/tr&gt;</w:t>
-      </w:r>
-    </w:p>
-    <w:p>
-      <w:pPr>
-        <w:pStyle w:val="PlainText"/>
-        <w:rPr>
-          <w:rFonts w:ascii="Courier New" w:hAnsi="Courier New" w:cs="Courier New"/>
-        </w:rPr>
-      </w:pPr>
-      <w:r>
-        <w:rPr>
-          <w:rFonts w:ascii="Courier New" w:hAnsi="Courier New" w:cs="Courier New"/>
-        </w:rPr>
-        <w:t xml:space="preserve">            &lt;tr&gt;&lt;td&gt;"You don't have an HR assistant account"&lt;/td&gt;&lt;td&gt;The Cognito email isn't in the &lt;code&gt;employees&lt;/code&gt; table&lt;/td&gt;&lt;td&gt;Check spelling in &lt;code&gt;demo_user_emails&lt;/code&gt;; run setup-db&lt;/td&gt;&lt;/tr&gt;</w:t>
-      </w:r>
-    </w:p>
-    <w:p>
-      <w:pPr>
-        <w:pStyle w:val="PlainText"/>
-        <w:rPr>
-          <w:rFonts w:ascii="Courier New" w:hAnsi="Courier New" w:cs="Courier New"/>
-        </w:rPr>
-      </w:pPr>
-      <w:r>
-        <w:rPr>
-          <w:rFonts w:ascii="Courier New" w:hAnsi="Courier New" w:cs="Courier New"/>
-        </w:rPr>
-        <w:t xml:space="preserve">            &lt;tr&gt;&lt;td&gt;Ingest fails with 403 from OpenSearch&lt;/td&gt;&lt;td&gt;Data access policy not active yet&lt;/td&gt;&lt;td&gt;Wait a minute; upload &lt;code&gt;manifest.json&lt;/code&gt; again&lt;/td&gt;&lt;/tr&gt;</w:t>
-      </w:r>
-    </w:p>
-    <w:p>
-      <w:pPr>
-        <w:pStyle w:val="PlainText"/>
-        <w:rPr>
-          <w:rFonts w:ascii="Courier New" w:hAnsi="Courier New" w:cs="Courier New"/>
-        </w:rPr>
-      </w:pPr>
-      <w:r>
-        <w:rPr>
-          <w:rFonts w:ascii="Courier New" w:hAnsi="Courier New" w:cs="Courier New"/>
-        </w:rPr>
-        <w:t xml:space="preserve">            &lt;tr&gt;&lt;td&gt;Answers say "No matching policy text" right after ingestion&lt;/td&gt;&lt;td&gt;OpenSear</w:t>
-      </w:r>
-      <w:r>
-        <w:rPr>
-          <w:rFonts w:ascii="Courier New" w:hAnsi="Courier New" w:cs="Courier New"/>
-        </w:rPr>
-        <w:t>ch Serverless hasn't refreshed yet&lt;/td&gt;&lt;td&gt;Wait a minute&lt;/td&gt;&lt;/tr&gt;</w:t>
-      </w:r>
-    </w:p>
-    <w:p>
-      <w:pPr>
-        <w:pStyle w:val="PlainText"/>
-        <w:rPr>
-          <w:rFonts w:ascii="Courier New" w:hAnsi="Courier New" w:cs="Courier New"/>
-        </w:rPr>
-      </w:pPr>
-      <w:r>
-        <w:rPr>
-          <w:rFonts w:ascii="Courier New" w:hAnsi="Courier New" w:cs="Courier New"/>
-        </w:rPr>
-        <w:t xml:space="preserve">            &lt;tr&gt;&lt;td&gt;Small talk returns policies, or real questions get none&lt;/td&gt;&lt;td&gt;Relevance threshold not measured on these documents&lt;/td&gt;&lt;td&gt;Run the similarity report; set &lt;code&gt;min_best_similarity&lt;/code&gt; between the two groups, not just below the lowest real question&lt;/td&gt;&lt;/tr&gt;</w:t>
-      </w:r>
-    </w:p>
-    <w:p>
-      <w:pPr>
-        <w:pStyle w:val="PlainText"/>
-        <w:rPr>
-          <w:rFonts w:ascii="Courier New" w:hAnsi="Courier New" w:cs="Courier New"/>
-        </w:rPr>
-      </w:pPr>
-      <w:r>
-        <w:rPr>
-          <w:rFonts w:ascii="Courier New" w:hAnsi="Courier New" w:cs="Courier New"/>
-        </w:rPr>
-        <w:t xml:space="preserve">            &lt;tr&gt;&lt;td&gt;The same question passes one run and fails the next&lt;/td&gt;&lt;td&gt;The threshold sits inside the noise of approximate vector search&lt;/td&gt;&lt;td&gt;Move it fu</w:t>
-      </w:r>
-      <w:r>
-        <w:rPr>
-          <w:rFonts w:ascii="Courier New" w:hAnsi="Courier New" w:cs="Courier New"/>
-        </w:rPr>
-        <w:t>rther from the lowest real score, and set temperature to 0 before comparing runs at all&lt;/td&gt;&lt;/tr&gt;</w:t>
+        <w:t xml:space="preserve">            &lt;tr&gt;&lt;td&gt;3&lt;/td&gt;&lt;td&gt;Turn on the models in Bedrock&lt;/td&gt;&lt;td&gt;Access can take a form submission, so start it before you need i</w:t>
+      </w:r>
+      <w:r>
+        <w:rPr>
+          <w:rFonts w:ascii="Courier New" w:hAnsi="Courier New" w:cs="Courier New"/>
+        </w:rPr>
+        <w:t>t&lt;/td&gt;&lt;/tr&gt;</w:t>
+      </w:r>
+    </w:p>
+    <w:p>
+      <w:pPr>
+        <w:pStyle w:val="PlainText"/>
+        <w:rPr>
+          <w:rFonts w:ascii="Courier New" w:hAnsi="Courier New" w:cs="Courier New"/>
+        </w:rPr>
+      </w:pPr>
+      <w:r>
+        <w:rPr>
+          <w:rFonts w:ascii="Courier New" w:hAnsi="Courier New" w:cs="Courier New"/>
+        </w:rPr>
+        <w:t xml:space="preserve">            &lt;tr&gt;&lt;td&gt;4&lt;/td&gt;&lt;td&gt;The two zip files&lt;/td&gt;&lt;td&gt;The layer and the function code. Lambda cannot be created without them&lt;/td&gt;&lt;/tr&gt;</w:t>
+      </w:r>
+    </w:p>
+    <w:p>
+      <w:pPr>
+        <w:pStyle w:val="PlainText"/>
+        <w:rPr>
+          <w:rFonts w:ascii="Courier New" w:hAnsi="Courier New" w:cs="Courier New"/>
+        </w:rPr>
+      </w:pPr>
+      <w:r>
+        <w:rPr>
+          <w:rFonts w:ascii="Courier New" w:hAnsi="Courier New" w:cs="Courier New"/>
+        </w:rPr>
+        <w:t xml:space="preserve">            &lt;tr&gt;&lt;td&gt;5, 6&lt;/td&gt;&lt;td&gt;The network, and VPC endpoints&lt;/td&gt;&lt;td&gt;Private subnets with no internet route, so the endpoints are how Lambda reaches AWS at all&lt;/td&gt;&lt;/tr&gt;</w:t>
+      </w:r>
+    </w:p>
+    <w:p>
+      <w:pPr>
+        <w:pStyle w:val="PlainText"/>
+        <w:rPr>
+          <w:rFonts w:ascii="Courier New" w:hAnsi="Courier New" w:cs="Courier New"/>
+        </w:rPr>
+      </w:pPr>
+      <w:r>
+        <w:rPr>
+          <w:rFonts w:ascii="Courier New" w:hAnsi="Courier New" w:cs="Courier New"/>
+        </w:rPr>
+        <w:t xml:space="preserve">            &lt;tr&gt;&lt;td&gt;7, 8&lt;/td&gt;&lt;td&gt;Aurora, and the application secret&lt;/td&gt;&lt;td&gt;Two database users: admin for setup, &lt;code&gt;hr_app&lt;/code&gt; for the app&lt;/td&gt;&lt;/tr&gt;</w:t>
+      </w:r>
+    </w:p>
+    <w:p>
+      <w:pPr>
+        <w:pStyle w:val="PlainText"/>
+        <w:rPr>
+          <w:rFonts w:ascii="Courier New" w:hAnsi="Courier New" w:cs="Courier New"/>
+        </w:rPr>
+      </w:pPr>
+      <w:r>
+        <w:rPr>
+          <w:rFonts w:ascii="Courier New" w:hAnsi="Courier New" w:cs="Courier New"/>
+        </w:rPr>
+        <w:t xml:space="preserve">            &lt;tr&gt;&lt;td&gt;9&lt;/td&gt;&lt;td&gt;OpenS</w:t>
+      </w:r>
+      <w:r>
+        <w:rPr>
+          <w:rFonts w:ascii="Courier New" w:hAnsi="Courier New" w:cs="Courier New"/>
+        </w:rPr>
+        <w:t>earch Serverless&lt;/td&gt;&lt;td&gt;Three policies before the collection: encryption, network, data access&lt;/td&gt;&lt;/tr&gt;</w:t>
+      </w:r>
+    </w:p>
+    <w:p>
+      <w:pPr>
+        <w:pStyle w:val="PlainText"/>
+        <w:rPr>
+          <w:rFonts w:ascii="Courier New" w:hAnsi="Courier New" w:cs="Courier New"/>
+        </w:rPr>
+      </w:pPr>
+      <w:r>
+        <w:rPr>
+          <w:rFonts w:ascii="Courier New" w:hAnsi="Courier New" w:cs="Courier New"/>
+        </w:rPr>
+        <w:t xml:space="preserve">            &lt;tr&gt;&lt;td&gt;10, 11&lt;/td&gt;&lt;td&gt;The buckets, and the guardrail&lt;/td&gt;&lt;td&gt;The guardrail is checked on the question and on the answer&lt;/td&gt;&lt;/tr&gt;</w:t>
+      </w:r>
+    </w:p>
+    <w:p>
+      <w:pPr>
+        <w:pStyle w:val="PlainText"/>
+        <w:rPr>
+          <w:rFonts w:ascii="Courier New" w:hAnsi="Courier New" w:cs="Courier New"/>
+        </w:rPr>
+      </w:pPr>
+      <w:r>
+        <w:rPr>
+          <w:rFonts w:ascii="Courier New" w:hAnsi="Courier New" w:cs="Courier New"/>
+        </w:rPr>
+        <w:t xml:space="preserve">            &lt;tr&gt;&lt;td&gt;12, 13&lt;/td&gt;&lt;td&gt;IAM roles, then the four functions&lt;/td&gt;&lt;td&gt;One role per function, so the chat function cannot write the index&lt;/td&gt;&lt;/tr&gt;</w:t>
+      </w:r>
+    </w:p>
+    <w:p>
+      <w:pPr>
+        <w:pStyle w:val="PlainText"/>
+        <w:rPr>
+          <w:rFonts w:ascii="Courier New" w:hAnsi="Courier New" w:cs="Courier New"/>
+        </w:rPr>
+      </w:pPr>
+      <w:r>
+        <w:rPr>
+          <w:rFonts w:ascii="Courier New" w:hAnsi="Courier New" w:cs="Courier New"/>
+        </w:rPr>
+        <w:t xml:space="preserve">            &lt;tr&gt;&lt;td&gt;14, 15&lt;/td&gt;&lt;td&gt;Create the database, load the documents&lt;/td&gt;&lt;td&gt;Upload the documents firs</w:t>
+      </w:r>
+      <w:r>
+        <w:rPr>
+          <w:rFonts w:ascii="Courier New" w:hAnsi="Courier New" w:cs="Courier New"/>
+        </w:rPr>
+        <w:t>t and &lt;code&gt;manifest.json&lt;/code&gt; last: that upload is the trigger&lt;/td&gt;&lt;/tr&gt;</w:t>
+      </w:r>
+    </w:p>
+    <w:p>
+      <w:pPr>
+        <w:pStyle w:val="PlainText"/>
+        <w:rPr>
+          <w:rFonts w:ascii="Courier New" w:hAnsi="Courier New" w:cs="Courier New"/>
+        </w:rPr>
+      </w:pPr>
+      <w:r>
+        <w:rPr>
+          <w:rFonts w:ascii="Courier New" w:hAnsi="Courier New" w:cs="Courier New"/>
+        </w:rPr>
+        <w:t xml:space="preserve">            &lt;tr&gt;&lt;td&gt;16, 17&lt;/td&gt;&lt;td&gt;Cognito, then the API&lt;/td&gt;&lt;td&gt;The API needs the user pool to validate a token against&lt;/td&gt;&lt;/tr&gt;</w:t>
       </w:r>
     </w:p>
     <w:p>
@@ -21040,41 +21457,7 @@
           <w:rFonts w:ascii="Courier New" w:hAnsi="Courier New" w:cs="Courier New"/>
         </w:rPr>
         <w:lastRenderedPageBreak/>
-        <w:t xml:space="preserve">            &lt;tr&gt;&lt;td&gt;A normal HR question is blocked&lt;/td&gt;&lt;td&gt;Prompt attack filter at HIGH&lt;/td&gt;&lt;td&gt;Lower it to MEDIUM in &lt;code&gt;bedrock.tf&lt;/code&gt;, apply&lt;/td&gt;&lt;/tr&gt;</w:t>
-      </w:r>
-    </w:p>
-    <w:p>
-      <w:pPr>
-        <w:pStyle w:val="PlainText"/>
-        <w:rPr>
-          <w:rFonts w:ascii="Courier New" w:hAnsi="Courier New" w:cs="Courier New"/>
-        </w:rPr>
-      </w:pPr>
-      <w:r>
-        <w:rPr>
-          <w:rFonts w:ascii="Courier New" w:hAnsi="Courier New" w:cs="Courier New"/>
-        </w:rPr>
-        <w:t xml:space="preserve">            &lt;tr&gt;&lt;td&gt;Cognito "redirect_mismatch"&lt;/td&gt;&lt;td&gt;App opened at an address other than the CloudFront one&lt;/td&gt;&lt;td&gt;Use &lt;code&gt;terraform output app_url&lt;/code&gt; exactly&lt;/td&gt;&lt;/tr&gt;</w:t>
-      </w:r>
-    </w:p>
-    <w:p>
-      <w:pPr>
-        <w:pStyle w:val="PlainText"/>
-        <w:rPr>
-          <w:rFonts w:ascii="Courier New" w:hAnsi="Courier New" w:cs="Courier New"/>
-        </w:rPr>
-      </w:pPr>
-      <w:r>
-        <w:rPr>
-          <w:rFonts w:ascii="Courier New" w:hAnsi="Courier New" w:cs="Courier New"/>
-        </w:rPr>
-        <w:t xml:space="preserve">            &lt;tr&gt;&lt;td&gt;Terraform: domain already exists&lt;/td&gt;&lt;td&gt;&lt;code&gt;cognito_</w:t>
-      </w:r>
-      <w:r>
-        <w:rPr>
-          <w:rFonts w:ascii="Courier New" w:hAnsi="Courier New" w:cs="Courier New"/>
-        </w:rPr>
-        <w:t>domain_prefix&lt;/code&gt; taken&lt;/td&gt;&lt;td&gt;Choose another prefix&lt;/td&gt;&lt;/tr&gt;</w:t>
+        <w:t xml:space="preserve">            &lt;tr&gt;&lt;td&gt;18, 19&lt;/td&gt;&lt;td&gt;CloudFront and WAF, your domain&lt;/td&gt;&lt;td&gt;WAF for CloudFront must live in us-east-1&lt;/td&gt;&lt;/tr&gt;</w:t>
       </w:r>
     </w:p>
     <w:p>
@@ -21130,416 +21513,7 @@
         <w:rPr>
           <w:rFonts w:ascii="Courier New" w:hAnsi="Courier New" w:cs="Courier New"/>
         </w:rPr>
-        <w:t xml:space="preserve">    &lt;/section&gt;</w:t>
-      </w:r>
-    </w:p>
-    <w:p>
-      <w:pPr>
-        <w:pStyle w:val="PlainText"/>
-        <w:rPr>
-          <w:rFonts w:ascii="Courier New" w:hAnsi="Courier New" w:cs="Courier New"/>
-        </w:rPr>
-      </w:pPr>
-      <w:r>
-        <w:rPr>
-          <w:rFonts w:ascii="Courier New" w:hAnsi="Courier New" w:cs="Courier New"/>
-        </w:rPr>
-        <w:t xml:space="preserve">  &lt;!-- ============================================================ --&gt;</w:t>
-      </w:r>
-    </w:p>
-    <w:p>
-      <w:pPr>
-        <w:pStyle w:val="PlainText"/>
-        <w:rPr>
-          <w:rFonts w:ascii="Courier New" w:hAnsi="Courier New" w:cs="Courier New"/>
-        </w:rPr>
-      </w:pPr>
-      <w:r>
-        <w:rPr>
-          <w:rFonts w:ascii="Courier New" w:hAnsi="Courier New" w:cs="Courier New"/>
-        </w:rPr>
-        <w:t xml:space="preserve">    &lt;section id="clickops"&gt;</w:t>
-      </w:r>
-    </w:p>
-    <w:p>
-      <w:pPr>
-        <w:pStyle w:val="PlainText"/>
-        <w:rPr>
-          <w:rFonts w:ascii="Courier New" w:hAnsi="Courier New" w:cs="Courier New"/>
-        </w:rPr>
-      </w:pPr>
-      <w:r>
-        <w:rPr>
-          <w:rFonts w:ascii="Courier New" w:hAnsi="Courier New" w:cs="Courier New"/>
-        </w:rPr>
-        <w:t xml:space="preserve">      &lt;div class="prose"&gt;</w:t>
-      </w:r>
-    </w:p>
-    <w:p>
-      <w:pPr>
-        <w:pStyle w:val="PlainText"/>
-        <w:rPr>
-          <w:rFonts w:ascii="Courier New" w:hAnsi="Courier New" w:cs="Courier New"/>
-        </w:rPr>
-      </w:pPr>
-      <w:r>
-        <w:rPr>
-          <w:rFonts w:ascii="Courier New" w:hAnsi="Courier New" w:cs="Courier New"/>
-        </w:rPr>
-        <w:t xml:space="preserve">        &lt;h2&gt;Appendix: building it by hand in the console&lt;/h2&gt;</w:t>
-      </w:r>
-    </w:p>
-    <w:p>
-      <w:pPr>
-        <w:pStyle w:val="PlainText"/>
-        <w:rPr>
-          <w:rFonts w:ascii="Courier New" w:hAnsi="Courier New" w:cs="Courier New"/>
-        </w:rPr>
-      </w:pPr>
-      <w:r>
-        <w:rPr>
-          <w:rFonts w:ascii="Courier New" w:hAnsi="Courier New" w:cs="Courier New"/>
-        </w:rPr>
-        <w:t xml:space="preserve">        &lt;p&gt;Optional, and not part of the four hours. A console screen does show you choices a Terraform file hides, so this is worth doing once, on your own time, for the services you want to u</w:t>
-      </w:r>
-      <w:r>
-        <w:rPr>
-          <w:rFonts w:ascii="Courier New" w:hAnsi="Courier New" w:cs="Courier New"/>
-        </w:rPr>
-        <w:t>nderstand properly.&lt;/p&gt;</w:t>
-      </w:r>
-    </w:p>
-    <w:p>
-      <w:pPr>
-        <w:pStyle w:val="PlainText"/>
-        <w:rPr>
-          <w:rFonts w:ascii="Courier New" w:hAnsi="Courier New" w:cs="Courier New"/>
-        </w:rPr>
-      </w:pPr>
-      <w:r>
-        <w:rPr>
-          <w:rFonts w:ascii="Courier New" w:hAnsi="Courier New" w:cs="Courier New"/>
-        </w:rPr>
-        <w:t xml:space="preserve">        &lt;p&gt;&lt;strong&gt;The full walkthrough is &lt;a href="../infra/clickops.md"&gt;infra/clickops.md&lt;/a&gt;&lt;/strong&gt;,</w:t>
-      </w:r>
-    </w:p>
-    <w:p>
-      <w:pPr>
-        <w:pStyle w:val="PlainText"/>
-        <w:rPr>
-          <w:rFonts w:ascii="Courier New" w:hAnsi="Courier New" w:cs="Courier New"/>
-        </w:rPr>
-      </w:pPr>
-      <w:r>
-        <w:rPr>
-          <w:rFonts w:ascii="Courier New" w:hAnsi="Courier New" w:cs="Courier New"/>
-        </w:rPr>
-        <w:t xml:space="preserve">        twenty numbered steps with every setting and why it is set that way. Expect a day.</w:t>
-      </w:r>
-    </w:p>
-    <w:p>
-      <w:pPr>
-        <w:pStyle w:val="PlainText"/>
-        <w:rPr>
-          <w:rFonts w:ascii="Courier New" w:hAnsi="Courier New" w:cs="Courier New"/>
-        </w:rPr>
-      </w:pPr>
-      <w:r>
-        <w:rPr>
-          <w:rFonts w:ascii="Courier New" w:hAnsi="Courier New" w:cs="Courier New"/>
-        </w:rPr>
-        <w:t xml:space="preserve">        The order is not arbitrary: each step needs something the one before it produced.&lt;/p&gt;</w:t>
-      </w:r>
-    </w:p>
-    <w:p>
-      <w:pPr>
-        <w:pStyle w:val="PlainText"/>
-        <w:rPr>
-          <w:rFonts w:ascii="Courier New" w:hAnsi="Courier New" w:cs="Courier New"/>
-        </w:rPr>
-      </w:pPr>
-      <w:r>
-        <w:rPr>
-          <w:rFonts w:ascii="Courier New" w:hAnsi="Courier New" w:cs="Courier New"/>
-        </w:rPr>
-        <w:t xml:space="preserve">      &lt;/div&gt;</w:t>
-      </w:r>
-    </w:p>
-    <w:p>
-      <w:pPr>
-        <w:pStyle w:val="PlainText"/>
-        <w:rPr>
-          <w:rFonts w:ascii="Courier New" w:hAnsi="Courier New" w:cs="Courier New"/>
-        </w:rPr>
-      </w:pPr>
-      <w:r>
-        <w:rPr>
-          <w:rFonts w:ascii="Courier New" w:hAnsi="Courier New" w:cs="Courier New"/>
-        </w:rPr>
-        <w:t xml:space="preserve">      &lt;div class="table-wrap"&gt;</w:t>
-      </w:r>
-    </w:p>
-    <w:p>
-      <w:pPr>
-        <w:pStyle w:val="PlainText"/>
-        <w:rPr>
-          <w:rFonts w:ascii="Courier New" w:hAnsi="Courier New" w:cs="Courier New"/>
-        </w:rPr>
-      </w:pPr>
-      <w:r>
-        <w:rPr>
-          <w:rFonts w:ascii="Courier New" w:hAnsi="Courier New" w:cs="Courier New"/>
-        </w:rPr>
-        <w:t xml:space="preserve">        &lt;table&gt;</w:t>
-      </w:r>
-    </w:p>
-    <w:p>
-      <w:pPr>
-        <w:pStyle w:val="PlainText"/>
-        <w:rPr>
-          <w:rFonts w:ascii="Courier New" w:hAnsi="Courier New" w:cs="Courier New"/>
-        </w:rPr>
-      </w:pPr>
-      <w:r>
-        <w:rPr>
-          <w:rFonts w:ascii="Courier New" w:hAnsi="Courier New" w:cs="Courier New"/>
-        </w:rPr>
-        <w:t xml:space="preserve">          &lt;thead&gt;&lt;tr&gt;&lt;th&gt;Step&lt;/th&gt;&lt;th&gt;What you build&lt;/th&gt;&lt;th&gt;Why in this order&lt;/th&gt;&lt;/tr&gt;&lt;/thead&gt;</w:t>
-      </w:r>
-    </w:p>
-    <w:p>
-      <w:pPr>
-        <w:pStyle w:val="PlainText"/>
-        <w:rPr>
-          <w:rFonts w:ascii="Courier New" w:hAnsi="Courier New" w:cs="Courier New"/>
-        </w:rPr>
-      </w:pPr>
-      <w:r>
-        <w:rPr>
-          <w:rFonts w:ascii="Courier New" w:hAnsi="Courier New" w:cs="Courier New"/>
-        </w:rPr>
-        <w:t xml:space="preserve">          &lt;tbody&gt;</w:t>
-      </w:r>
-    </w:p>
-    <w:p>
-      <w:pPr>
-        <w:pStyle w:val="PlainText"/>
-        <w:rPr>
-          <w:rFonts w:ascii="Courier New" w:hAnsi="Courier New" w:cs="Courier New"/>
-        </w:rPr>
-      </w:pPr>
-      <w:r>
-        <w:rPr>
-          <w:rFonts w:ascii="Courier New" w:hAnsi="Courier New" w:cs="Courier New"/>
-        </w:rPr>
-        <w:t xml:space="preserve">            &lt;tr&gt;&lt;td&gt;3&lt;</w:t>
-      </w:r>
-      <w:r>
-        <w:rPr>
-          <w:rFonts w:ascii="Courier New" w:hAnsi="Courier New" w:cs="Courier New"/>
-        </w:rPr>
-        <w:t>/td&gt;&lt;td&gt;Turn on the models in Bedrock&lt;/td&gt;&lt;td&gt;Access can take a form submission, so start it before you need it&lt;/td&gt;&lt;/tr&gt;</w:t>
-      </w:r>
-    </w:p>
-    <w:p>
-      <w:pPr>
-        <w:pStyle w:val="PlainText"/>
-        <w:rPr>
-          <w:rFonts w:ascii="Courier New" w:hAnsi="Courier New" w:cs="Courier New"/>
-        </w:rPr>
-      </w:pPr>
-      <w:r>
-        <w:rPr>
-          <w:rFonts w:ascii="Courier New" w:hAnsi="Courier New" w:cs="Courier New"/>
-        </w:rPr>
-        <w:t xml:space="preserve">            &lt;tr&gt;&lt;td&gt;4&lt;/td&gt;&lt;td&gt;The two zip files&lt;/td&gt;&lt;td&gt;The layer and the function code. Lambda cannot be created without them&lt;/td&gt;&lt;/tr&gt;</w:t>
-      </w:r>
-    </w:p>
-    <w:p>
-      <w:pPr>
-        <w:pStyle w:val="PlainText"/>
-        <w:rPr>
-          <w:rFonts w:ascii="Courier New" w:hAnsi="Courier New" w:cs="Courier New"/>
-        </w:rPr>
-      </w:pPr>
-      <w:r>
-        <w:rPr>
-          <w:rFonts w:ascii="Courier New" w:hAnsi="Courier New" w:cs="Courier New"/>
-        </w:rPr>
-        <w:t xml:space="preserve">            &lt;tr&gt;&lt;td&gt;5, 6&lt;/td&gt;&lt;td&gt;The network, and VPC endpoints&lt;/td&gt;&lt;td&gt;Private subnets with no internet route, so the endpoints are how Lambda reaches AWS at all&lt;/td&gt;&lt;/tr&gt;</w:t>
-      </w:r>
-    </w:p>
-    <w:p>
-      <w:pPr>
-        <w:pStyle w:val="PlainText"/>
-        <w:rPr>
-          <w:rFonts w:ascii="Courier New" w:hAnsi="Courier New" w:cs="Courier New"/>
-        </w:rPr>
-      </w:pPr>
-      <w:r>
-        <w:rPr>
-          <w:rFonts w:ascii="Courier New" w:hAnsi="Courier New" w:cs="Courier New"/>
-        </w:rPr>
-        <w:t xml:space="preserve">            &lt;tr&gt;&lt;td&gt;7, 8&lt;/td&gt;&lt;td&gt;Aurora, and the application secret&lt;/td&gt;&lt;td&gt;Two </w:t>
-      </w:r>
-      <w:r>
-        <w:rPr>
-          <w:rFonts w:ascii="Courier New" w:hAnsi="Courier New" w:cs="Courier New"/>
-        </w:rPr>
-        <w:t>database users: admin for setup, &lt;code&gt;hr_app&lt;/code&gt; for the app&lt;/td&gt;&lt;/tr&gt;</w:t>
-      </w:r>
-    </w:p>
-    <w:p>
-      <w:pPr>
-        <w:pStyle w:val="PlainText"/>
-        <w:rPr>
-          <w:rFonts w:ascii="Courier New" w:hAnsi="Courier New" w:cs="Courier New"/>
-        </w:rPr>
-      </w:pPr>
-      <w:r>
-        <w:rPr>
-          <w:rFonts w:ascii="Courier New" w:hAnsi="Courier New" w:cs="Courier New"/>
-        </w:rPr>
-        <w:t xml:space="preserve">            &lt;tr&gt;&lt;td&gt;9&lt;/td&gt;&lt;td&gt;OpenSearch Serverless&lt;/td&gt;&lt;td&gt;Three policies before the collection: encryption, network, data access&lt;/td&gt;&lt;/tr&gt;</w:t>
-      </w:r>
-    </w:p>
-    <w:p>
-      <w:pPr>
-        <w:pStyle w:val="PlainText"/>
-        <w:rPr>
-          <w:rFonts w:ascii="Courier New" w:hAnsi="Courier New" w:cs="Courier New"/>
-        </w:rPr>
-      </w:pPr>
-      <w:r>
-        <w:rPr>
-          <w:rFonts w:ascii="Courier New" w:hAnsi="Courier New" w:cs="Courier New"/>
-        </w:rPr>
-        <w:t xml:space="preserve">            &lt;tr&gt;&lt;td&gt;10, 11&lt;/td&gt;&lt;td&gt;The buckets, and the guardrail&lt;/td&gt;&lt;td&gt;The guardrail is checked on the question and on the answer&lt;/td&gt;&lt;/tr&gt;</w:t>
-      </w:r>
-    </w:p>
-    <w:p>
-      <w:pPr>
-        <w:pStyle w:val="PlainText"/>
-        <w:rPr>
-          <w:rFonts w:ascii="Courier New" w:hAnsi="Courier New" w:cs="Courier New"/>
-        </w:rPr>
-      </w:pPr>
-      <w:r>
-        <w:rPr>
-          <w:rFonts w:ascii="Courier New" w:hAnsi="Courier New" w:cs="Courier New"/>
-        </w:rPr>
-        <w:t xml:space="preserve">            &lt;tr&gt;&lt;td&gt;12, 13&lt;/td&gt;&lt;td&gt;IAM roles, then the four functions&lt;/td&gt;&lt;td&gt;One role per function, so the chat function cannot write the index&lt;/td&gt;&lt;/tr</w:t>
-      </w:r>
-      <w:r>
-        <w:rPr>
-          <w:rFonts w:ascii="Courier New" w:hAnsi="Courier New" w:cs="Courier New"/>
-        </w:rPr>
-        <w:t>&gt;</w:t>
-      </w:r>
-    </w:p>
-    <w:p>
-      <w:pPr>
-        <w:pStyle w:val="PlainText"/>
-        <w:rPr>
-          <w:rFonts w:ascii="Courier New" w:hAnsi="Courier New" w:cs="Courier New"/>
-        </w:rPr>
-      </w:pPr>
-      <w:r>
-        <w:rPr>
-          <w:rFonts w:ascii="Courier New" w:hAnsi="Courier New" w:cs="Courier New"/>
-        </w:rPr>
-        <w:lastRenderedPageBreak/>
-        <w:t xml:space="preserve">            &lt;tr&gt;&lt;td&gt;14, 15&lt;/td&gt;&lt;td&gt;Create the database, load the documents&lt;/td&gt;&lt;td&gt;Upload the documents first and &lt;code&gt;manifest.json&lt;/code&gt; last: that upload is the trigger&lt;/td&gt;&lt;/tr&gt;</w:t>
-      </w:r>
-    </w:p>
-    <w:p>
-      <w:pPr>
-        <w:pStyle w:val="PlainText"/>
-        <w:rPr>
-          <w:rFonts w:ascii="Courier New" w:hAnsi="Courier New" w:cs="Courier New"/>
-        </w:rPr>
-      </w:pPr>
-      <w:r>
-        <w:rPr>
-          <w:rFonts w:ascii="Courier New" w:hAnsi="Courier New" w:cs="Courier New"/>
-        </w:rPr>
-        <w:t xml:space="preserve">            &lt;tr&gt;&lt;td&gt;16, 17&lt;/td&gt;&lt;td&gt;Cognito, then the API&lt;/td&gt;&lt;td&gt;The API needs the user pool to validate a token against&lt;/td&gt;&lt;/tr&gt;</w:t>
-      </w:r>
-    </w:p>
-    <w:p>
-      <w:pPr>
-        <w:pStyle w:val="PlainText"/>
-        <w:rPr>
-          <w:rFonts w:ascii="Courier New" w:hAnsi="Courier New" w:cs="Courier New"/>
-        </w:rPr>
-      </w:pPr>
-      <w:r>
-        <w:rPr>
-          <w:rFonts w:ascii="Courier New" w:hAnsi="Courier New" w:cs="Courier New"/>
-        </w:rPr>
-        <w:t xml:space="preserve">            &lt;tr&gt;&lt;td&gt;18, 19&lt;/td&gt;&lt;td&gt;CloudFront and WAF, your domain&lt;/td&gt;&lt;td&gt;WAF for CloudFront must live in us-east-1&lt;/td&gt;&lt;/tr&gt;</w:t>
-      </w:r>
-    </w:p>
-    <w:p>
-      <w:pPr>
-        <w:pStyle w:val="PlainText"/>
-        <w:rPr>
-          <w:rFonts w:ascii="Courier New" w:hAnsi="Courier New" w:cs="Courier New"/>
-        </w:rPr>
-      </w:pPr>
-      <w:r>
-        <w:rPr>
-          <w:rFonts w:ascii="Courier New" w:hAnsi="Courier New" w:cs="Courier New"/>
-        </w:rPr>
-        <w:t xml:space="preserve">          &lt;/tbody&gt;</w:t>
-      </w:r>
-    </w:p>
-    <w:p>
-      <w:pPr>
-        <w:pStyle w:val="PlainText"/>
-        <w:rPr>
-          <w:rFonts w:ascii="Courier New" w:hAnsi="Courier New" w:cs="Courier New"/>
-        </w:rPr>
-      </w:pPr>
-      <w:r>
-        <w:rPr>
-          <w:rFonts w:ascii="Courier New" w:hAnsi="Courier New" w:cs="Courier New"/>
-        </w:rPr>
-        <w:t xml:space="preserve">        &lt;/table&gt;</w:t>
-      </w:r>
-    </w:p>
-    <w:p>
-      <w:pPr>
-        <w:pStyle w:val="PlainText"/>
-        <w:rPr>
-          <w:rFonts w:ascii="Courier New" w:hAnsi="Courier New" w:cs="Courier New"/>
-        </w:rPr>
-      </w:pPr>
-      <w:r>
-        <w:rPr>
-          <w:rFonts w:ascii="Courier New" w:hAnsi="Courier New" w:cs="Courier New"/>
-        </w:rPr>
-        <w:t xml:space="preserve">      &lt;/div&gt;</w:t>
-      </w:r>
-    </w:p>
-    <w:p>
-      <w:pPr>
-        <w:pStyle w:val="PlainText"/>
-        <w:rPr>
-          <w:rFonts w:ascii="Courier New" w:hAnsi="Courier New" w:cs="Courier New"/>
-        </w:rPr>
-      </w:pPr>
-      <w:r>
-        <w:rPr>
-          <w:rFonts w:ascii="Courier New" w:hAnsi="Courier New" w:cs="Courier New"/>
-        </w:rPr>
-        <w:t xml:space="preserve">      &lt;div class="c</w:t>
-      </w:r>
-      <w:r>
-        <w:rPr>
-          <w:rFonts w:ascii="Courier New" w:hAnsi="Courier New" w:cs="Courier New"/>
-        </w:rPr>
-        <w:t>allout"&gt;</w:t>
+        <w:t xml:space="preserve">      &lt;div class="callout"&gt;</w:t>
       </w:r>
     </w:p>
     <w:p>
@@ -21567,7 +21541,13 @@
         <w:rPr>
           <w:rFonts w:ascii="Courier New" w:hAnsi="Courier New" w:cs="Courier New"/>
         </w:rPr>
-        <w:t xml:space="preserve">        &lt;p&gt;Not during the build. Come back to it when you want to know what a particular service actually asked you for, and why the Terraform file sets what it sets.&lt;/p&gt;</w:t>
+        <w:t xml:space="preserve">        &lt;p&gt;Not during the build. Come back to it</w:t>
+      </w:r>
+      <w:r>
+        <w:rPr>
+          <w:rFonts w:ascii="Courier New" w:hAnsi="Courier New" w:cs="Courier New"/>
+        </w:rPr>
+        <w:t xml:space="preserve"> when you want to know what a particular service actually asked you for, and why the Terraform file sets what it sets.&lt;/p&gt;</w:t>
       </w:r>
     </w:p>
     <w:p>
@@ -22094,7 +22074,7 @@
     <w:link w:val="PlainTextChar"/>
     <w:uiPriority w:val="99"/>
     <w:unhideWhenUsed/>
-    <w:rsid w:val="00807D54"/>
+    <w:rsid w:val="00246794"/>
     <w:pPr>
       <w:spacing w:after="0" w:line="240" w:lineRule="auto"/>
     </w:pPr>
@@ -22109,7 +22089,7 @@
     <w:basedOn w:val="DefaultParagraphFont"/>
     <w:link w:val="PlainText"/>
     <w:uiPriority w:val="99"/>
-    <w:rsid w:val="00807D54"/>
+    <w:rsid w:val="00246794"/>
     <w:rPr>
       <w:rFonts w:ascii="Consolas" w:hAnsi="Consolas"/>
       <w:sz w:val="21"/>

</xml_diff>